<commit_message>
knap "ret linje" er omdøbt til "ret til andet arbejde"
</commit_message>
<xml_diff>
--- a/docs/Brugervejledning.docx
+++ b/docs/Brugervejledning.docx
@@ -2849,7 +2849,7 @@
           <w:b/>
           <w:sz w:val="22"/>
         </w:rPr>
-        <w:t>Ret linje / Tilpas (i den detaljerede tidslinje)</w:t>
+        <w:t>Ret til andet arbejde / Tilpas (i den detaljerede tidslinje)</w:t>
       </w:r>
     </w:p>
     <w:p>
@@ -2861,7 +2861,7 @@
           <w:rFonts w:ascii="Arial" w:hAnsi="Arial"/>
           <w:sz w:val="22"/>
         </w:rPr>
-        <w:t>Ud for et pausesegment (hvil) i den detaljerede tidslinje kan du klikke 'Ret linje' for at omklassificere det til 'Andet arbejde' – bruges fx hvis tachografen har registreret en pause der reelt var arbejde. En 'Gendan'-knap kan fortryde præcis den rettelse igen. 'Tilpas' åbner i stedet en dialog hvor du kan justere pausens sluttidspunkt (forlænge eller forkorte) uden at ændre dens type – en forhåndsvisning viser hvor mange minutter der flyttes, og fra/til hvilket segment. Begge dele påvirker den beregnede løn direkte, da et pausesegment der bliver til arbejde tæller med i timerne.</w:t>
+        <w:t>Ud for et pausesegment (hvil) i den detaljerede tidslinje kan du klikke 'Ret til andet arbejde' for at omklassificere det til 'Andet arbejde' – bruges fx hvis tachografen har registreret en pause der reelt var arbejde. En 'Gendan'-knap kan fortryde præcis den rettelse igen. 'Tilpas' åbner i stedet en dialog hvor du kan justere pausens sluttidspunkt (forlænge eller forkorte) uden at ændre dens type – en forhåndsvisning viser hvor mange minutter der flyttes, og fra/til hvilket segment. Begge dele påvirker den beregnede løn direkte, da et pausesegment der bliver til arbejde tæller med i timerne.</w:t>
       </w:r>
     </w:p>
     <w:p>

</xml_diff>

<commit_message>
dokumentation er opdateret samt småting rettet
</commit_message>
<xml_diff>
--- a/docs/Brugervejledning.docx
+++ b/docs/Brugervejledning.docx
@@ -394,7 +394,7 @@
                 <w:rFonts w:ascii="Arial" w:hAnsi="Arial"/>
                 <w:sz w:val="20"/>
               </w:rPr>
-              <w:t>Viser aktivitetstabellen for den aktuelle lønperiode.</w:t>
+              <w:t>Viser aktivitetstabellen for den aktuelle lønperiode. Kræver 'Se aktivitetskalender'.</w:t>
             </w:r>
           </w:p>
         </w:tc>
@@ -594,7 +594,7 @@
                 <w:b/>
                 <w:sz w:val="20"/>
               </w:rPr>
-              <w:t>🗓️ Dagsplan</w:t>
+              <w:t>📋 Dagsplan</w:t>
             </w:r>
           </w:p>
         </w:tc>
@@ -681,7 +681,7 @@
                 <w:rFonts w:ascii="Arial" w:hAnsi="Arial"/>
                 <w:sz w:val="20"/>
               </w:rPr>
-              <w:t>Import af tachografdata fra fil eller mappe. Kræver 'Importer .ddd'-rettigheden.</w:t>
+              <w:t>Import af tachografdata fra serverens ddd_input-mappe. Kræver 'Importer .ddd'-rettigheden.</w:t>
             </w:r>
           </w:p>
         </w:tc>
@@ -931,6 +931,29 @@
       </w:tr>
     </w:tbl>
     <w:p/>
+    <w:p>
+      <w:pPr>
+        <w:spacing w:before="80" w:after="160"/>
+        <w:ind w:left="283" w:right="283"/>
+      </w:pPr>
+      <w:r>
+        <w:rPr>
+          <w:rFonts w:ascii="Arial" w:hAnsi="Arial"/>
+          <w:b/>
+          <w:color w:val="2E6DB8"/>
+          <w:sz w:val="22"/>
+        </w:rPr>
+        <w:t xml:space="preserve">GODT AT VIDE: </w:t>
+      </w:r>
+      <w:r>
+        <w:rPr>
+          <w:rFonts w:ascii="Arial" w:hAnsi="Arial"/>
+          <w:color w:val="606060"/>
+          <w:sz w:val="22"/>
+        </w:rPr>
+        <w:t>Når du logger ind, åbner systemet Aktiviteter, hvis du har 'Se aktivitetskalender' – ellers det første menupunkt du har adgang til. En menugruppe uden punkter du har adgang til, skjules helt. Stamdata vises for alle med 'Stamdata'-rettigheden, også uden 'Brugerstyring' (rettet 2026-09-30).</w:t>
+      </w:r>
+    </w:p>
     <w:p>
       <w:pPr>
         <w:pStyle w:val="Heading2"/>
@@ -1325,7 +1348,7 @@
           <w:rFonts w:ascii="Arial" w:hAnsi="Arial"/>
           <w:sz w:val="22"/>
         </w:rPr>
-        <w:t>Vælg 'Vælg filer' for at importere enkeltfiler, eller 'Vælg mappe' for at importere alle .ddd-filer i en mappe.</w:t>
+        <w:t>Sørg for at .ddd-filerne ligger i mappen ddd_input på serveren (undermapper er ok). Kun filer der er ændret inden for de seneste 7 dage medtages.</w:t>
       </w:r>
     </w:p>
     <w:p>
@@ -1347,7 +1370,7 @@
           <w:rFonts w:ascii="Arial" w:hAnsi="Arial"/>
           <w:sz w:val="22"/>
         </w:rPr>
-        <w:t>En Windows-filhåndterings-dialog åbner sig – naviger til filerne og bekræft valget.</w:t>
+        <w:t>Klik 'Tjek ddd_input-mappe'. Systemet scanner mappen – der åbner ingen fildialog.</w:t>
       </w:r>
     </w:p>
     <w:p>
@@ -1392,7 +1415,7 @@
           <w:color w:val="606060"/>
           <w:sz w:val="22"/>
         </w:rPr>
-        <w:t>Systemet springer automatisk allerede importerede aktiviteter over (baseret på medarbejder + starttidspunkt). Det er sikkert at importere samme mappe flere gange. Pop-up'en skelner mellem 'sprunget over – allerede importeret' og 'sprunget over – ukendt førerkortnummer' (med de konkrete kortnumre), så det altid er tydeligt hvorfor en aktivitet ikke kom med.</w:t>
+        <w:t>Systemet springer automatisk allerede importerede aktiviteter over (vagter der overlapper en allerede importeret vagt for samme medarbejder). Det er sikkert at importere samme mappe flere gange. Pop-up'en viser årsagen for hver gruppe: allerede importeret, ukendt førerkortnummer (med de konkrete kortnumre), tidligere afvist (lukket periode) eller kunne ikke rettes (kolliderer med en anden linje).</w:t>
       </w:r>
     </w:p>
     <w:p>
@@ -1415,7 +1438,7 @@
           <w:color w:val="606060"/>
           <w:sz w:val="22"/>
         </w:rPr>
-        <w:t>Bliver et førerkort læst af flere gange (fx først midt på en vagt og senere igen efter vagtens afslutning), genkender systemet nu automatisk den mere komplette udlæsning og UDVIDER den eksisterende aktivitet i stedet for at springe den over (rettet 2026-07-02). Var aktiviteten allerede godkendt, bliver den automatisk sat tilbage til 'Afventer', så den udvidede tid skal godkendes igen, før den tæller med i lønkørslen.</w:t>
+        <w:t>Bliver et førerkort læst af flere gange (fx først midt på en vagt og senere igen efter vagtens afslutning), genkender systemet den mere komplette udlæsning. Er aktiviteten stadig 'Afventer', UDVIDES den med den ekstra tid. Er den allerede godkendt eller deaktiveret, røres den ikke – i stedet oprettes en ny linje med status 'Afventer' med den nye udlæsning, som du så skal tage stilling til.</w:t>
       </w:r>
     </w:p>
     <w:p>
@@ -1495,7 +1518,7 @@
           <w:rFonts w:ascii="Arial" w:hAnsi="Arial"/>
           <w:sz w:val="22"/>
         </w:rPr>
-        <w:t>Stemmer kortnummeret ikke, importeres 0 aktiviteter uden fejlmelding – kun 'Sprunget over'-tallet stiger. Kontrollér og ret kortnummeret i Stamdata hvis en import ikke giver de forventede aktiviteter.</w:t>
+        <w:t>Stemmer kortnummeret ikke, importeres 0 aktiviteter for kortet – pop-up'en lister kortnummeret under 'ukendt førerkortnummer'. Kontrollér og ret kortnummeret på medarbejderen, hvis en import ikke giver de forventede aktiviteter.</w:t>
       </w:r>
     </w:p>
     <w:p>
@@ -1734,7 +1757,7 @@
                 <w:rFonts w:ascii="Arial" w:hAnsi="Arial"/>
                 <w:sz w:val="20"/>
               </w:rPr>
-              <w:t>Godkendt aktivitet.</w:t>
+              <w:t>Godkendt aktivitet. Auto-godkendte aktiviteter har deres egen accentfarve og en lille prik (kapitel 17).</w:t>
             </w:r>
           </w:p>
         </w:tc>
@@ -1973,7 +1996,7 @@
                 <w:rFonts w:ascii="Arial" w:hAnsi="Arial"/>
                 <w:sz w:val="20"/>
               </w:rPr>
-              <w:t>Aktiviteten er under 4 timer lang. Kræver kommentar ved godkendelse. Vises kun når status er Afventer eller Deaktiveret – forsvinder ved godkendelse.</w:t>
+              <w:t>Aktiviteten er under 4 timer lang – medregnet andre godkendte aktiviteter samme dag. Kræver kommentar ved godkendelse. Vises kun når status er Afventer eller Deaktiveret – forsvinder ved godkendelse.</w:t>
             </w:r>
           </w:p>
         </w:tc>
@@ -2041,7 +2064,7 @@
                 <w:b/>
                 <w:sz w:val="20"/>
               </w:rPr>
-              <w:t>(K) prefix</w:t>
+              <w:t>● (lille prik)</w:t>
             </w:r>
           </w:p>
         </w:tc>
@@ -2061,7 +2084,7 @@
                 <w:rFonts w:ascii="Arial" w:hAnsi="Arial"/>
                 <w:sz w:val="20"/>
               </w:rPr>
-              <w:t>Aktiviteten er et barn af en opdelt aktivitet.</w:t>
+              <w:t>Aktiviteten er auto-godkendt af systemet (statistisk baseline) – se kapitel 17.</w:t>
             </w:r>
           </w:p>
         </w:tc>
@@ -2085,7 +2108,7 @@
                 <w:b/>
                 <w:sz w:val="20"/>
               </w:rPr>
-              <w:t>● (lille prik)</w:t>
+              <w:t>Gult kommentar-mærke</w:t>
             </w:r>
           </w:p>
         </w:tc>
@@ -2105,7 +2128,7 @@
                 <w:rFonts w:ascii="Arial" w:hAnsi="Arial"/>
                 <w:sz w:val="20"/>
               </w:rPr>
-              <w:t>Aktiviteten er auto-godkendt af systemet (statistisk baseline) – se kapitel 17.</w:t>
+              <w:t>Aktiviteten har en kommentar. Hold musen over mærket for at læse den (2026-09-30).</w:t>
             </w:r>
           </w:p>
         </w:tc>
@@ -2308,7 +2331,7 @@
           <w:color w:val="606060"/>
           <w:sz w:val="22"/>
         </w:rPr>
-        <w:t>Registrerer eller retter du en aktivitet, hvis dato hører til en periode der allerede er kørt løn på (status 'Lukket'), lægges den automatisk over i den EFTERFØLGENDE periode i stedet for at blive afvist. Det gælder både manuel oprettelse/rettelse og import af .ddd-filer.</w:t>
+        <w:t>En lønperiode der er kørt løn på (status 'Lukket'), er låst: aktiviteter og fravær i den kan hverken oprettes, rettes, splittes, genåbnes, deaktiveres eller slettes – hverken i Aktivitetsoversigten eller Vagtplanen (siden 2026-09-30). Klikker du på en låst dato, får du besked, før opret-vinduet åbnes. Kun import af .ddd-filer kan stadig lægge en vagt fra en lukket periode over i den EFTERFØLGENDE periode (afsnit 3.2). Skal noget i en låst periode ændres, skal perioden genåbnes under 'Administration' (afsnit 9.3).</w:t>
       </w:r>
     </w:p>
     <w:p>
@@ -2646,7 +2669,7 @@
                 <w:b/>
                 <w:sz w:val="20"/>
               </w:rPr>
-              <w:t>Status og godkender</w:t>
+              <w:t>Biler på vagten</w:t>
             </w:r>
           </w:p>
         </w:tc>
@@ -2666,7 +2689,7 @@
                 <w:rFonts w:ascii="Arial" w:hAnsi="Arial"/>
                 <w:sz w:val="20"/>
               </w:rPr>
-              <w:t>Hvem har godkendt og hvornår.</w:t>
+              <w:t>Kun for en vagt kørt i flere biler: hver bil med vognnummer, registreringsnummer og tidsrum. Vognnummeret kan ikke ændres på sådan en vagt (2026-09-30).</w:t>
             </w:r>
           </w:p>
         </w:tc>
@@ -2690,7 +2713,7 @@
                 <w:b/>
                 <w:sz w:val="20"/>
               </w:rPr>
-              <w:t>Ændret af</w:t>
+              <w:t>Status og godkender</w:t>
             </w:r>
           </w:p>
         </w:tc>
@@ -2710,7 +2733,7 @@
                 <w:rFonts w:ascii="Arial" w:hAnsi="Arial"/>
                 <w:sz w:val="20"/>
               </w:rPr>
-              <w:t>Initialerne på den bruger der sidst gemte en rettelse. Vises kun når aktiviteten faktisk er blevet redigeret.</w:t>
+              <w:t>Status og initialerne på den der godkendte ('Godkendt af') eller oprettede aktiviteten ('Oprettet af').</w:t>
             </w:r>
           </w:p>
         </w:tc>
@@ -2734,7 +2757,7 @@
                 <w:b/>
                 <w:sz w:val="20"/>
               </w:rPr>
-              <w:t>Afvigelser registreret (ikke auto-godkendt)</w:t>
+              <w:t>Pauser, km og salttillæg</w:t>
             </w:r>
           </w:p>
         </w:tc>
@@ -2754,6 +2777,94 @@
                 <w:rFonts w:ascii="Arial" w:hAnsi="Arial"/>
                 <w:sz w:val="20"/>
               </w:rPr>
+              <w:t>Sum af pauser, km start/slut og salttillæg. For aktiviteter uden tachografsegmenter vises pauserne med knapperne '+ Tilføj pause', '12:00–12:30', '12:00–12:45', 'Ret' og ×.</w:t>
+            </w:r>
+          </w:p>
+        </w:tc>
+      </w:tr>
+      <w:tr>
+        <w:tc>
+          <w:tcPr>
+            <w:tcW w:type="dxa" w:w="2835"/>
+            <w:shd w:val="clear" w:color="auto" w:fill="D5E8F5"/>
+            <w:tcBorders>
+              <w:top w:val="single" w:sz="4" w:color="9BBDD6"/>
+              <w:left w:val="single" w:sz="4" w:color="9BBDD6"/>
+              <w:bottom w:val="single" w:sz="4" w:color="9BBDD6"/>
+              <w:right w:val="single" w:sz="4" w:color="9BBDD6"/>
+            </w:tcBorders>
+          </w:tcPr>
+          <w:p>
+            <w:r>
+              <w:rPr>
+                <w:rFonts w:ascii="Arial" w:hAnsi="Arial"/>
+                <w:b/>
+                <w:sz w:val="20"/>
+              </w:rPr>
+              <w:t>Ændret af</w:t>
+            </w:r>
+          </w:p>
+        </w:tc>
+        <w:tc>
+          <w:tcPr>
+            <w:tcW w:type="dxa" w:w="6520"/>
+            <w:tcBorders>
+              <w:top w:val="single" w:sz="4" w:color="9BBDD6"/>
+              <w:left w:val="single" w:sz="4" w:color="9BBDD6"/>
+              <w:bottom w:val="single" w:sz="4" w:color="9BBDD6"/>
+              <w:right w:val="single" w:sz="4" w:color="9BBDD6"/>
+            </w:tcBorders>
+          </w:tcPr>
+          <w:p>
+            <w:r>
+              <w:rPr>
+                <w:rFonts w:ascii="Arial" w:hAnsi="Arial"/>
+                <w:sz w:val="20"/>
+              </w:rPr>
+              <w:t>Initialerne på den bruger der sidst gemte en rettelse. Vises kun når aktiviteten faktisk er blevet redigeret.</w:t>
+            </w:r>
+          </w:p>
+        </w:tc>
+      </w:tr>
+      <w:tr>
+        <w:tc>
+          <w:tcPr>
+            <w:tcW w:type="dxa" w:w="2835"/>
+            <w:shd w:val="clear" w:color="auto" w:fill="D5E8F5"/>
+            <w:tcBorders>
+              <w:top w:val="single" w:sz="4" w:color="9BBDD6"/>
+              <w:left w:val="single" w:sz="4" w:color="9BBDD6"/>
+              <w:bottom w:val="single" w:sz="4" w:color="9BBDD6"/>
+              <w:right w:val="single" w:sz="4" w:color="9BBDD6"/>
+            </w:tcBorders>
+          </w:tcPr>
+          <w:p>
+            <w:r>
+              <w:rPr>
+                <w:rFonts w:ascii="Arial" w:hAnsi="Arial"/>
+                <w:b/>
+                <w:sz w:val="20"/>
+              </w:rPr>
+              <w:t>Afvigelser registreret (ikke auto-godkendt)</w:t>
+            </w:r>
+          </w:p>
+        </w:tc>
+        <w:tc>
+          <w:tcPr>
+            <w:tcW w:type="dxa" w:w="6520"/>
+            <w:tcBorders>
+              <w:top w:val="single" w:sz="4" w:color="9BBDD6"/>
+              <w:left w:val="single" w:sz="4" w:color="9BBDD6"/>
+              <w:bottom w:val="single" w:sz="4" w:color="9BBDD6"/>
+              <w:right w:val="single" w:sz="4" w:color="9BBDD6"/>
+            </w:tcBorders>
+          </w:tcPr>
+          <w:p>
+            <w:r>
+              <w:rPr>
+                <w:rFonts w:ascii="Arial" w:hAnsi="Arial"/>
+                <w:sz w:val="20"/>
+              </w:rPr>
               <w:t>Vises kun hvis aktiviteten IKKE blev auto-godkendt (kapitel 17) – lister præcis hvorfor (fx afvigende varighed eller starttid i forhold til medarbejderens sædvanlige mønster).</w:t>
             </w:r>
           </w:p>
@@ -2777,138 +2888,6 @@
       </w:r>
     </w:p>
     <w:p>
-      <w:r>
-        <w:rPr>
-          <w:rFonts w:ascii="Arial" w:hAnsi="Arial"/>
-          <w:b/>
-          <w:sz w:val="22"/>
-        </w:rPr>
-        <w:t>Ret starttid / sluttid</w:t>
-      </w:r>
-    </w:p>
-    <w:p>
-      <w:pPr>
-        <w:spacing w:after="80"/>
-      </w:pPr>
-      <w:r>
-        <w:rPr>
-          <w:rFonts w:ascii="Arial" w:hAnsi="Arial"/>
-          <w:sz w:val="22"/>
-        </w:rPr>
-        <w:t>Angiv en ny dato og et nyt klokkeslæt. Brug piltasterne i time- og minutfeltet eller skriv tallene direkte. Klik 'Gem rettelse' for at gemme. Systemet bevarer de originale tachograftider automatisk.</w:t>
-      </w:r>
-    </w:p>
-    <w:p>
-      <w:r>
-        <w:rPr>
-          <w:rFonts w:ascii="Arial" w:hAnsi="Arial"/>
-          <w:b/>
-          <w:sz w:val="22"/>
-        </w:rPr>
-        <w:t>Fortryd rettelse</w:t>
-      </w:r>
-    </w:p>
-    <w:p>
-      <w:pPr>
-        <w:spacing w:after="80"/>
-      </w:pPr>
-      <w:r>
-        <w:rPr>
-          <w:rFonts w:ascii="Arial" w:hAnsi="Arial"/>
-          <w:sz w:val="22"/>
-        </w:rPr>
-        <w:t>Nulstiller tiderne til de originale værdier fra tachografen.</w:t>
-      </w:r>
-    </w:p>
-    <w:p>
-      <w:r>
-        <w:rPr>
-          <w:rFonts w:ascii="Arial" w:hAnsi="Arial"/>
-          <w:b/>
-          <w:sz w:val="22"/>
-        </w:rPr>
-        <w:t>Opdel aktivitet</w:t>
-      </w:r>
-    </w:p>
-    <w:p>
-      <w:pPr>
-        <w:spacing w:after="80"/>
-      </w:pPr>
-      <w:r>
-        <w:rPr>
-          <w:rFonts w:ascii="Arial" w:hAnsi="Arial"/>
-          <w:sz w:val="22"/>
-        </w:rPr>
-        <w:t>Del en vagt i to – fx hvis en chauffør skifter tur midt på dagen. Vælg tidspunktet for opdelingen. Systemet opretter to nye aktiviteter og fordeler pauser og segmenter korrekt.</w:t>
-      </w:r>
-    </w:p>
-    <w:p>
-      <w:r>
-        <w:rPr>
-          <w:rFonts w:ascii="Arial" w:hAnsi="Arial"/>
-          <w:b/>
-          <w:sz w:val="22"/>
-        </w:rPr>
-        <w:t>Ret til andet arbejde / Tilpas (i den detaljerede tidslinje)</w:t>
-      </w:r>
-    </w:p>
-    <w:p>
-      <w:pPr>
-        <w:spacing w:after="80"/>
-      </w:pPr>
-      <w:r>
-        <w:rPr>
-          <w:rFonts w:ascii="Arial" w:hAnsi="Arial"/>
-          <w:sz w:val="22"/>
-        </w:rPr>
-        <w:t>Ud for et pausesegment (hvil) i den detaljerede tidslinje kan du klikke 'Ret til andet arbejde' for at omklassificere det til 'Andet arbejde' – bruges fx hvis tachografen har registreret en pause der reelt var arbejde. En 'Gendan'-knap kan fortryde præcis den rettelse igen. 'Tilpas' åbner i stedet en dialog hvor du kan justere pausens sluttidspunkt (forlænge eller forkorte) uden at ændre dens type – en forhåndsvisning viser hvor mange minutter der flyttes, og fra/til hvilket segment. Begge dele påvirker den beregnede løn direkte, da et pausesegment der bliver til arbejde tæller med i timerne.</w:t>
-      </w:r>
-    </w:p>
-    <w:p>
-      <w:r>
-        <w:rPr>
-          <w:rFonts w:ascii="Arial" w:hAnsi="Arial"/>
-          <w:b/>
-          <w:sz w:val="22"/>
-        </w:rPr>
-        <w:t>Godkend</w:t>
-      </w:r>
-    </w:p>
-    <w:p>
-      <w:pPr>
-        <w:spacing w:after="80"/>
-      </w:pPr>
-      <w:r>
-        <w:rPr>
-          <w:rFonts w:ascii="Arial" w:hAnsi="Arial"/>
-          <w:sz w:val="22"/>
-        </w:rPr>
-        <w:t>Godkend aktiviteten så den indgår i lønkørslen. Angiv dine initialer. Aktiviteter under 4 timer kræver altid en kommentar.</w:t>
-      </w:r>
-    </w:p>
-    <w:p>
-      <w:r>
-        <w:rPr>
-          <w:rFonts w:ascii="Arial" w:hAnsi="Arial"/>
-          <w:b/>
-          <w:sz w:val="22"/>
-        </w:rPr>
-        <w:t>Deaktiver</w:t>
-      </w:r>
-    </w:p>
-    <w:p>
-      <w:pPr>
-        <w:spacing w:after="80"/>
-      </w:pPr>
-      <w:r>
-        <w:rPr>
-          <w:rFonts w:ascii="Arial" w:hAnsi="Arial"/>
-          <w:sz w:val="22"/>
-        </w:rPr>
-        <w:t>Markér aktiviteten som inaktiv. Den indgår ikke i lønberegningen men slettes ikke fra databasen.</w:t>
-      </w:r>
-    </w:p>
-    <w:p>
       <w:pPr>
         <w:spacing w:before="80" w:after="160"/>
         <w:ind w:left="283" w:right="283"/>
@@ -2920,7 +2899,7 @@
           <w:color w:val="2E6DB8"/>
           <w:sz w:val="22"/>
         </w:rPr>
-        <w:t xml:space="preserve">VIGTIGT: </w:t>
+        <w:t xml:space="preserve">GODT AT VIDE: </w:t>
       </w:r>
       <w:r>
         <w:rPr>
@@ -2928,7 +2907,139 @@
           <w:color w:val="606060"/>
           <w:sz w:val="22"/>
         </w:rPr>
-        <w:t>Deaktiver-dialogen har et ekstra flueben 'Slet aktiviteten helt', som sletter aktiviteten PERMANENT i stedet for blot at deaktivere den – kan ikke fortrydes. Fluebenet er kun tilgængeligt for fraværstyper (altid) og for manuelt oprettet normal tid – en takograf-importeret kørselsaktivitet kan aldrig slettes helt, kun deaktiveres, fordi den er rå kørselsdata fra førerkortet. Brug det med omtanke: der er ingen 'Gendan' for en permanent slettet aktivitet.</w:t>
+        <w:t>Hvilke knapper du ser, afhænger af din rolle: 'Redigér aktiviteter' giver ret, fortryd, split og ret pauser; 'Godkend aktiviteter' giver godkend, deaktiver, slet og genåbn (afsnit 11.3). I en låst lønperiode vises kun Godkend og Luk.</w:t>
+      </w:r>
+    </w:p>
+    <w:p>
+      <w:r>
+        <w:rPr>
+          <w:rFonts w:ascii="Arial" w:hAnsi="Arial"/>
+          <w:b/>
+          <w:sz w:val="22"/>
+        </w:rPr>
+        <w:t>Ret starttid / sluttid</w:t>
+      </w:r>
+    </w:p>
+    <w:p>
+      <w:pPr>
+        <w:spacing w:after="80"/>
+      </w:pPr>
+      <w:r>
+        <w:rPr>
+          <w:rFonts w:ascii="Arial" w:hAnsi="Arial"/>
+          <w:sz w:val="22"/>
+        </w:rPr>
+        <w:t>Angiv en ny dato og et nyt klokkeslæt. Brug piltasterne i time- og minutfeltet eller skriv tallene direkte. Klik '💾 Gem ændringer' for at gemme. Systemet bevarer de originale tachograftider automatisk. Tømmer du vognnummer- eller km-feltet, gemmes feltet tomt.</w:t>
+      </w:r>
+    </w:p>
+    <w:p>
+      <w:r>
+        <w:rPr>
+          <w:rFonts w:ascii="Arial" w:hAnsi="Arial"/>
+          <w:b/>
+          <w:sz w:val="22"/>
+        </w:rPr>
+        <w:t>↩ Fortryd tidsændring / ↩ Fortryd split</w:t>
+      </w:r>
+    </w:p>
+    <w:p>
+      <w:pPr>
+        <w:spacing w:after="80"/>
+      </w:pPr>
+      <w:r>
+        <w:rPr>
+          <w:rFonts w:ascii="Arial" w:hAnsi="Arial"/>
+          <w:sz w:val="22"/>
+        </w:rPr>
+        <w:t>'Fortryd tidsændring' nulstiller tiderne til de originale værdier fra tachografen. 'Fortryd split' sletter de to dele og gendanner den oprindelige aktivitet.</w:t>
+      </w:r>
+    </w:p>
+    <w:p>
+      <w:r>
+        <w:rPr>
+          <w:rFonts w:ascii="Arial" w:hAnsi="Arial"/>
+          <w:b/>
+          <w:sz w:val="22"/>
+        </w:rPr>
+        <w:t>✂️ Split</w:t>
+      </w:r>
+    </w:p>
+    <w:p>
+      <w:pPr>
+        <w:spacing w:after="80"/>
+      </w:pPr>
+      <w:r>
+        <w:rPr>
+          <w:rFonts w:ascii="Arial" w:hAnsi="Arial"/>
+          <w:sz w:val="22"/>
+        </w:rPr>
+        <w:t>Del en vagt i to – fx hvis en chauffør skifter tur midt på dagen. Vælg tidspunktet, eller klik på saksen ✂️ ud for et segment i tidslinjen. Den oprindelige aktivitet deaktiveres, og systemet opretter to nye, afventende aktiviteter og fordeler pauser og segmenter korrekt – også når en pause er rettet til andet arbejde (rettet 2026-09-30).</w:t>
+      </w:r>
+    </w:p>
+    <w:p>
+      <w:r>
+        <w:rPr>
+          <w:rFonts w:ascii="Arial" w:hAnsi="Arial"/>
+          <w:b/>
+          <w:sz w:val="22"/>
+        </w:rPr>
+        <w:t>Ret til andet arbejde / Tilpas (i den detaljerede tidslinje)</w:t>
+      </w:r>
+    </w:p>
+    <w:p>
+      <w:pPr>
+        <w:spacing w:after="80"/>
+      </w:pPr>
+      <w:r>
+        <w:rPr>
+          <w:rFonts w:ascii="Arial" w:hAnsi="Arial"/>
+          <w:sz w:val="22"/>
+        </w:rPr>
+        <w:t>Ud for et pausesegment (hvil) i den detaljerede tidslinje kan du klikke 'Ret til andet arbejde' for at omklassificere det til 'Andet arbejde' – bruges fx hvis tachografen har registreret en pause der reelt var arbejde. En 'Gendan'-knap kan fortryde præcis den rettelse igen. 'Tilpas' åbner i stedet en dialog hvor du kan justere pausens sluttidspunkt (forlænge eller forkorte) uden at ændre dens type – en forhåndsvisning viser hvor mange minutter der flyttes, og fra/til hvilket segment. Begge dele påvirker den beregnede løn direkte, da et pausesegment der bliver til arbejde tæller med i timerne. Knappen 'Al pause til andet arbejde' retter alle pauser i aktiviteten på én gang.</w:t>
+      </w:r>
+    </w:p>
+    <w:p>
+      <w:r>
+        <w:rPr>
+          <w:rFonts w:ascii="Arial" w:hAnsi="Arial"/>
+          <w:b/>
+          <w:sz w:val="22"/>
+        </w:rPr>
+        <w:t>Godkend</w:t>
+      </w:r>
+    </w:p>
+    <w:p>
+      <w:pPr>
+        <w:spacing w:after="80"/>
+      </w:pPr>
+      <w:r>
+        <w:rPr>
+          <w:rFonts w:ascii="Arial" w:hAnsi="Arial"/>
+          <w:sz w:val="22"/>
+        </w:rPr>
+        <w:t>Godkend aktiviteten så den indgår i lønkørslen. Dine initialer registreres automatisk fra dit login. Aktiviteter under 4 timer kræver altid en kommentar.</w:t>
+      </w:r>
+    </w:p>
+    <w:p>
+      <w:r>
+        <w:rPr>
+          <w:rFonts w:ascii="Arial" w:hAnsi="Arial"/>
+          <w:b/>
+          <w:sz w:val="22"/>
+        </w:rPr>
+        <w:t>Deaktiver</w:t>
+      </w:r>
+    </w:p>
+    <w:p>
+      <w:pPr>
+        <w:spacing w:after="80"/>
+      </w:pPr>
+      <w:r>
+        <w:rPr>
+          <w:rFonts w:ascii="Arial" w:hAnsi="Arial"/>
+          <w:sz w:val="22"/>
+        </w:rPr>
+        <w:t>Markér aktiviteten som inaktiv. Den indgår ikke i lønberegningen men slettes ikke fra databasen.</w:t>
       </w:r>
     </w:p>
     <w:p>
@@ -2951,6 +3062,29 @@
           <w:color w:val="606060"/>
           <w:sz w:val="22"/>
         </w:rPr>
+        <w:t>Deaktiver-dialogen har et ekstra flueben 'Slet aktiviteten helt', som sletter aktiviteten PERMANENT i stedet for blot at deaktivere den – kan ikke fortrydes. Fluebenet er kun tilgængeligt for fraværstyper (altid) og for manuelt oprettet normal tid – en takograf-importeret kørselsaktivitet kan aldrig slettes helt, kun deaktiveres, fordi den er rå kørselsdata fra førerkortet. Brug det med omtanke: der er ingen 'Gendan' for en permanent slettet aktivitet.</w:t>
+      </w:r>
+    </w:p>
+    <w:p>
+      <w:pPr>
+        <w:spacing w:before="80" w:after="160"/>
+        <w:ind w:left="283" w:right="283"/>
+      </w:pPr>
+      <w:r>
+        <w:rPr>
+          <w:rFonts w:ascii="Arial" w:hAnsi="Arial"/>
+          <w:b/>
+          <w:color w:val="2E6DB8"/>
+          <w:sz w:val="22"/>
+        </w:rPr>
+        <w:t xml:space="preserve">VIGTIGT: </w:t>
+      </w:r>
+      <w:r>
+        <w:rPr>
+          <w:rFonts w:ascii="Arial" w:hAnsi="Arial"/>
+          <w:color w:val="606060"/>
+          <w:sz w:val="22"/>
+        </w:rPr>
         <w:t>KUN godkendte aktiviteter medtages i lønkørslen. Husk at gennemgå og godkende alle relevante aktiviteter inden du kører løn.</w:t>
       </w:r>
     </w:p>
@@ -3126,7 +3260,7 @@
           <w:rFonts w:ascii="Arial" w:hAnsi="Arial"/>
           <w:sz w:val="22"/>
         </w:rPr>
-        <w:t>Udfyld eventuelt turnummer og pålæsning/aflæsning (kun for normale aktiviteter).</w:t>
+        <w:t>Udfyld eventuelt pålæsning/aflæsning (minutter), km start/slut og salttillæg (kun for normale aktiviteter). Pålæsning/aflæsning gemmes kun – de påvirker ikke lønnen.</w:t>
       </w:r>
     </w:p>
     <w:p>
@@ -3171,7 +3305,7 @@
           <w:color w:val="606060"/>
           <w:sz w:val="22"/>
         </w:rPr>
-        <w:t>Vognnummer/registreringsnummer er PÅKRÆVET for alle aktivitetstyper undtagen overnatning – også for fraværstyper. Feltet valideres mod Vognparken: stemmer det ikke med et kendt vognnummer, viser systemet 'Ukendt registreringsnummer' og beder dig oprette køretøjet i Vognpark først, i stedet for at gemme aktiviteten.</w:t>
+        <w:t>Vognnummer/registreringsnummer er PÅKRÆVET for alle aktivitetstyper undtagen overnatning – også for fraværstyper. Feltet valideres mod Vognparken: stemmer det ikke med et kendt vognnummer, viser systemet 'Ukendt registreringsnummer' og beder dig oprette køretøjet i Vognpark først, i stedet for at gemme aktiviteten. Ved fravær forudfyldes feltet med medarbejderens 'Vognnummer ved fravær' (afsnit 7.2).</w:t>
       </w:r>
     </w:p>
     <w:p>
@@ -3186,7 +3320,7 @@
           <w:color w:val="2E6DB8"/>
           <w:sz w:val="22"/>
         </w:rPr>
-        <w:t xml:space="preserve">TIP: </w:t>
+        <w:t xml:space="preserve">BEMÆRK: </w:t>
       </w:r>
       <w:r>
         <w:rPr>
@@ -3194,7 +3328,7 @@
           <w:color w:val="606060"/>
           <w:sz w:val="22"/>
         </w:rPr>
-        <w:t>Vognnummer-feltets søgeliste kan siden 2026-09-17 betjenes med tastaturet: Pil ned/Tab flytter markeringen ned i listen (Shift+Tab/Pil op flytter op), Enter vælger det markerede køretøj, og Escape lukker listen igen.</w:t>
+        <w:t>'+ Tilføj aktivitet' og klik i en tom celle kræver rettigheden 'Redigér aktiviteter'. Aktiviteter kan ikke oprettes på datoer i en låst lønperiode – rammer en periode med 'Til dato' en låst dato, oprettes ingen af dagene.</w:t>
       </w:r>
     </w:p>
     <w:p>
@@ -3209,6 +3343,29 @@
           <w:color w:val="2E6DB8"/>
           <w:sz w:val="22"/>
         </w:rPr>
+        <w:t xml:space="preserve">TIP: </w:t>
+      </w:r>
+      <w:r>
+        <w:rPr>
+          <w:rFonts w:ascii="Arial" w:hAnsi="Arial"/>
+          <w:color w:val="606060"/>
+          <w:sz w:val="22"/>
+        </w:rPr>
+        <w:t>Vognnummer-feltets søgeliste kan siden 2026-09-17 betjenes med tastaturet: Pil ned/Tab flytter markeringen ned i listen (Shift+Tab/Pil op flytter op), Enter vælger det markerede køretøj, og Escape lukker listen igen.</w:t>
+      </w:r>
+    </w:p>
+    <w:p>
+      <w:pPr>
+        <w:spacing w:before="80" w:after="160"/>
+        <w:ind w:left="283" w:right="283"/>
+      </w:pPr>
+      <w:r>
+        <w:rPr>
+          <w:rFonts w:ascii="Arial" w:hAnsi="Arial"/>
+          <w:b/>
+          <w:color w:val="2E6DB8"/>
+          <w:sz w:val="22"/>
+        </w:rPr>
         <w:t xml:space="preserve">BEMÆRK: </w:t>
       </w:r>
       <w:r>
@@ -3258,7 +3415,7 @@
           <w:rFonts w:ascii="Arial" w:hAnsi="Arial"/>
           <w:sz w:val="22"/>
         </w:rPr>
-        <w:t>Felterne for turnummer, pålæsning og aflæsning skjules (ikke relevante).</w:t>
+        <w:t>Felterne for pålæsning, aflæsning, km og pauser skjules (ikke relevante).</w:t>
       </w:r>
     </w:p>
     <w:p>
@@ -3412,7 +3569,7 @@
                 <w:rFonts w:ascii="Arial" w:hAnsi="Arial"/>
                 <w:sz w:val="20"/>
               </w:rPr>
-              <w:t>Registrerer en feriedag. Start: 06:00. Slut: 06:00 + normaltimer for dagen. Tælles i timeoversigten, men er som default IKKE med i Danløn-CSV'en (kan slås til i Stamdata).</w:t>
+              <w:t>Registrerer en feriedag. Start: 06:00. Slut: 06:00 + normaltimer for dagen. Vises i Lønkørsel og Lønafregning, men kommer aldrig med i Danløn-CSV'en (der findes ingen løntypekode for ferie).</w:t>
             </w:r>
           </w:p>
         </w:tc>
@@ -3664,7 +3821,7 @@
                 <w:rFonts w:ascii="Arial" w:hAnsi="Arial"/>
                 <w:sz w:val="20"/>
               </w:rPr>
-              <w:t>Krydses af INDE I Overnatning-oprettelsen (samme modal, ekstra 'DOB'-flueben) – registreres som en separat overnatningstype med sin egen sats i Stamdata → Tillæg. Vises som egen linje i PDF-timesedlen og prøvekørslens Excel-ark, men indgår PT. IKKE i Danløn CSV-eksporten.</w:t>
+              <w:t>Krydses af INDE I Overnatning-oprettelsen (samme modal, ekstra 'DOB'-flueben) – registreres som en separat overnatningstype med sin egen sats i Stamdata → Tillæg. Vises som egen linje i PDF-timesedlen og prøvekørslens Excel-ark. Kommer med i Danløn CSV'en, når der findes en løntypekode for DOB-overnatning i Stamdata → Løntypekoder (fx kode 43) – systemet opretter den ikke selv.</w:t>
             </w:r>
           </w:p>
         </w:tc>
@@ -3940,7 +4097,7 @@
           <w:rFonts w:ascii="Arial" w:hAnsi="Arial"/>
           <w:sz w:val="22"/>
         </w:rPr>
-        <w:t>Pauserne påvirker tre steder i systemet:</w:t>
+        <w:t>Pauserne påvirker fire steder i systemet:</w:t>
       </w:r>
     </w:p>
     <w:p>
@@ -3968,7 +4125,7 @@
           <w:rFonts w:ascii="Arial" w:hAnsi="Arial"/>
           <w:sz w:val="22"/>
         </w:rPr>
-        <w:t>Aktivitetsfordeling – manuelle aktiviteter med pauser viser 'Effektiv tid' (blå) og 'Hvil/pause' (grå) i %-bjælken.</w:t>
+        <w:t>Tooltip i aktivitetsoversigten – hold musen over en vagt for at se tidsrum, arbejdstid, pause, status og fordelingen Kørsel / Andet arbejde / Rådighed / Pause i %.</w:t>
       </w:r>
     </w:p>
     <w:p>
@@ -3982,6 +4139,20 @@
           <w:rFonts w:ascii="Arial" w:hAnsi="Arial"/>
           <w:sz w:val="22"/>
         </w:rPr>
+        <w:t>Aktivitetsfordeling – manuelle aktiviteter med pauser viser 'Effektiv tid' (blå) og 'Pause' (grå) i %-bjælken.</w:t>
+      </w:r>
+    </w:p>
+    <w:p>
+      <w:pPr>
+        <w:pStyle w:val="ListBullet"/>
+        <w:spacing w:after="40"/>
+        <w:ind w:left="454"/>
+      </w:pPr>
+      <w:r>
+        <w:rPr>
+          <w:rFonts w:ascii="Arial" w:hAnsi="Arial"/>
+          <w:sz w:val="22"/>
+        </w:rPr>
         <w:t>Lønberegning – pauser fratrækkes i det præcise tidsvindue de afholdes, så overtidstillæg beregnes korrekt.</w:t>
       </w:r>
     </w:p>
@@ -4023,7 +4194,7 @@
           <w:rFonts w:ascii="Arial" w:hAnsi="Arial"/>
           <w:sz w:val="22"/>
         </w:rPr>
-        <w:t>Dage der TILFØJES til perioden, får en ny aktivitet med samme standardtimer som ved oprettelse. Har medarbejderen 0 skemalagte timer den ugedag, springes dagen automatisk over.</w:t>
+        <w:t>Dage der TILFØJES til perioden, får en ny aktivitet med samme standardtimer som ved oprettelse (skemalagte timer, eller 7,4 t hvis de er 0; feriefri altid 7,4 t). Kun for afspadsering springes en dag med 0 skemalagte timer over.</w:t>
       </w:r>
     </w:p>
     <w:p>
@@ -4074,7 +4245,7 @@
           <w:color w:val="606060"/>
           <w:sz w:val="22"/>
         </w:rPr>
-        <w:t>Er en af dagene der skal fjernes i en lønperiode der allerede er kørt løn på ('Lukket'), afvises hele ændringen – ingen dage fjernes, før perioden evt. genåbnes. Det samme gælder hvis en af dagene er blevet opdelt (split) – fortryd splittet først.</w:t>
+        <w:t>Er en af dagene der skal fjernes ELLER tilføjes i en lønperiode der allerede er kørt løn på ('Lukket'), afvises hele ændringen – ingen dage ændres, før perioden evt. genåbnes. Åbner du en dag i en låst periode, vises 'Fraværsperiode'-boksen slet ikke. Det samme gælder hvis en af dagene er blevet opdelt (split) – fortryd splittet først.</w:t>
       </w:r>
     </w:p>
     <w:p>
@@ -4412,7 +4583,7 @@
                 <w:rFonts w:ascii="Arial" w:hAnsi="Arial"/>
                 <w:sz w:val="20"/>
               </w:rPr>
-              <w:t>Bestemmer timesatsen. Vælg fra listen der stammer fra Stamdata (Overenskomsttyper-fanen). Feltet er kun obligatorisk (rød *) hvis den valgte Aftale-type kræver det – styres pr. aftaletype i Stamdata.</w:t>
+              <w:t>Bestemmer timesatsen. Vælg fra listen der stammer fra Stamdata (Overenskomsttyper-fanen). Kræver den valgte Aftale-type ikke overenskomsttype (styres i Stamdata), skjules feltet helt og tømmes.</w:t>
             </w:r>
           </w:p>
         </w:tc>
@@ -4496,7 +4667,7 @@
                 <w:rFonts w:ascii="Arial" w:hAnsi="Arial"/>
                 <w:sz w:val="20"/>
               </w:rPr>
-              <w:t>Fast bil</w:t>
+              <w:t>Vognnummer ved fravær</w:t>
             </w:r>
           </w:p>
         </w:tc>
@@ -4516,7 +4687,7 @@
                 <w:rFonts w:ascii="Arial" w:hAnsi="Arial"/>
                 <w:sz w:val="20"/>
               </w:rPr>
-              <w:t>Nej</w:t>
+              <w:t>Ja</w:t>
             </w:r>
           </w:p>
         </w:tc>
@@ -4536,7 +4707,7 @@
                 <w:rFonts w:ascii="Arial" w:hAnsi="Arial"/>
                 <w:sz w:val="20"/>
               </w:rPr>
-              <w:t>Afkryds for at medarbejderen skal foreslås som standardchauffør på en bestemt vogn i Dagsplan (kapitel 13). Vises herefter et søgbart vognnummer-felt, ikke begrænset til egen disponentgruppe.</w:t>
+              <w:t>Søgbart felt (vælg fra Vognpark). Vognnummeret forudfyldes, når der registreres fravær for medarbejderen (2026-09-30). Erstatter disponentgruppens vogn – er feltet tomt, er vognnummeret tomt ved fravær. Eksisterende medarbejdere har feltet tomt, indtil det udfyldes.</w:t>
             </w:r>
           </w:p>
         </w:tc>
@@ -4558,7 +4729,7 @@
                 <w:rFonts w:ascii="Arial" w:hAnsi="Arial"/>
                 <w:sz w:val="20"/>
               </w:rPr>
-              <w:t>Særaftale: Øvrig overtid for alle timer</w:t>
+              <w:t>Fast bil</w:t>
             </w:r>
           </w:p>
         </w:tc>
@@ -4598,7 +4769,7 @@
                 <w:rFonts w:ascii="Arial" w:hAnsi="Arial"/>
                 <w:sz w:val="20"/>
               </w:rPr>
-              <w:t>Afkryds KUN for en medarbejder med en individuel aftale om at alle arbejdstimer skal give Øvrig overtid oveni normal løn, uden dagligt loft (se afsnit 9.6). Berører lønberegningen direkte – brug med omtanke.</w:t>
+              <w:t>Afkryds for at medarbejderen skal foreslås som standardchauffør på en bestemt vogn i Dagsplan (kapitel 13). Vises herefter et søgbart vognnummer-felt, ikke begrænset til egen disponentgruppe.</w:t>
             </w:r>
           </w:p>
         </w:tc>
@@ -4620,7 +4791,7 @@
                 <w:rFonts w:ascii="Arial" w:hAnsi="Arial"/>
                 <w:sz w:val="20"/>
               </w:rPr>
-              <w:t>Afløser</w:t>
+              <w:t>Særaftale: Øvrig overtid for alle timer</w:t>
             </w:r>
           </w:p>
         </w:tc>
@@ -4660,7 +4831,7 @@
                 <w:rFonts w:ascii="Arial" w:hAnsi="Arial"/>
                 <w:sz w:val="20"/>
               </w:rPr>
-              <w:t>Afkryd for en afløser/substitutmedarbejder. Medarbejderen får IKKE søgnehelligdagsbetaling (kode 4/63) på søndage/helligdage medmindre vedkommende faktisk har kørt den dag – se afsnit 9.5. Farvemarkeres separat i medarbejderlisten, Vagtplan og Aktivitetsoversigten.</w:t>
+              <w:t>Afkryds KUN for en medarbejder med en individuel aftale om at alle arbejdstimer skal give Øvrig overtid oveni normal løn, uden dagligt loft (se afsnit 9.6). Berører lønberegningen direkte – brug med omtanke.</w:t>
             </w:r>
           </w:p>
         </w:tc>
@@ -4682,7 +4853,7 @@
                 <w:rFonts w:ascii="Arial" w:hAnsi="Arial"/>
                 <w:sz w:val="20"/>
               </w:rPr>
-              <w:t>CVR-nummer</w:t>
+              <w:t>Afløser</w:t>
             </w:r>
           </w:p>
         </w:tc>
@@ -4722,7 +4893,7 @@
                 <w:rFonts w:ascii="Arial" w:hAnsi="Arial"/>
                 <w:sz w:val="20"/>
               </w:rPr>
-              <w:t>Kun synligt hvis der er oprettet 2 eller flere CVR-numre i Stamdata → CVR nummer. Vælger hvilket CVR-nummer medarbejderens Danløn-eksport og PDF-timeseddel skal bruge. Tomt/skjult felt = medarbejderen bruger automatisk standard-CVR'et.</w:t>
+              <w:t>Afkryd for en afløser/substitutmedarbejder. Medarbejderen får IKKE søgnehelligdagsbetaling (kode 4/63) på søndage/helligdage medmindre vedkommende faktisk har kørt den dag – se afsnit 9.5. Farvemarkeres separat i medarbejderlisten, Vagtplan og Aktivitetsoversigten.</w:t>
             </w:r>
           </w:p>
         </w:tc>
@@ -4744,7 +4915,7 @@
                 <w:rFonts w:ascii="Arial" w:hAnsi="Arial"/>
                 <w:sz w:val="20"/>
               </w:rPr>
-              <w:t>Lønnummer</w:t>
+              <w:t>CVR-nummer</w:t>
             </w:r>
           </w:p>
         </w:tc>
@@ -4764,7 +4935,7 @@
                 <w:rFonts w:ascii="Arial" w:hAnsi="Arial"/>
                 <w:sz w:val="20"/>
               </w:rPr>
-              <w:t>Ja</w:t>
+              <w:t>Nej</w:t>
             </w:r>
           </w:p>
         </w:tc>
@@ -4784,7 +4955,7 @@
                 <w:rFonts w:ascii="Arial" w:hAnsi="Arial"/>
                 <w:sz w:val="20"/>
               </w:rPr>
-              <w:t>Unikt lønnummer (bruges i Danløn-eksporten).</w:t>
+              <w:t>Kun synligt hvis der er oprettet 2 eller flere CVR-numre i Stamdata → CVR nummer. Vælger hvilket CVR-nummer medarbejderens Danløn-eksport og PDF-timeseddel skal bruge. Der er intet tomt valg – standard-CVR'et er forvalgt og gemmes på medarbejderen. Er feltet skjult (kun ét CVR), bruges automatisk standard-CVR'et.</w:t>
             </w:r>
           </w:p>
         </w:tc>
@@ -4806,7 +4977,7 @@
                 <w:rFonts w:ascii="Arial" w:hAnsi="Arial"/>
                 <w:sz w:val="20"/>
               </w:rPr>
-              <w:t>Førerkortnummer</w:t>
+              <w:t>Lønnummer</w:t>
             </w:r>
           </w:p>
         </w:tc>
@@ -4826,7 +4997,7 @@
                 <w:rFonts w:ascii="Arial" w:hAnsi="Arial"/>
                 <w:sz w:val="20"/>
               </w:rPr>
-              <w:t>Nej</w:t>
+              <w:t>Ja</w:t>
             </w:r>
           </w:p>
         </w:tc>
@@ -4846,7 +5017,7 @@
                 <w:rFonts w:ascii="Arial" w:hAnsi="Arial"/>
                 <w:sz w:val="20"/>
               </w:rPr>
-              <w:t>EU-førerkortnummer – påkrævet for at importere .ddd-filer korrekt.</w:t>
+              <w:t>Unikt lønnummer (bruges i Danløn-eksporten).</w:t>
             </w:r>
           </w:p>
         </w:tc>
@@ -4868,7 +5039,7 @@
                 <w:rFonts w:ascii="Arial" w:hAnsi="Arial"/>
                 <w:sz w:val="20"/>
               </w:rPr>
-              <w:t>Navn</w:t>
+              <w:t>Førerkortnummer</w:t>
             </w:r>
           </w:p>
         </w:tc>
@@ -4888,7 +5059,7 @@
                 <w:rFonts w:ascii="Arial" w:hAnsi="Arial"/>
                 <w:sz w:val="20"/>
               </w:rPr>
-              <w:t>Ja</w:t>
+              <w:t>Nej</w:t>
             </w:r>
           </w:p>
         </w:tc>
@@ -4908,7 +5079,7 @@
                 <w:rFonts w:ascii="Arial" w:hAnsi="Arial"/>
                 <w:sz w:val="20"/>
               </w:rPr>
-              <w:t>Fornavn og efternavn.</w:t>
+              <w:t>EU-førerkortnummer – påkrævet for at importere .ddd-filer korrekt. Skjules for aftaletypen 'Funktionær'.</w:t>
             </w:r>
           </w:p>
         </w:tc>
@@ -4930,7 +5101,7 @@
                 <w:rFonts w:ascii="Arial" w:hAnsi="Arial"/>
                 <w:sz w:val="20"/>
               </w:rPr>
-              <w:t>Adresse / postnummer</w:t>
+              <w:t>Initialer</w:t>
             </w:r>
           </w:p>
         </w:tc>
@@ -4970,7 +5141,7 @@
                 <w:rFonts w:ascii="Arial" w:hAnsi="Arial"/>
                 <w:sz w:val="20"/>
               </w:rPr>
-              <w:t>Adresseoplysninger.</w:t>
+              <w:t>Skal svare til brugerens login-initialer, hvis medarbejderen skal kunne redigere sin egen linje i Vagtplan.</w:t>
             </w:r>
           </w:p>
         </w:tc>
@@ -4992,7 +5163,7 @@
                 <w:rFonts w:ascii="Arial" w:hAnsi="Arial"/>
                 <w:sz w:val="20"/>
               </w:rPr>
-              <w:t>E-mail / telefon</w:t>
+              <w:t>Navn</w:t>
             </w:r>
           </w:p>
         </w:tc>
@@ -5012,7 +5183,7 @@
                 <w:rFonts w:ascii="Arial" w:hAnsi="Arial"/>
                 <w:sz w:val="20"/>
               </w:rPr>
-              <w:t>Nej</w:t>
+              <w:t>Ja</w:t>
             </w:r>
           </w:p>
         </w:tc>
@@ -5032,7 +5203,7 @@
                 <w:rFonts w:ascii="Arial" w:hAnsi="Arial"/>
                 <w:sz w:val="20"/>
               </w:rPr>
-              <w:t>Kontaktoplysninger.</w:t>
+              <w:t>Fornavn og efternavn.</w:t>
             </w:r>
           </w:p>
         </w:tc>
@@ -5054,7 +5225,7 @@
                 <w:rFonts w:ascii="Arial" w:hAnsi="Arial"/>
                 <w:sz w:val="20"/>
               </w:rPr>
-              <w:t>Ansættelsesdato</w:t>
+              <w:t>Adresse / postnummer</w:t>
             </w:r>
           </w:p>
         </w:tc>
@@ -5074,7 +5245,7 @@
                 <w:rFonts w:ascii="Arial" w:hAnsi="Arial"/>
                 <w:sz w:val="20"/>
               </w:rPr>
-              <w:t>Ja</w:t>
+              <w:t>Nej</w:t>
             </w:r>
           </w:p>
         </w:tc>
@@ -5094,7 +5265,7 @@
                 <w:rFonts w:ascii="Arial" w:hAnsi="Arial"/>
                 <w:sz w:val="20"/>
               </w:rPr>
-              <w:t>Startdato for ansættelsen. Klik på feltet for at åbne en kalender med måned- og årstaldropdown.</w:t>
+              <w:t>Adresseoplysninger.</w:t>
             </w:r>
           </w:p>
         </w:tc>
@@ -5116,7 +5287,7 @@
                 <w:rFonts w:ascii="Arial" w:hAnsi="Arial"/>
                 <w:sz w:val="20"/>
               </w:rPr>
-              <w:t>Fratrædelsesdato</w:t>
+              <w:t>E-mail / telefon / mobil</w:t>
             </w:r>
           </w:p>
         </w:tc>
@@ -5156,7 +5327,7 @@
                 <w:rFonts w:ascii="Arial" w:hAnsi="Arial"/>
                 <w:sz w:val="20"/>
               </w:rPr>
-              <w:t>Udfyldes KUN ved fratrædelse. Default er 31-12-9999. Klik på feltet for at åbne kalender-pickeren.</w:t>
+              <w:t>Kontaktoplysninger. E-mail bruges til at sende timesedler. Tømmer du et af de valgfri felter (fx e-mail, telefon, adresse, initialer eller førerkortnummer), gemmes det tomt (rettet 2026-09-30 – før blev den gamle værdi stående).</w:t>
             </w:r>
           </w:p>
         </w:tc>
@@ -5178,7 +5349,7 @@
                 <w:rFonts w:ascii="Arial" w:hAnsi="Arial"/>
                 <w:sz w:val="20"/>
               </w:rPr>
-              <w:t>Aktiv</w:t>
+              <w:t>Ansættelsesdato</w:t>
             </w:r>
           </w:p>
         </w:tc>
@@ -5198,7 +5369,7 @@
                 <w:rFonts w:ascii="Arial" w:hAnsi="Arial"/>
                 <w:sz w:val="20"/>
               </w:rPr>
-              <w:t>—</w:t>
+              <w:t>Ja</w:t>
             </w:r>
           </w:p>
         </w:tc>
@@ -5218,7 +5389,7 @@
                 <w:rFonts w:ascii="Arial" w:hAnsi="Arial"/>
                 <w:sz w:val="20"/>
               </w:rPr>
-              <w:t>Afkryd for at medarbejderen er aktiv i systemet.</w:t>
+              <w:t>Startdato for ansættelsen. Klik på feltet for at åbne en kalender med måned- og årstaldropdown.</w:t>
             </w:r>
           </w:p>
         </w:tc>
@@ -5240,7 +5411,7 @@
                 <w:rFonts w:ascii="Arial" w:hAnsi="Arial"/>
                 <w:sz w:val="20"/>
               </w:rPr>
-              <w:t>Fuldlønnet</w:t>
+              <w:t>Fratrædelsesdato</w:t>
             </w:r>
           </w:p>
         </w:tc>
@@ -5260,7 +5431,7 @@
                 <w:rFonts w:ascii="Arial" w:hAnsi="Arial"/>
                 <w:sz w:val="20"/>
               </w:rPr>
-              <w:t>—</w:t>
+              <w:t>Nej</w:t>
             </w:r>
           </w:p>
         </w:tc>
@@ -5280,7 +5451,7 @@
                 <w:rFonts w:ascii="Arial" w:hAnsi="Arial"/>
                 <w:sz w:val="20"/>
               </w:rPr>
-              <w:t>Afkryd hvis medarbejderen er fuldlønnet.</w:t>
+              <w:t>Udfyldes KUN ved fratrædelse. Default er 31-12-9999. Klik på feltet for at åbne kalender-pickeren.</w:t>
             </w:r>
           </w:p>
         </w:tc>
@@ -5302,7 +5473,7 @@
                 <w:rFonts w:ascii="Arial" w:hAnsi="Arial"/>
                 <w:sz w:val="20"/>
               </w:rPr>
-              <w:t>§56</w:t>
+              <w:t>Aktiv</w:t>
             </w:r>
           </w:p>
         </w:tc>
@@ -5342,6 +5513,130 @@
                 <w:rFonts w:ascii="Arial" w:hAnsi="Arial"/>
                 <w:sz w:val="20"/>
               </w:rPr>
+              <w:t>Afkryd for at medarbejderen er aktiv i systemet.</w:t>
+            </w:r>
+          </w:p>
+        </w:tc>
+      </w:tr>
+      <w:tr>
+        <w:tc>
+          <w:tcPr>
+            <w:tcW w:type="dxa" w:w="3024"/>
+            <w:tcBorders>
+              <w:top w:val="single" w:sz="4" w:color="CCCCCC"/>
+              <w:left w:val="single" w:sz="4" w:color="CCCCCC"/>
+              <w:bottom w:val="single" w:sz="4" w:color="CCCCCC"/>
+              <w:right w:val="single" w:sz="4" w:color="CCCCCC"/>
+            </w:tcBorders>
+          </w:tcPr>
+          <w:p>
+            <w:r>
+              <w:rPr>
+                <w:rFonts w:ascii="Arial" w:hAnsi="Arial"/>
+                <w:sz w:val="20"/>
+              </w:rPr>
+              <w:t>Fuldlønnet</w:t>
+            </w:r>
+          </w:p>
+        </w:tc>
+        <w:tc>
+          <w:tcPr>
+            <w:tcW w:type="dxa" w:w="3024"/>
+            <w:tcBorders>
+              <w:top w:val="single" w:sz="4" w:color="CCCCCC"/>
+              <w:left w:val="single" w:sz="4" w:color="CCCCCC"/>
+              <w:bottom w:val="single" w:sz="4" w:color="CCCCCC"/>
+              <w:right w:val="single" w:sz="4" w:color="CCCCCC"/>
+            </w:tcBorders>
+          </w:tcPr>
+          <w:p>
+            <w:r>
+              <w:rPr>
+                <w:rFonts w:ascii="Arial" w:hAnsi="Arial"/>
+                <w:sz w:val="20"/>
+              </w:rPr>
+              <w:t>—</w:t>
+            </w:r>
+          </w:p>
+        </w:tc>
+        <w:tc>
+          <w:tcPr>
+            <w:tcW w:type="dxa" w:w="3024"/>
+            <w:tcBorders>
+              <w:top w:val="single" w:sz="4" w:color="CCCCCC"/>
+              <w:left w:val="single" w:sz="4" w:color="CCCCCC"/>
+              <w:bottom w:val="single" w:sz="4" w:color="CCCCCC"/>
+              <w:right w:val="single" w:sz="4" w:color="CCCCCC"/>
+            </w:tcBorders>
+          </w:tcPr>
+          <w:p>
+            <w:r>
+              <w:rPr>
+                <w:rFonts w:ascii="Arial" w:hAnsi="Arial"/>
+                <w:sz w:val="20"/>
+              </w:rPr>
+              <w:t>Afkryd hvis medarbejderen er fuldlønnet.</w:t>
+            </w:r>
+          </w:p>
+        </w:tc>
+      </w:tr>
+      <w:tr>
+        <w:tc>
+          <w:tcPr>
+            <w:tcW w:type="dxa" w:w="3024"/>
+            <w:tcBorders>
+              <w:top w:val="single" w:sz="4" w:color="CCCCCC"/>
+              <w:left w:val="single" w:sz="4" w:color="CCCCCC"/>
+              <w:bottom w:val="single" w:sz="4" w:color="CCCCCC"/>
+              <w:right w:val="single" w:sz="4" w:color="CCCCCC"/>
+            </w:tcBorders>
+          </w:tcPr>
+          <w:p>
+            <w:r>
+              <w:rPr>
+                <w:rFonts w:ascii="Arial" w:hAnsi="Arial"/>
+                <w:sz w:val="20"/>
+              </w:rPr>
+              <w:t>§56</w:t>
+            </w:r>
+          </w:p>
+        </w:tc>
+        <w:tc>
+          <w:tcPr>
+            <w:tcW w:type="dxa" w:w="3024"/>
+            <w:tcBorders>
+              <w:top w:val="single" w:sz="4" w:color="CCCCCC"/>
+              <w:left w:val="single" w:sz="4" w:color="CCCCCC"/>
+              <w:bottom w:val="single" w:sz="4" w:color="CCCCCC"/>
+              <w:right w:val="single" w:sz="4" w:color="CCCCCC"/>
+            </w:tcBorders>
+          </w:tcPr>
+          <w:p>
+            <w:r>
+              <w:rPr>
+                <w:rFonts w:ascii="Arial" w:hAnsi="Arial"/>
+                <w:sz w:val="20"/>
+              </w:rPr>
+              <w:t>—</w:t>
+            </w:r>
+          </w:p>
+        </w:tc>
+        <w:tc>
+          <w:tcPr>
+            <w:tcW w:type="dxa" w:w="3024"/>
+            <w:tcBorders>
+              <w:top w:val="single" w:sz="4" w:color="CCCCCC"/>
+              <w:left w:val="single" w:sz="4" w:color="CCCCCC"/>
+              <w:bottom w:val="single" w:sz="4" w:color="CCCCCC"/>
+              <w:right w:val="single" w:sz="4" w:color="CCCCCC"/>
+            </w:tcBorders>
+          </w:tcPr>
+          <w:p>
+            <w:r>
+              <w:rPr>
+                <w:rFonts w:ascii="Arial" w:hAnsi="Arial"/>
+                <w:sz w:val="20"/>
+              </w:rPr>
               <w:t>Afkryd hvis medarbejderen har en §56-aftale. Herefter skal start- og slutdato udfyldes (begge påkrævede, rød *) – slutdatoen skal ligge efter startdatoen. Se afsnit 7.6 om §56-advarslen.</w:t>
             </w:r>
           </w:p>
@@ -5369,7 +5664,7 @@
           <w:color w:val="606060"/>
           <w:sz w:val="22"/>
         </w:rPr>
-        <w:t>De tilgængelige aftaletyper administreres i Stamdata-modulet under fanen 'Aftale'. Her kan en administrator ændre teksten på de to oprindelige typer, samt tilføje flere aftaletyper og bestemme om Overenskomsttype skal være påkrævet for hver af dem. Vælges en type der ikke kræver Overenskomsttype, forsvinder den røde stjerne ved feltet, og det kan stå tomt.</w:t>
+        <w:t>De tilgængelige aftaletyper administreres i Stamdata-modulet under fanen 'Aftale'. Her kan en administrator ændre teksten på de to oprindelige typer, samt tilføje flere aftaletyper og bestemme om Overenskomsttype skal være påkrævet for hver af dem. Vælges en type der ikke kræver Overenskomsttype, skjules feltet helt.</w:t>
       </w:r>
     </w:p>
     <w:p>
@@ -5442,7 +5737,7 @@
           <w:rFonts w:ascii="Arial" w:hAnsi="Arial"/>
           <w:sz w:val="22"/>
         </w:rPr>
-        <w:t>Timefordelingen angiver medarbejderens normaltimer pr. ugedag i en 14-dages periode (uge A og uge B, svarende til ulige og lige ISO-uger). Standardværdier er:</w:t>
+        <w:t>Timefordelingen angiver medarbejderens normaltimer pr. ugedag i to kolonner: 'Lige uger' og 'Ulige uger' (ISO-ugenummer). Standardværdier ved oprettelse af en ny medarbejder er:</w:t>
       </w:r>
     </w:p>
     <w:p>
@@ -5496,7 +5791,7 @@
           <w:rFonts w:ascii="Arial" w:hAnsi="Arial"/>
           <w:sz w:val="22"/>
         </w:rPr>
-        <w:t>For hver dag kan du udfylde ENTEN et timeantal ELLER en fra/til-tid – begge felter står altid synlige side om side. Udfylder du fra/til-tid, beregner systemet automatisk timeantallet (sluttid minus starttid – en sluttid tidligere end starttid tolkes som en vagt der går over midnat) og overskriver timeantal-feltet. Et 'Ugentligt timeantal'-felt nederst i tabellen summerer automatisk timerne for hver uge, og opdateres med det samme uanset hvilken af de to indtastningsmåder du bruger.</w:t>
+        <w:t>For hver dag kan du udfylde ENTEN et timeantal ELLER en fra/til-tid – begge felter står altid synlige side om side. Udfylder du fra/til-tid, beregner systemet automatisk timeantallet (sluttid minus starttid – en sluttid tidligere end starttid tolkes som en vagt der går over midnat) og overskriver timeantal-feltet. Et 'Ugentligt timeantal'-felt nederst i tabellen summerer automatisk timerne for hver uge, og opdateres med det samme uanset hvilken af de to indtastningsmåder du bruger. Kun timeantallet gemmes – fra/til-tiderne er en indtastningshjælp og står tomme, næste gang du åbner medarbejderen.</w:t>
       </w:r>
     </w:p>
     <w:p>
@@ -5535,7 +5830,7 @@
           <w:rFonts w:ascii="Arial" w:hAnsi="Arial"/>
           <w:sz w:val="22"/>
         </w:rPr>
-        <w:t>Systemet kontrollerer løbende om medarbejdere har nået 9 måneders anciennitet og en tilsvarende overenskomsttype med højere sats. Hvis det er tilfældet, vises et pop-up-varsel. Varslet er styret af tilladelsen 'Anciennitetsvarsel' i Brugerstyring – som standard er den slået til for Administrator og Lønbogholder og fra for Disponent og Kontor. En administrator kan klikke tilladelsen til eller fra for enhver rolle. Husk at opdatere overenskomsttypen for medarbejderen.</w:t>
+        <w:t>Systemet kontrollerer løbende om medarbejdere har nået 9 måneders anciennitet, og om der findes en overenskomsttype med samme navn efterfulgt af '. 9 mdr anciennitet'. Hvis det er tilfældet, vises et pop-up-varsel. Varslet er styret af tilladelsen 'Anciennitetsvarsel' i Brugerstyring – som standard givet til Lønbogholder. Den kan slås til eller fra for alle roller undtagen Administrator, som altid har alle rettigheder. Husk at opdatere overenskomsttypen for medarbejderen.</w:t>
       </w:r>
     </w:p>
     <w:p>
@@ -5710,7 +6005,7 @@
           <w:rFonts w:ascii="Arial" w:hAnsi="Arial"/>
           <w:sz w:val="22"/>
         </w:rPr>
-        <w:t>Findes der et aktivt tillæg på en medarbejder, vises værdien også som et read-only felt under Overenskomsttype, når du åbner medarbejderen under fanen 'Medarbejdere'. Feltet kan ikke redigeres derfra – kun under fanen 'Tillæg'.</w:t>
+        <w:t>Har du rettigheden 'Administrér medarbejdertillæg', vises medarbejderens aktive tillæg også som et read-only felt under Overenskomsttype, når du åbner medarbejderen under fanen 'Medarbejdere' (tomt, hvis der ikke er noget aktivt tillæg). Feltet kan ikke redigeres derfra – kun under fanen 'Tillæg'.</w:t>
       </w:r>
     </w:p>
     <w:p>
@@ -5737,7 +6032,7 @@
           <w:rFonts w:ascii="Arial" w:hAnsi="Arial"/>
           <w:sz w:val="22"/>
         </w:rPr>
-        <w:t>Nærmer en medarbejders §56-slutdato (jf. §56-feltet i afsnit 7.2) sig, kan systemet advare brugere med tilladelsen '§56-advarsel' i Brugerstyring – som standard slået til for Lønbogholder, fra for Disponent og Kontor. En administrator kan klikke tilladelsen til eller fra for enhver rolle.</w:t>
+        <w:t>Nærmer en medarbejders §56-slutdato (jf. §56-feltet i afsnit 7.2) sig, kan systemet advare brugere med tilladelsen '§56-advarsel' i Brugerstyring – som standard givet til Lønbogholder. Den kan slås til eller fra for alle roller undtagen Administrator, som altid har alle rettigheder.</w:t>
       </w:r>
     </w:p>
     <w:p>
@@ -5881,7 +6176,7 @@
           <w:rFonts w:ascii="Arial" w:hAnsi="Arial"/>
           <w:sz w:val="22"/>
         </w:rPr>
-        <w:t>Systemet vedligeholder automatisk en kalender over danske helligdage. Helligdage fremhæves i aktivitetskalenderen og danner grundlag for fremtidig beregning af helligdagstillæg.</w:t>
+        <w:t>Systemet vedligeholder automatisk en kalender over danske helligdage. Helligdage fremhæves i aktivitetskalenderen og bruges direkte i lønberegningen af søn-/helligdagsbetaling (afsnit 9.5).</w:t>
       </w:r>
     </w:p>
     <w:p>
@@ -5908,7 +6203,7 @@
           <w:rFonts w:ascii="Arial" w:hAnsi="Arial"/>
           <w:sz w:val="22"/>
         </w:rPr>
-        <w:t>Dage der er helligdage fremhæves med mørk grøn baggrund (#056a10) i aktivitetskalenderens kolonneoverskrifter. Halvdagshelligdage (1. maj og Grundlovsdag) vises med et '½ fra 12:00'-badge. Hold musen over overskriften for at se helligdagens navn.</w:t>
+        <w:t>Dage der er helligdage fremhæves med mørk grøn baggrund (#056a10) i aktivitetskalenderens kolonneoverskrifter. Halvdagshelligdage (1. maj og Grundlovsdag) vises med et '½ fra 12:00'-badge. Hold musen over overskriften for at se helligdagens navn. Markeringen vises for alle brugere – kun oprettelse og sletning kræver rettigheder (rettet 2026-09-30, før så kun brugere med Stamdata-rettighed markeringen).</w:t>
       </w:r>
     </w:p>
     <w:p>
@@ -6086,7 +6381,7 @@
                 <w:rFonts w:ascii="Arial" w:hAnsi="Arial"/>
                 <w:sz w:val="20"/>
               </w:rPr>
-              <w:t>Klik '+Tilføj helligdag' for at oprette en særlig fridag med valgfri halvdagstid (fx en lukkedag).</w:t>
+              <w:t>Klik '+Tilføj helligdag' for at oprette en særlig fridag (fx en lukkedag) – enten hel dag eller halv dag med fri fra 12:00.</w:t>
             </w:r>
           </w:p>
         </w:tc>
@@ -6128,7 +6423,7 @@
                 <w:rFonts w:ascii="Arial" w:hAnsi="Arial"/>
                 <w:sz w:val="20"/>
               </w:rPr>
-              <w:t>Klik 'Slet' på en helligdag for at fjerne den fra kalenderen. Auto-genererede og manuelle helligdage kan begge slettes.</w:t>
+              <w:t>Klik 'Slet' på en helligdag for at fjerne den fra kalenderen. OBS: en slettet auto-genereret helligdag inden for de næste 5 år oprettes igen ved næste genstart af serveren.</w:t>
             </w:r>
           </w:p>
         </w:tc>
@@ -6344,7 +6639,7 @@
           <w:rFonts w:ascii="Arial" w:hAnsi="Arial"/>
           <w:sz w:val="22"/>
         </w:rPr>
-        <w:t>Klik 'Prøvekørsel'.</w:t>
+        <w:t>Klik 'Prøvekørsel (Excel)' i toppen for alle medarbejdere – eller '📊 Prøvekørsel' på en medarbejders kort for kun den medarbejder.</w:t>
       </w:r>
     </w:p>
     <w:p>
@@ -6358,7 +6653,19 @@
           <w:rFonts w:ascii="Arial" w:hAnsi="Arial"/>
           <w:sz w:val="22"/>
         </w:rPr>
-        <w:t>Vælg evt. en bestemt medarbejder, eller lad feltet stå tomt for alle.</w:t>
+        <w:t>Klik 'Dan Excel'. Filen downloades til din computer, og pop-up-vinduet lukker automatisk.</w:t>
+      </w:r>
+    </w:p>
+    <w:p>
+      <w:pPr>
+        <w:spacing w:after="120"/>
+      </w:pPr>
+      <w:r>
+        <w:rPr>
+          <w:rFonts w:ascii="Arial" w:hAnsi="Arial"/>
+          <w:sz w:val="22"/>
+        </w:rPr>
+        <w:t>Excel-filen viser alle 14 dage i perioden for hver medarbejder, med bl.a. disse kolonner:</w:t>
       </w:r>
     </w:p>
     <w:p>
@@ -6372,19 +6679,7 @@
           <w:rFonts w:ascii="Arial" w:hAnsi="Arial"/>
           <w:sz w:val="22"/>
         </w:rPr>
-        <w:t>Klik 'Dan Excel'. Filen downloades til din computer, og pop-up-vinduet lukker automatisk.</w:t>
-      </w:r>
-    </w:p>
-    <w:p>
-      <w:pPr>
-        <w:spacing w:after="120"/>
-      </w:pPr>
-      <w:r>
-        <w:rPr>
-          <w:rFonts w:ascii="Arial" w:hAnsi="Arial"/>
-          <w:sz w:val="22"/>
-        </w:rPr>
-        <w:t>Excel-filen viser alle 14 dage i perioden for hver medarbejder, med bl.a. disse kolonner:</w:t>
+        <w:t>Total tid: alle arbejdede timer den dag. Timer vises som fx '7t 30m'.</w:t>
       </w:r>
     </w:p>
     <w:p>
@@ -6398,7 +6693,7 @@
           <w:rFonts w:ascii="Arial" w:hAnsi="Arial"/>
           <w:sz w:val="22"/>
         </w:rPr>
-        <w:t>Total tid: alle arbejdede timer den dag.</w:t>
+        <w:t>Pause i alt (min): summen af medarbejderens pauser den dag, i minutter.</w:t>
       </w:r>
     </w:p>
     <w:p>
@@ -6412,7 +6707,7 @@
           <w:rFonts w:ascii="Arial" w:hAnsi="Arial"/>
           <w:sz w:val="22"/>
         </w:rPr>
-        <w:t>Pause i alt (min): summen af medarbejderens pauser den dag, i minutter.</w:t>
+        <w:t>Normal tid, Tillæg 05-06, Tillæg OT1-3 og Øvrigt OT: fordeling af Total tid – Normal tid er de timer der IKKE udløser noget tillæg.</w:t>
       </w:r>
     </w:p>
     <w:p>
@@ -6426,7 +6721,7 @@
           <w:rFonts w:ascii="Arial" w:hAnsi="Arial"/>
           <w:sz w:val="22"/>
         </w:rPr>
-        <w:t>Normal tid, Tillæg 05-06, Tillæg OT1-3 og Øvrigt OT: fordeling af Total tid – Normal tid er de timer der IKKE udløser noget tillæg.</w:t>
+        <w:t>Fraværsdage (Ferie, Fri, Afspadsering, Skole/kursus): vises med fraværstype i Normal tid-kolonnen.</w:t>
       </w:r>
     </w:p>
     <w:p>
@@ -6440,7 +6735,7 @@
           <w:rFonts w:ascii="Arial" w:hAnsi="Arial"/>
           <w:sz w:val="22"/>
         </w:rPr>
-        <w:t>Fraværsdage (Ferie, Fri, Afspadsering, Skole/kursus): vises med fraværstype i Normal tid-kolonnen.</w:t>
+        <w:t>Dage uden registrering: vises med 0 på alle kolonner.</w:t>
       </w:r>
     </w:p>
     <w:p>
@@ -6454,7 +6749,7 @@
           <w:rFonts w:ascii="Arial" w:hAnsi="Arial"/>
           <w:sz w:val="22"/>
         </w:rPr>
-        <w:t>Dage uden registrering: vises med 0 på alle kolonner.</w:t>
+        <w:t>Medarbejdere med springertillæg i perioden: får ' (springer)' tilføjet efter navnet.</w:t>
       </w:r>
     </w:p>
     <w:p>
@@ -6468,7 +6763,57 @@
           <w:rFonts w:ascii="Arial" w:hAnsi="Arial"/>
           <w:sz w:val="22"/>
         </w:rPr>
-        <w:t>Medarbejdere med springertillæg i perioden: får ' (springer)' tilføjet efter navnet.</w:t>
+        <w:t>Første linje pr. medarbejder er markeret med grøn baggrund. Tom linje adskiller medarbejdere.</w:t>
+      </w:r>
+    </w:p>
+    <w:p>
+      <w:pPr>
+        <w:spacing w:before="80" w:after="160"/>
+        <w:ind w:left="283" w:right="283"/>
+      </w:pPr>
+      <w:r>
+        <w:rPr>
+          <w:rFonts w:ascii="Arial" w:hAnsi="Arial"/>
+          <w:b/>
+          <w:color w:val="2E6DB8"/>
+          <w:sz w:val="22"/>
+        </w:rPr>
+        <w:t xml:space="preserve">GODT AT VIDE: </w:t>
+      </w:r>
+      <w:r>
+        <w:rPr>
+          <w:rFonts w:ascii="Arial" w:hAnsi="Arial"/>
+          <w:color w:val="606060"/>
+          <w:sz w:val="22"/>
+        </w:rPr>
+        <w:t>Kolonnerne er gjort så smalle som muligt, og lange overskrifter ombrydes over flere linjer, så hele tabellen kan ses uden at skulle scrolle vandret.</w:t>
+      </w:r>
+    </w:p>
+    <w:p>
+      <w:pPr>
+        <w:pStyle w:val="Heading2"/>
+        <w:spacing w:before="200" w:after="120"/>
+      </w:pPr>
+      <w:r>
+        <w:rPr>
+          <w:rFonts w:ascii="Arial" w:hAnsi="Arial"/>
+          <w:b/>
+          <w:color w:val="2E6DB8"/>
+          <w:sz w:val="26"/>
+        </w:rPr>
+        <w:t>9.2  PDF-timesedler</w:t>
+      </w:r>
+    </w:p>
+    <w:p>
+      <w:pPr>
+        <w:spacing w:after="120"/>
+      </w:pPr>
+      <w:r>
+        <w:rPr>
+          <w:rFonts w:ascii="Arial" w:hAnsi="Arial"/>
+          <w:sz w:val="22"/>
+        </w:rPr>
+        <w:t>Genererer individuelle timesedler til alle medarbejdere som PDF-filer og downloader dem til din computer – én PDF direkte, hvis kun én medarbejder har data i perioden, ellers en samlet ZIP-fil.</w:t>
       </w:r>
     </w:p>
     <w:p>
@@ -6482,7 +6827,35 @@
           <w:rFonts w:ascii="Arial" w:hAnsi="Arial"/>
           <w:sz w:val="22"/>
         </w:rPr>
-        <w:t>Første linje pr. medarbejder er markeret med grøn baggrund. Tom linje adskiller medarbejdere.</w:t>
+        <w:t>Klik 'PDF-timesedler'.</w:t>
+      </w:r>
+    </w:p>
+    <w:p>
+      <w:pPr>
+        <w:pStyle w:val="ListBullet"/>
+        <w:spacing w:after="40"/>
+        <w:ind w:left="454"/>
+      </w:pPr>
+      <w:r>
+        <w:rPr>
+          <w:rFonts w:ascii="Arial" w:hAnsi="Arial"/>
+          <w:sz w:val="22"/>
+        </w:rPr>
+        <w:t>Vælg fra/til-dato og evt. en bestemt medarbejder.</w:t>
+      </w:r>
+    </w:p>
+    <w:p>
+      <w:pPr>
+        <w:pStyle w:val="ListBullet"/>
+        <w:spacing w:after="40"/>
+        <w:ind w:left="454"/>
+      </w:pPr>
+      <w:r>
+        <w:rPr>
+          <w:rFonts w:ascii="Arial" w:hAnsi="Arial"/>
+          <w:sz w:val="22"/>
+        </w:rPr>
+        <w:t>Klik 'Dan PDF'er'. Filen(erne) downloades til din computer. Enkelte timesedler kan også hentes med '⬇ PDF' på medarbejderens kort.</w:t>
       </w:r>
     </w:p>
     <w:p>
@@ -6505,7 +6878,7 @@
           <w:color w:val="606060"/>
           <w:sz w:val="22"/>
         </w:rPr>
-        <w:t>Kolonnerne er gjort så smalle som muligt, og lange overskrifter ombrydes over flere linjer, så hele tabellen kan ses uden at skulle scrolle vandret.</w:t>
+        <w:t>Ud over download kan timesedler sendes direkte pr. mail til medarbejderens registrerede mailadresse – enten enkeltvis fra den relevante medarbejders linje i lønkørsel-visningen, eller samlet for alle med knappen 'Send timesedler' i PDF-modalen. Medarbejdere uden en registreret mailadresse springes automatisk over, og fejl ved selve afsendelsen (fx forkert mailopsætning) vises som en generel fejlbesked uden tekniske detaljer.</w:t>
       </w:r>
     </w:p>
     <w:p>
@@ -6520,7 +6893,7 @@
           <w:color w:val="2E6DB8"/>
           <w:sz w:val="26"/>
         </w:rPr>
-        <w:t>9.2  Dan PDF'er</w:t>
+        <w:t>9.3  Kør løn (Danløn CSV)</w:t>
       </w:r>
     </w:p>
     <w:p>
@@ -6532,7 +6905,7 @@
           <w:rFonts w:ascii="Arial" w:hAnsi="Arial"/>
           <w:sz w:val="22"/>
         </w:rPr>
-        <w:t>Genererer individuelle timesedler til alle medarbejdere som PDF-filer og downloader dem til din computer – én PDF direkte, hvis kun én medarbejder har data i perioden, ellers en samlet ZIP-fil.</w:t>
+        <w:t>Eksporterer den endelige lønfil til Danløn. Filen er i CSV-format og kan importeres direkte i Danløn.</w:t>
       </w:r>
     </w:p>
     <w:p>
@@ -6546,7 +6919,7 @@
           <w:rFonts w:ascii="Arial" w:hAnsi="Arial"/>
           <w:sz w:val="22"/>
         </w:rPr>
-        <w:t>Klik 'Dan PDF'er'.</w:t>
+        <w:t>Klik 'Kør løn (Danløn CSV)'.</w:t>
       </w:r>
     </w:p>
     <w:p>
@@ -6560,7 +6933,7 @@
           <w:rFonts w:ascii="Arial" w:hAnsi="Arial"/>
           <w:sz w:val="22"/>
         </w:rPr>
-        <w:t>Vælg fra/til-dato og evt. en bestemt medarbejder.</w:t>
+        <w:t>Bekræft at du er klar til at køre endelig løn. Perioden låses.</w:t>
       </w:r>
     </w:p>
     <w:p>
@@ -6574,111 +6947,19 @@
           <w:rFonts w:ascii="Arial" w:hAnsi="Arial"/>
           <w:sz w:val="22"/>
         </w:rPr>
-        <w:t>Klik 'Dan PDF'er'. Filen(erne) downloades til din computer.</w:t>
+        <w:t>CSV-filen downloades til din computer. Filnavnet er (siden 2026-09-22) på formen 'danloen, Lønuge 23-24, 01-06-2026-14-06-2026.csv' – lønuge-numrene og datointervallet for den kørte periode.</w:t>
       </w:r>
     </w:p>
     <w:p>
       <w:pPr>
-        <w:spacing w:before="80" w:after="160"/>
-        <w:ind w:left="283" w:right="283"/>
-      </w:pPr>
-      <w:r>
-        <w:rPr>
-          <w:rFonts w:ascii="Arial" w:hAnsi="Arial"/>
-          <w:b/>
-          <w:color w:val="2E6DB8"/>
+        <w:spacing w:after="120"/>
+      </w:pPr>
+      <w:r>
+        <w:rPr>
+          <w:rFonts w:ascii="Arial" w:hAnsi="Arial"/>
           <w:sz w:val="22"/>
         </w:rPr>
-        <w:t xml:space="preserve">GODT AT VIDE: </w:t>
-      </w:r>
-      <w:r>
-        <w:rPr>
-          <w:rFonts w:ascii="Arial" w:hAnsi="Arial"/>
-          <w:color w:val="606060"/>
-          <w:sz w:val="22"/>
-        </w:rPr>
-        <w:t>Ud over download kan timesedler sendes direkte pr. mail til medarbejderens registrerede mailadresse – enten enkeltvis fra den relevante medarbejders linje i lønkørsel-visningen, eller samlet for alle med knappen 'Send timesedler' i PDF-modalen. Medarbejdere uden en registreret mailadresse springes automatisk over, og fejl ved selve afsendelsen (fx forkert mailopsætning) vises som en generel fejlbesked uden tekniske detaljer.</w:t>
-      </w:r>
-    </w:p>
-    <w:p>
-      <w:pPr>
-        <w:pStyle w:val="Heading2"/>
-        <w:spacing w:before="200" w:after="120"/>
-      </w:pPr>
-      <w:r>
-        <w:rPr>
-          <w:rFonts w:ascii="Arial" w:hAnsi="Arial"/>
-          <w:b/>
-          <w:color w:val="2E6DB8"/>
-          <w:sz w:val="26"/>
-        </w:rPr>
-        <w:t>9.3  Kør løn (Danløn CSV)</w:t>
-      </w:r>
-    </w:p>
-    <w:p>
-      <w:pPr>
-        <w:spacing w:after="120"/>
-      </w:pPr>
-      <w:r>
-        <w:rPr>
-          <w:rFonts w:ascii="Arial" w:hAnsi="Arial"/>
-          <w:sz w:val="22"/>
-        </w:rPr>
-        <w:t>Eksporterer den endelige lønfil til Danløn. Filen er i CSV-format og kan importeres direkte i Danløn.</w:t>
-      </w:r>
-    </w:p>
-    <w:p>
-      <w:pPr>
-        <w:pStyle w:val="ListBullet"/>
-        <w:spacing w:after="40"/>
-        <w:ind w:left="454"/>
-      </w:pPr>
-      <w:r>
-        <w:rPr>
-          <w:rFonts w:ascii="Arial" w:hAnsi="Arial"/>
-          <w:sz w:val="22"/>
-        </w:rPr>
-        <w:t>Klik 'Kør løn'.</w:t>
-      </w:r>
-    </w:p>
-    <w:p>
-      <w:pPr>
-        <w:pStyle w:val="ListBullet"/>
-        <w:spacing w:after="40"/>
-        <w:ind w:left="454"/>
-      </w:pPr>
-      <w:r>
-        <w:rPr>
-          <w:rFonts w:ascii="Arial" w:hAnsi="Arial"/>
-          <w:sz w:val="22"/>
-        </w:rPr>
-        <w:t>Bekræft at du er klar til at køre endelig løn.</w:t>
-      </w:r>
-    </w:p>
-    <w:p>
-      <w:pPr>
-        <w:pStyle w:val="ListBullet"/>
-        <w:spacing w:after="40"/>
-        <w:ind w:left="454"/>
-      </w:pPr>
-      <w:r>
-        <w:rPr>
-          <w:rFonts w:ascii="Arial" w:hAnsi="Arial"/>
-          <w:sz w:val="22"/>
-        </w:rPr>
-        <w:t>CSV-filen downloades til din computer. Filnavnet er (siden 2026-09-22) på formen 'danloen, Lønuge 23-24, 01-06-2026-14-06-2026.csv' – lønuge-numrene og datointervallet for den kørte periode.</w:t>
-      </w:r>
-    </w:p>
-    <w:p>
-      <w:pPr>
-        <w:spacing w:after="120"/>
-      </w:pPr>
-      <w:r>
-        <w:rPr>
-          <w:rFonts w:ascii="Arial" w:hAnsi="Arial"/>
-          <w:sz w:val="22"/>
-        </w:rPr>
-        <w:t>CSV-filen indeholder op til 6 kolonner per lønpost: CVR-nummer, medarbejdernr., lønkode, antal (timer eller forekomster), sats og evt. total. Hvilke kolonner der medtages afhænger af opsætningen i Stamdata → Løntypekoder.</w:t>
+        <w:t>CSV-filen har 6 felter pr. lønpost: CVR-nummer, medarbejdernr., lønkode, antal, sats og total. Tal skrives i hundrededele uden komma (7,50 timer skrives '750'). Sats og total kan være tomme afhængigt af opsætningen i Stamdata → Løntypekoder. Har flere lønarter samme Danløn-kode, lægges de sammen på én linje.</w:t>
       </w:r>
     </w:p>
     <w:p>
@@ -6887,7 +7168,7 @@
                 <w:rFonts w:ascii="Arial" w:hAnsi="Arial"/>
                 <w:sz w:val="20"/>
               </w:rPr>
-              <w:t>Timer: eksporterer timetal med 2 decimaler. Antal: eksporterer antal forekomster som heltal (fx overnatninger).</w:t>
+              <w:t>Timer: antal timer. Antal: antal forekomster (fx overnatninger). Virker kun for løntypekoder du selv har oprettet samt Feriefri.</w:t>
             </w:r>
           </w:p>
         </w:tc>
@@ -6929,7 +7210,7 @@
                 <w:rFonts w:ascii="Arial" w:hAnsi="Arial"/>
                 <w:sz w:val="20"/>
               </w:rPr>
-              <w:t>Timesats, OT-satser, Salt, Overnatning, Dagpenge §56</w:t>
+              <w:t>Timesats, OT-satser, Salt, Overnatning, Dagpenge §56 m.fl.</w:t>
             </w:r>
           </w:p>
         </w:tc>
@@ -6949,7 +7230,7 @@
                 <w:rFonts w:ascii="Arial" w:hAnsi="Arial"/>
                 <w:sz w:val="20"/>
               </w:rPr>
-              <w:t>Bestemmer hvilken sats der bruges til kolonnen Sats og beregning af Total.</w:t>
+              <w:t>Bestemmer satsen for en løntypekode du selv har oprettet. De faste løntyper bruger altid deres egen sats fra beregningen.</w:t>
             </w:r>
           </w:p>
         </w:tc>
@@ -7213,7 +7494,7 @@
                 <w:rFonts w:ascii="Arial" w:hAnsi="Arial"/>
                 <w:sz w:val="20"/>
               </w:rPr>
-              <w:t>Timesats × normaltimer for dagen (fra medarbejderens timefordeling).</w:t>
+              <w:t>Timesats × ALLE arbejdede timer. Tillæggene nedenfor lægges oveni.</w:t>
             </w:r>
           </w:p>
         </w:tc>
@@ -7361,7 +7642,7 @@
                 <w:rFonts w:ascii="Arial" w:hAnsi="Arial"/>
                 <w:sz w:val="20"/>
               </w:rPr>
-              <w:t>Pålæsning</w:t>
+              <w:t>Salttillæg</w:t>
             </w:r>
           </w:p>
         </w:tc>
@@ -7381,7 +7662,7 @@
                 <w:rFonts w:ascii="Arial" w:hAnsi="Arial"/>
                 <w:sz w:val="20"/>
               </w:rPr>
-              <w:t>Tillæg for pålæsningstid (minutter × minutsats).</w:t>
+              <w:t>Tillæg pr. time for kørsel med salt (registreret på aktiviteten). Sats fra Stamdata (Tillæg-fanen).</w:t>
             </w:r>
           </w:p>
         </w:tc>
@@ -7403,7 +7684,7 @@
                 <w:rFonts w:ascii="Arial" w:hAnsi="Arial"/>
                 <w:sz w:val="20"/>
               </w:rPr>
-              <w:t>Aflæsning</w:t>
+              <w:t>Overnatning</w:t>
             </w:r>
           </w:p>
         </w:tc>
@@ -7423,7 +7704,7 @@
                 <w:rFonts w:ascii="Arial" w:hAnsi="Arial"/>
                 <w:sz w:val="20"/>
               </w:rPr>
-              <w:t>Tillæg for aflæsningstid (minutter × minutsats).</w:t>
+              <w:t>Fast sats pr. overnatning (antal forekomster × sats). Sats fra Stamdata (Tillæg-fanen).</w:t>
             </w:r>
           </w:p>
         </w:tc>
@@ -7445,7 +7726,7 @@
                 <w:rFonts w:ascii="Arial" w:hAnsi="Arial"/>
                 <w:sz w:val="20"/>
               </w:rPr>
-              <w:t>Salttillæg</w:t>
+              <w:t>Springertillæg</w:t>
             </w:r>
           </w:p>
         </w:tc>
@@ -7465,90 +7746,6 @@
                 <w:rFonts w:ascii="Arial" w:hAnsi="Arial"/>
                 <w:sz w:val="20"/>
               </w:rPr>
-              <w:t>Tillæg pr. time for kørsel med salt (registreret på aktiviteten). Sats fra Stamdata (Tillæg-fanen).</w:t>
-            </w:r>
-          </w:p>
-        </w:tc>
-      </w:tr>
-      <w:tr>
-        <w:tc>
-          <w:tcPr>
-            <w:tcW w:type="dxa" w:w="4536"/>
-            <w:tcBorders>
-              <w:top w:val="single" w:sz="4" w:color="CCCCCC"/>
-              <w:left w:val="single" w:sz="4" w:color="CCCCCC"/>
-              <w:bottom w:val="single" w:sz="4" w:color="CCCCCC"/>
-              <w:right w:val="single" w:sz="4" w:color="CCCCCC"/>
-            </w:tcBorders>
-          </w:tcPr>
-          <w:p>
-            <w:r>
-              <w:rPr>
-                <w:rFonts w:ascii="Arial" w:hAnsi="Arial"/>
-                <w:sz w:val="20"/>
-              </w:rPr>
-              <w:t>Overnatning</w:t>
-            </w:r>
-          </w:p>
-        </w:tc>
-        <w:tc>
-          <w:tcPr>
-            <w:tcW w:type="dxa" w:w="4536"/>
-            <w:tcBorders>
-              <w:top w:val="single" w:sz="4" w:color="CCCCCC"/>
-              <w:left w:val="single" w:sz="4" w:color="CCCCCC"/>
-              <w:bottom w:val="single" w:sz="4" w:color="CCCCCC"/>
-              <w:right w:val="single" w:sz="4" w:color="CCCCCC"/>
-            </w:tcBorders>
-          </w:tcPr>
-          <w:p>
-            <w:r>
-              <w:rPr>
-                <w:rFonts w:ascii="Arial" w:hAnsi="Arial"/>
-                <w:sz w:val="20"/>
-              </w:rPr>
-              <w:t>Fast sats pr. overnatning (antal forekomster × sats). Sats fra Stamdata (Tillæg-fanen).</w:t>
-            </w:r>
-          </w:p>
-        </w:tc>
-      </w:tr>
-      <w:tr>
-        <w:tc>
-          <w:tcPr>
-            <w:tcW w:type="dxa" w:w="4536"/>
-            <w:tcBorders>
-              <w:top w:val="single" w:sz="4" w:color="CCCCCC"/>
-              <w:left w:val="single" w:sz="4" w:color="CCCCCC"/>
-              <w:bottom w:val="single" w:sz="4" w:color="CCCCCC"/>
-              <w:right w:val="single" w:sz="4" w:color="CCCCCC"/>
-            </w:tcBorders>
-          </w:tcPr>
-          <w:p>
-            <w:r>
-              <w:rPr>
-                <w:rFonts w:ascii="Arial" w:hAnsi="Arial"/>
-                <w:sz w:val="20"/>
-              </w:rPr>
-              <w:t>Springertillæg</w:t>
-            </w:r>
-          </w:p>
-        </w:tc>
-        <w:tc>
-          <w:tcPr>
-            <w:tcW w:type="dxa" w:w="4536"/>
-            <w:tcBorders>
-              <w:top w:val="single" w:sz="4" w:color="CCCCCC"/>
-              <w:left w:val="single" w:sz="4" w:color="CCCCCC"/>
-              <w:bottom w:val="single" w:sz="4" w:color="CCCCCC"/>
-              <w:right w:val="single" w:sz="4" w:color="CCCCCC"/>
-            </w:tcBorders>
-          </w:tcPr>
-          <w:p>
-            <w:r>
-              <w:rPr>
-                <w:rFonts w:ascii="Arial" w:hAnsi="Arial"/>
-                <w:sz w:val="20"/>
-              </w:rPr>
               <w:t>Samme timetal som Normal løn, kun for medarbejdere med springertillæg-fluebenet sat for perioden (afsnit 4.5). Sats fra Stamdata (Tillæg-fanen).</w:t>
             </w:r>
           </w:p>
@@ -7576,7 +7773,53 @@
           <w:color w:val="606060"/>
           <w:sz w:val="22"/>
         </w:rPr>
-        <w:t>Rettet 2026-09-22: 'I alt'-beløbet pr. medarbejder i Lønkørsel-fanen og i PDF-timesedlens LØNOPSUMMERING medregner nu også fraværstyper med et beregnet beløb (Sygdom, §56 syg, Barn 1.sygedag u. løn, Feriefri, Barsel, Skole/kursus – samme typer som i Lønafregningen, afsnit 12.1). Tidligere manglede disse i selve 'I alt'-summen, selvom de altid har talt korrekt med i den eksporterede Danløn CSV. PDF-timesedlens fraværslinjer viser nu desuden sats og beløb i stedet for '–', så beløbet i 'I alt' på timesedlen stemmer overens med det medarbejderen reelt får udbetalt.</w:t>
+        <w:t>Rettet 2026-09-22: 'I alt'-beløbet pr. medarbejder i Lønkørsel-fanen og i PDF-timesedlens LØNOPSUMMERING medregner nu også fraværstyper med et beregnet beløb (Sygdom, §56 syg, Barn 1.sygedag u. løn, Feriefri, Barsel, Skole/kursus). Tidligere manglede disse i selve 'I alt'-summen, selvom de altid har talt korrekt med i den eksporterede Danløn CSV. PDF-timesedlens fraværslinjer viser nu desuden sats og beløb i stedet for '–', så beløbet i 'I alt' på timesedlen stemmer overens med det medarbejderen reelt får udbetalt.</w:t>
+      </w:r>
+    </w:p>
+    <w:p>
+      <w:pPr>
+        <w:spacing w:before="80" w:after="160"/>
+        <w:ind w:left="283" w:right="283"/>
+      </w:pPr>
+      <w:r>
+        <w:rPr>
+          <w:rFonts w:ascii="Arial" w:hAnsi="Arial"/>
+          <w:b/>
+          <w:color w:val="2E6DB8"/>
+          <w:sz w:val="22"/>
+        </w:rPr>
+        <w:t xml:space="preserve">GODT AT VIDE: </w:t>
+      </w:r>
+      <w:r>
+        <w:rPr>
+          <w:rFonts w:ascii="Arial" w:hAnsi="Arial"/>
+          <w:color w:val="606060"/>
+          <w:sz w:val="22"/>
+        </w:rPr>
+        <w:t>Ændret 2026-09-30: 'I alt' i Lønkørsel-fanen regnes nu præcis som totalen i Lønafregning (kapitel 12) – dvs. også med Ferie og Afspadsering. Medarbejderkortet har fået en 'Ferie'-linje, og 'Afspadsering' viser sats og beløb, så linjerne summerer til 'I alt'. PDF-timesedlen er uændret og medregner ikke Ferie; dens 'I alt' kan derfor være feriebeløbet lavere.</w:t>
+      </w:r>
+    </w:p>
+    <w:p>
+      <w:pPr>
+        <w:spacing w:before="80" w:after="160"/>
+        <w:ind w:left="283" w:right="283"/>
+      </w:pPr>
+      <w:r>
+        <w:rPr>
+          <w:rFonts w:ascii="Arial" w:hAnsi="Arial"/>
+          <w:b/>
+          <w:color w:val="2E6DB8"/>
+          <w:sz w:val="22"/>
+        </w:rPr>
+        <w:t xml:space="preserve">BEMÆRK: </w:t>
+      </w:r>
+      <w:r>
+        <w:rPr>
+          <w:rFonts w:ascii="Arial" w:hAnsi="Arial"/>
+          <w:color w:val="606060"/>
+          <w:sz w:val="22"/>
+        </w:rPr>
+        <w:t>Pålæsning og aflæsning (minutter) kan registreres på en aktivitet, men indgår IKKE i lønberegningen.</w:t>
       </w:r>
     </w:p>
     <w:p>
@@ -7773,7 +8016,7 @@
                 <w:rFonts w:ascii="Arial" w:hAnsi="Arial"/>
                 <w:sz w:val="20"/>
               </w:rPr>
-              <w:t>Halve helligdage: fri fra kl. 12:00. Kørsel før 12 tæller normalt, kørsel efter 12 følger særlige regler for disse dage.</w:t>
+              <w:t>Halve helligdage: fri fra kl. 12:00. Kørsel før 12 giver kun almindelig timeløn (kode 1) – ingen tidstillæg. Kørsel efter 12: 1. maj første 3 timer kode 8, resten kode 9; Grundlovsdag alle timer kode 9.</w:t>
             </w:r>
           </w:p>
         </w:tc>
@@ -8020,7 +8263,7 @@
           <w:rFonts w:ascii="Arial" w:hAnsi="Arial"/>
           <w:sz w:val="22"/>
         </w:rPr>
-        <w:t>Eventuelle rettelser er kontrolleret – brug 'Fortryd rettelse' ved fejl.</w:t>
+        <w:t>Eventuelle rettelser er kontrolleret – brug '↩ Fortryd tidsændring' ved fejl.</w:t>
       </w:r>
     </w:p>
     <w:p>
@@ -8083,7 +8326,7 @@
           <w:rFonts w:ascii="Arial" w:hAnsi="Arial"/>
           <w:sz w:val="22"/>
         </w:rPr>
-        <w:t>Klik på '⚙️ Stamdata' i venstre menu (kræver administrator-login).</w:t>
+        <w:t>Klik på '⚙️ Stamdata' i venstre menu (kræver rettigheden 'Stamdata').</w:t>
       </w:r>
     </w:p>
     <w:p>
@@ -8289,7 +8532,7 @@
                 <w:rFonts w:ascii="Arial" w:hAnsi="Arial"/>
                 <w:sz w:val="20"/>
               </w:rPr>
-              <w:t>Sats for salttillæg (pr. time), overnatning (pr. forekomst) og §56.</w:t>
+              <w:t>Sats for salttillæg (pr. time), overnatning og DOB-overnatning (pr. forekomst), springertillæg (pr. time) og dagpenge §56.</w:t>
             </w:r>
           </w:p>
         </w:tc>
@@ -8440,7 +8683,7 @@
                 <w:rFonts w:ascii="Arial" w:hAnsi="Arial"/>
                 <w:sz w:val="20"/>
               </w:rPr>
-              <w:t>Åbn aktiviteten og brug 'Ret starttid/sluttid'. Brug 'Fortryd rettelse' hvis du fortryder.</w:t>
+              <w:t>Åbn aktiviteten, ret tiderne og klik '💾 Gem ændringer'. Brug '↩ Fortryd tidsændring' hvis du fortryder.</w:t>
             </w:r>
           </w:p>
         </w:tc>
@@ -8524,7 +8767,7 @@
                 <w:rFonts w:ascii="Arial" w:hAnsi="Arial"/>
                 <w:sz w:val="20"/>
               </w:rPr>
-              <w:t>Kontrollér medarbejderens førerkortnummer i Stamdata: det skal være de første 14 tegn (landekode + 12 cifre), uden de sidste 2 udskiftnings-/fornyelsescifre. Ret nummeret og importér filen igen.</w:t>
+              <w:t>Kontrollér medarbejderens førerkortnummer (under Medarbejdere): det skal være de første 14 tegn (landekode + 12 cifre), uden de sidste 2 udskiftnings-/fornyelsescifre. Ret nummeret og importér filen igen.</w:t>
             </w:r>
           </w:p>
         </w:tc>
@@ -8566,7 +8809,7 @@
                 <w:rFonts w:ascii="Arial" w:hAnsi="Arial"/>
                 <w:sz w:val="20"/>
               </w:rPr>
-              <w:t>Brug 'Opdel aktivitet' og angiv tidspunktet for opdelingen.</w:t>
+              <w:t>Brug '✂️ Split' og angiv tidspunktet for opdelingen.</w:t>
             </w:r>
           </w:p>
         </w:tc>
@@ -8692,7 +8935,7 @@
                 <w:rFonts w:ascii="Arial" w:hAnsi="Arial"/>
                 <w:sz w:val="20"/>
               </w:rPr>
-              <w:t>Genstart serveren: tryk Ctrl+C i terminalvinduet hvor den kører (eller luk python.exe via Jobliste) og start den igen. Systemet indlæser ny beregningslogik ved opstart – se kapitel 10.2 i Teknisk dokumentation.</w:t>
+              <w:t>Ny beregningslogik indlæses først, når serveren genstarter – i produktion automatisk hver nat kl. 23:00. Haster det, kan serveren genstartes med deploy/restart_server.ps1 – se kapitel 10.2 i Teknisk dokumentation.</w:t>
             </w:r>
           </w:p>
         </w:tc>
@@ -8918,7 +9161,7 @@
                 <w:rFonts w:ascii="Arial" w:hAnsi="Arial"/>
                 <w:sz w:val="20"/>
               </w:rPr>
-              <w:t>Kan redigeres, men ikke deaktiveres – knappen erstattes af teksten '(dig selv)'.</w:t>
+              <w:t>Kan redigeres, men ikke deaktiveres – knappen erstattes af teksten '(dig selv)'. Pas på med at fjerne din egen administrator-rolle: systemet forhindrer det ikke.</w:t>
             </w:r>
           </w:p>
         </w:tc>
@@ -9096,7 +9339,7 @@
                 <w:rFonts w:ascii="Arial" w:hAnsi="Arial"/>
                 <w:sz w:val="20"/>
               </w:rPr>
-              <w:t>Alt: lønkørsel, import, brugerstyring, åbn låst periode, administrér baselines, godkend aktiviteter, se kalender, sæt springertillæg, vagtplan (se + redigér alle linjer)</w:t>
+              <w:t>Alle rettigheder – altid, uanset hvad der er afkrydset</w:t>
             </w:r>
           </w:p>
         </w:tc>
@@ -9158,7 +9401,7 @@
                 <w:rFonts w:ascii="Arial" w:hAnsi="Arial"/>
                 <w:sz w:val="20"/>
               </w:rPr>
-              <w:t>Lønkørsel, fraværsoversigt, import, se/tilføj medarbejdere, se/tilføj vogne, anciennitetsvarsel, godkend aktiviteter, se kalender, administrér medarbejdertillæg, sæt springertillæg, vagtplan (se + redigér alle linjer)</w:t>
+              <w:t>Lønkørsel, fraværsoversigt, import, anciennitetsvarsel, §56-advarsel, godkend aktiviteter, redigér aktiviteter, se kalender, auto-godkend ved oprettelse, administrér medarbejdertillæg, lønafregning (se + eksport), sæt springertillæg, vagtplan (se + redigér alle linjer)</w:t>
             </w:r>
           </w:p>
         </w:tc>
@@ -9220,7 +9463,7 @@
                 <w:rFonts w:ascii="Arial" w:hAnsi="Arial"/>
                 <w:sz w:val="20"/>
               </w:rPr>
-              <w:t>Se medarbejdere, se vogne, godkend aktiviteter, se kalender, sæt springertillæg, vagtplan (se + redigér alle linjer)</w:t>
+              <w:t>Godkend aktiviteter, redigér aktiviteter, se kalender, sæt springertillæg, vagtplan (se + redigér alle linjer)</w:t>
             </w:r>
           </w:p>
         </w:tc>
@@ -9262,7 +9505,7 @@
                 <w:rFonts w:ascii="Arial" w:hAnsi="Arial"/>
                 <w:sz w:val="20"/>
               </w:rPr>
-              <w:t>Almindelig rolle – kan redigeres/slettes</w:t>
+              <w:t>Oprettet manuelt – ikke en standardrolle</w:t>
             </w:r>
           </w:p>
         </w:tc>
@@ -9282,7 +9525,7 @@
                 <w:rFonts w:ascii="Arial" w:hAnsi="Arial"/>
                 <w:sz w:val="20"/>
               </w:rPr>
-              <w:t>Se vagtplan, redigér egen linje i vagtplan</w:t>
+              <w:t>Eksempel: se vagtplan og redigér egen linje i vagtplan</w:t>
             </w:r>
           </w:p>
         </w:tc>
@@ -9310,6 +9553,29 @@
           <w:sz w:val="22"/>
         </w:rPr>
         <w:t>'Administrér baselines' er ikke en selvstændig, tildelbar rettighed som de øvrige i rettighedsoversigten (afsnit 11.3) – kun Administrator-rollen har adgang til baseline-genopbygning (POST /api/auto-approval/rebuild-baselines), fordi systemroller altid har fuld adgang. Den kan IKKE tildeles en anden rolle via afkrydsningsboksene i Roller-fanen. 'Slå auto-godkendelse til/fra' (manage_auto_approval) er derimod en almindelig, tildelbar rettighed – se afsnit 11.3.</w:t>
+      </w:r>
+    </w:p>
+    <w:p>
+      <w:pPr>
+        <w:spacing w:before="80" w:after="160"/>
+        <w:ind w:left="283" w:right="283"/>
+      </w:pPr>
+      <w:r>
+        <w:rPr>
+          <w:rFonts w:ascii="Arial" w:hAnsi="Arial"/>
+          <w:b/>
+          <w:color w:val="2E6DB8"/>
+          <w:sz w:val="22"/>
+        </w:rPr>
+        <w:t xml:space="preserve">VIGTIGT: </w:t>
+      </w:r>
+      <w:r>
+        <w:rPr>
+          <w:rFonts w:ascii="Arial" w:hAnsi="Arial"/>
+          <w:color w:val="606060"/>
+          <w:sz w:val="22"/>
+        </w:rPr>
+        <w:t>Tabellen viser de typiske rettigheder, men den faktiske opsætning er den, der er sat i Roller-fanen. Nye rettigheder tildeles eksisterende roller automatisk ÉN gang, når de indføres (fx fik alle roller 'Redigér aktiviteter' 2026-09-30). Fjerner du en rettighed fra en rolle, bliver den væk – før 2026-09-30 kom visse rettigheder tilbage ved hver genstart af serveren (bl.a. Godkend aktiviteter, Se aktivitetskalender, Se/Redigér alle linjer i vagtplan og Sæt springertillæg). Gennemgå derfor rollerne én gang og fjern det, den enkelte rolle ikke skal have.</w:t>
       </w:r>
     </w:p>
     <w:p>
@@ -9793,7 +10059,7 @@
                 <w:rFonts w:ascii="Arial" w:hAnsi="Arial"/>
                 <w:sz w:val="20"/>
               </w:rPr>
-              <w:t>Menupunktet '⚙️ Stamdata' – alle ti faner (se kapitel 7). Auto-godkendelse-fanen kræver desuden 'manage_auto_approval'.</w:t>
+              <w:t>Menupunktet '⚙️ Stamdata' – alle ti faner. Helligdage kræver 'Administrér helligdage', Auto-godkendelse-fanen desuden 'manage_auto_approval'.</w:t>
             </w:r>
           </w:p>
         </w:tc>
@@ -9855,7 +10121,7 @@
                 <w:rFonts w:ascii="Arial" w:hAnsi="Arial"/>
                 <w:sz w:val="20"/>
               </w:rPr>
-              <w:t>Menupunktet 'Medarbejdere' (læse-adgang).</w:t>
+              <w:t>Menupunktet 'Medarbejdere' (læse-adgang) og medarbejdernes kontakt-, løn- og førerkortoplysninger. Uden den ser brugeren stadig navne i fx Aktiviteter og Vagtplan, men ikke adresse, e-mail, telefon, førerkortnummer, timesats og CVR.</w:t>
             </w:r>
           </w:p>
         </w:tc>
@@ -10351,7 +10617,7 @@
                 <w:rFonts w:ascii="Arial" w:hAnsi="Arial"/>
                 <w:sz w:val="20"/>
               </w:rPr>
-              <w:t>Godkend/deaktiver/ret/opdel aktiviteter i aktivitetstabellen.</w:t>
+              <w:t>Godkend, deaktiver, slet og genåbn aktiviteter, samt knappen 'Autogodkend aktiviteter'.</w:t>
             </w:r>
           </w:p>
         </w:tc>
@@ -10373,7 +10639,7 @@
                 <w:rFonts w:ascii="Arial" w:hAnsi="Arial"/>
                 <w:sz w:val="20"/>
               </w:rPr>
-              <w:t>auto_approve_manual_activities</w:t>
+              <w:t>edit_activities</w:t>
             </w:r>
           </w:p>
         </w:tc>
@@ -10393,7 +10659,7 @@
                 <w:rFonts w:ascii="Arial" w:hAnsi="Arial"/>
                 <w:sz w:val="20"/>
               </w:rPr>
-              <w:t>Auto-godkend ved oprettelse</w:t>
+              <w:t>Redigér aktiviteter</w:t>
             </w:r>
           </w:p>
         </w:tc>
@@ -10413,7 +10679,7 @@
                 <w:rFonts w:ascii="Arial" w:hAnsi="Arial"/>
                 <w:sz w:val="20"/>
               </w:rPr>
-              <w:t>Manuelt oprettede aktiviteter godkendes automatisk ved oprettelse, uden separat godkendelsestrin.</w:t>
+              <w:t>Opret aktiviteter/fravær ('+ Tilføj aktivitet', klik i tom celle) og ret dem: tider, pauser, vognnummer, km, split, 'Ret til andet arbejde', fraværsperiode (ny 2026-09-30, givet til alle roller ved indførelsen).</w:t>
             </w:r>
           </w:p>
         </w:tc>
@@ -10435,7 +10701,7 @@
                 <w:rFonts w:ascii="Arial" w:hAnsi="Arial"/>
                 <w:sz w:val="20"/>
               </w:rPr>
-              <w:t>manage_auto_approval</w:t>
+              <w:t>auto_approve_manual_activities</w:t>
             </w:r>
           </w:p>
         </w:tc>
@@ -10455,7 +10721,7 @@
                 <w:rFonts w:ascii="Arial" w:hAnsi="Arial"/>
                 <w:sz w:val="20"/>
               </w:rPr>
-              <w:t>Slå auto-godkendelse til/fra</w:t>
+              <w:t>Auto-godkend ved oprettelse</w:t>
             </w:r>
           </w:p>
         </w:tc>
@@ -10475,7 +10741,7 @@
                 <w:rFonts w:ascii="Arial" w:hAnsi="Arial"/>
                 <w:sz w:val="20"/>
               </w:rPr>
-              <w:t>Slå den statistiske baseline-auto-godkendelse til/fra globalt, og genopbyg baselines.</w:t>
+              <w:t>Manuelt oprettede aktiviteter godkendes automatisk ved oprettelse, uden separat godkendelsestrin.</w:t>
             </w:r>
           </w:p>
         </w:tc>
@@ -10497,7 +10763,7 @@
                 <w:rFonts w:ascii="Arial" w:hAnsi="Arial"/>
                 <w:sz w:val="20"/>
               </w:rPr>
-              <w:t>view_calendar</w:t>
+              <w:t>manage_auto_approval</w:t>
             </w:r>
           </w:p>
         </w:tc>
@@ -10517,7 +10783,7 @@
                 <w:rFonts w:ascii="Arial" w:hAnsi="Arial"/>
                 <w:sz w:val="20"/>
               </w:rPr>
-              <w:t>Se aktivitetskalender</w:t>
+              <w:t>Slå auto-godkendelse til/fra</w:t>
             </w:r>
           </w:p>
         </w:tc>
@@ -10537,7 +10803,7 @@
                 <w:rFonts w:ascii="Arial" w:hAnsi="Arial"/>
                 <w:sz w:val="20"/>
               </w:rPr>
-              <w:t>Se aktivitetstabellen (kalendervisningen på forsiden).</w:t>
+              <w:t>Slå den statistiske baseline-auto-godkendelse til/fra globalt (genopbygning af baselines kræver 'Administrér baselines', som kun Administrator har).</w:t>
             </w:r>
           </w:p>
         </w:tc>
@@ -10559,7 +10825,7 @@
                 <w:rFonts w:ascii="Arial" w:hAnsi="Arial"/>
                 <w:sz w:val="20"/>
               </w:rPr>
-              <w:t>toggle_springer</w:t>
+              <w:t>view_calendar</w:t>
             </w:r>
           </w:p>
         </w:tc>
@@ -10579,7 +10845,7 @@
                 <w:rFonts w:ascii="Arial" w:hAnsi="Arial"/>
                 <w:sz w:val="20"/>
               </w:rPr>
-              <w:t>Sæt springertillæg</w:t>
+              <w:t>Se aktivitetskalender</w:t>
             </w:r>
           </w:p>
         </w:tc>
@@ -10599,7 +10865,7 @@
                 <w:rFonts w:ascii="Arial" w:hAnsi="Arial"/>
                 <w:sz w:val="20"/>
               </w:rPr>
-              <w:t>Afkryds springertillæg-fluebenet i aktivitetsoversigten.</w:t>
+              <w:t>Menupunktet 'Aktiviteter' – se aktivitetstabellen.</w:t>
             </w:r>
           </w:p>
         </w:tc>
@@ -10621,7 +10887,7 @@
                 <w:rFonts w:ascii="Arial" w:hAnsi="Arial"/>
                 <w:sz w:val="20"/>
               </w:rPr>
-              <w:t>vagtplan_view</w:t>
+              <w:t>toggle_springer</w:t>
             </w:r>
           </w:p>
         </w:tc>
@@ -10641,7 +10907,7 @@
                 <w:rFonts w:ascii="Arial" w:hAnsi="Arial"/>
                 <w:sz w:val="20"/>
               </w:rPr>
-              <w:t>Se vagtplan</w:t>
+              <w:t>Sæt springertillæg</w:t>
             </w:r>
           </w:p>
         </w:tc>
@@ -10661,7 +10927,7 @@
                 <w:rFonts w:ascii="Arial" w:hAnsi="Arial"/>
                 <w:sz w:val="20"/>
               </w:rPr>
-              <w:t>Menupunktet 'Vagtplan' (læse-adgang).</w:t>
+              <w:t>Afkryds springertillæg-fluebenet i aktivitetsoversigten.</w:t>
             </w:r>
           </w:p>
         </w:tc>
@@ -10683,7 +10949,7 @@
                 <w:rFonts w:ascii="Arial" w:hAnsi="Arial"/>
                 <w:sz w:val="20"/>
               </w:rPr>
-              <w:t>vagtplan_edit_own</w:t>
+              <w:t>vagtplan_view</w:t>
             </w:r>
           </w:p>
         </w:tc>
@@ -10703,7 +10969,7 @@
                 <w:rFonts w:ascii="Arial" w:hAnsi="Arial"/>
                 <w:sz w:val="20"/>
               </w:rPr>
-              <w:t>Redigér egen linje i vagtplan</w:t>
+              <w:t>Se vagtplan</w:t>
             </w:r>
           </w:p>
         </w:tc>
@@ -10723,7 +10989,7 @@
                 <w:rFonts w:ascii="Arial" w:hAnsi="Arial"/>
                 <w:sz w:val="20"/>
               </w:rPr>
-              <w:t>Ret kun sin egen række i Vagtplan (matches på initialer).</w:t>
+              <w:t>Menupunktet 'Vagtplan' (læse-adgang).</w:t>
             </w:r>
           </w:p>
         </w:tc>
@@ -10745,7 +11011,7 @@
                 <w:rFonts w:ascii="Arial" w:hAnsi="Arial"/>
                 <w:sz w:val="20"/>
               </w:rPr>
-              <w:t>vagtplan_edit_all</w:t>
+              <w:t>vagtplan_edit_own</w:t>
             </w:r>
           </w:p>
         </w:tc>
@@ -10765,7 +11031,7 @@
                 <w:rFonts w:ascii="Arial" w:hAnsi="Arial"/>
                 <w:sz w:val="20"/>
               </w:rPr>
-              <w:t>Redigér alle linjer i vagtplan</w:t>
+              <w:t>Redigér egen linje i vagtplan</w:t>
             </w:r>
           </w:p>
         </w:tc>
@@ -10785,7 +11051,7 @@
                 <w:rFonts w:ascii="Arial" w:hAnsi="Arial"/>
                 <w:sz w:val="20"/>
               </w:rPr>
-              <w:t>Ret alle medarbejderes rækker i Vagtplan.</w:t>
+              <w:t>Ret kun sin egen række i Vagtplan (matches på initialer).</w:t>
             </w:r>
           </w:p>
         </w:tc>
@@ -10807,7 +11073,7 @@
                 <w:rFonts w:ascii="Arial" w:hAnsi="Arial"/>
                 <w:sz w:val="20"/>
               </w:rPr>
-              <w:t>payroll_settlement_view</w:t>
+              <w:t>vagtplan_edit_all</w:t>
             </w:r>
           </w:p>
         </w:tc>
@@ -10827,7 +11093,7 @@
                 <w:rFonts w:ascii="Arial" w:hAnsi="Arial"/>
                 <w:sz w:val="20"/>
               </w:rPr>
-              <w:t>Lønafregning (se)</w:t>
+              <w:t>Redigér alle linjer i vagtplan</w:t>
             </w:r>
           </w:p>
         </w:tc>
@@ -10847,7 +11113,7 @@
                 <w:rFonts w:ascii="Arial" w:hAnsi="Arial"/>
                 <w:sz w:val="20"/>
               </w:rPr>
-              <w:t>Menupunktet 'Lønafregning': periodetotaler og pr.-medarbejder oversigt (se kapitel 12).</w:t>
+              <w:t>Ret alle medarbejderes rækker i Vagtplan.</w:t>
             </w:r>
           </w:p>
         </w:tc>
@@ -10869,7 +11135,7 @@
                 <w:rFonts w:ascii="Arial" w:hAnsi="Arial"/>
                 <w:sz w:val="20"/>
               </w:rPr>
-              <w:t>payroll_settlement_export</w:t>
+              <w:t>payroll_settlement_view</w:t>
             </w:r>
           </w:p>
         </w:tc>
@@ -10889,7 +11155,7 @@
                 <w:rFonts w:ascii="Arial" w:hAnsi="Arial"/>
                 <w:sz w:val="20"/>
               </w:rPr>
-              <w:t>Lønafregning (eksport)</w:t>
+              <w:t>Lønafregning (se)</w:t>
             </w:r>
           </w:p>
         </w:tc>
@@ -10909,7 +11175,7 @@
                 <w:rFonts w:ascii="Arial" w:hAnsi="Arial"/>
                 <w:sz w:val="20"/>
               </w:rPr>
-              <w:t>Eksportér Lønafregning som CSV. Kræver låst periode, medmindre brugeren er administrator.</w:t>
+              <w:t>Menupunktet 'Lønafregning': periodetotaler og pr.-medarbejder oversigt (se kapitel 12).</w:t>
             </w:r>
           </w:p>
         </w:tc>
@@ -10931,7 +11197,7 @@
                 <w:rFonts w:ascii="Arial" w:hAnsi="Arial"/>
                 <w:sz w:val="20"/>
               </w:rPr>
-              <w:t>dagsplan_view</w:t>
+              <w:t>payroll_settlement_export</w:t>
             </w:r>
           </w:p>
         </w:tc>
@@ -10951,7 +11217,7 @@
                 <w:rFonts w:ascii="Arial" w:hAnsi="Arial"/>
                 <w:sz w:val="20"/>
               </w:rPr>
-              <w:t>Se dagsplan</w:t>
+              <w:t>Lønafregning (eksport)</w:t>
             </w:r>
           </w:p>
         </w:tc>
@@ -10971,7 +11237,7 @@
                 <w:rFonts w:ascii="Arial" w:hAnsi="Arial"/>
                 <w:sz w:val="20"/>
               </w:rPr>
-              <w:t>Menupunktet 'Dagsplan' (læse-adgang, se kapitel 13).</w:t>
+              <w:t>Eksportér Lønafregning som CSV. Kræver låst periode, medmindre brugeren er administrator.</w:t>
             </w:r>
           </w:p>
         </w:tc>
@@ -10993,7 +11259,7 @@
                 <w:rFonts w:ascii="Arial" w:hAnsi="Arial"/>
                 <w:sz w:val="20"/>
               </w:rPr>
-              <w:t>dagsplan_edit</w:t>
+              <w:t>dagsplan_view</w:t>
             </w:r>
           </w:p>
         </w:tc>
@@ -11013,7 +11279,7 @@
                 <w:rFonts w:ascii="Arial" w:hAnsi="Arial"/>
                 <w:sz w:val="20"/>
               </w:rPr>
-              <w:t>Redigér dagsplan</w:t>
+              <w:t>Se dagsplan</w:t>
             </w:r>
           </w:p>
         </w:tc>
@@ -11033,7 +11299,69 @@
                 <w:rFonts w:ascii="Arial" w:hAnsi="Arial"/>
                 <w:sz w:val="20"/>
               </w:rPr>
-              <w:t>Redigér tildelinger og 'informeret'-afkrydsning, meld/fjern materielt fravær.</w:t>
+              <w:t>Menupunktet 'Dagsplan' (læse-adgang, se kapitel 13).</w:t>
+            </w:r>
+          </w:p>
+        </w:tc>
+      </w:tr>
+      <w:tr>
+        <w:tc>
+          <w:tcPr>
+            <w:tcW w:type="dxa" w:w="3024"/>
+            <w:tcBorders>
+              <w:top w:val="single" w:sz="4" w:color="CCCCCC"/>
+              <w:left w:val="single" w:sz="4" w:color="CCCCCC"/>
+              <w:bottom w:val="single" w:sz="4" w:color="CCCCCC"/>
+              <w:right w:val="single" w:sz="4" w:color="CCCCCC"/>
+            </w:tcBorders>
+          </w:tcPr>
+          <w:p>
+            <w:r>
+              <w:rPr>
+                <w:rFonts w:ascii="Arial" w:hAnsi="Arial"/>
+                <w:sz w:val="20"/>
+              </w:rPr>
+              <w:t>dagsplan_edit</w:t>
+            </w:r>
+          </w:p>
+        </w:tc>
+        <w:tc>
+          <w:tcPr>
+            <w:tcW w:type="dxa" w:w="3024"/>
+            <w:tcBorders>
+              <w:top w:val="single" w:sz="4" w:color="CCCCCC"/>
+              <w:left w:val="single" w:sz="4" w:color="CCCCCC"/>
+              <w:bottom w:val="single" w:sz="4" w:color="CCCCCC"/>
+              <w:right w:val="single" w:sz="4" w:color="CCCCCC"/>
+            </w:tcBorders>
+          </w:tcPr>
+          <w:p>
+            <w:r>
+              <w:rPr>
+                <w:rFonts w:ascii="Arial" w:hAnsi="Arial"/>
+                <w:sz w:val="20"/>
+              </w:rPr>
+              <w:t>Redigere dagsplan</w:t>
+            </w:r>
+          </w:p>
+        </w:tc>
+        <w:tc>
+          <w:tcPr>
+            <w:tcW w:type="dxa" w:w="3024"/>
+            <w:tcBorders>
+              <w:top w:val="single" w:sz="4" w:color="CCCCCC"/>
+              <w:left w:val="single" w:sz="4" w:color="CCCCCC"/>
+              <w:bottom w:val="single" w:sz="4" w:color="CCCCCC"/>
+              <w:right w:val="single" w:sz="4" w:color="CCCCCC"/>
+            </w:tcBorders>
+          </w:tcPr>
+          <w:p>
+            <w:r>
+              <w:rPr>
+                <w:rFonts w:ascii="Arial" w:hAnsi="Arial"/>
+                <w:sz w:val="20"/>
+              </w:rPr>
+              <w:t>Redigér tildelinger og 'informeret'-afkrydsning, meld/fjern materielt fravær. Tildeles ikke automatisk nogen rolle.</w:t>
             </w:r>
           </w:p>
         </w:tc>
@@ -11052,6 +11380,29 @@
           <w:color w:val="2E6DB8"/>
           <w:sz w:val="22"/>
         </w:rPr>
+        <w:t xml:space="preserve">VIGTIGT: </w:t>
+      </w:r>
+      <w:r>
+        <w:rPr>
+          <w:rFonts w:ascii="Arial" w:hAnsi="Arial"/>
+          <w:color w:val="606060"/>
+          <w:sz w:val="22"/>
+        </w:rPr>
+        <w:t>Alle rettigheder håndhæves af serveren, ikke kun ved at skjule knapper og menupunkter (2026-09-30). En bruger uden en rettighed kan derfor heller ikke udføre handlingen ad omveje – serveren svarer 'Ingen adgang'.</w:t>
+      </w:r>
+    </w:p>
+    <w:p>
+      <w:pPr>
+        <w:spacing w:before="80" w:after="160"/>
+        <w:ind w:left="283" w:right="283"/>
+      </w:pPr>
+      <w:r>
+        <w:rPr>
+          <w:rFonts w:ascii="Arial" w:hAnsi="Arial"/>
+          <w:b/>
+          <w:color w:val="2E6DB8"/>
+          <w:sz w:val="22"/>
+        </w:rPr>
         <w:t xml:space="preserve">TEKNISK NOTE: </w:t>
       </w:r>
       <w:r>
@@ -11087,7 +11438,7 @@
           <w:rFonts w:ascii="Arial" w:hAnsi="Arial"/>
           <w:sz w:val="22"/>
         </w:rPr>
-        <w:t>Viser de seneste 500 hændelser i systemet, nyeste øverst: oprettelse/redigering af brugere og roller, rolleskift, samt Stamdata-ændringer (opret/redigér/slet). Hver linje viser tidspunkt, hvilken bruger der udførte handlingen, selve handlingen og en kort detaljetekst. Søgefeltet filtrerer på tværs af bruger, handling og detaljer; '⟲ Opdater' genindlæser listen.</w:t>
+        <w:t>Viser de seneste 500 hændelser i systemet, nyeste øverst: login (også SSO), brugere og roller, Stamdata-ændringer, godkend/deaktiver/slet/split/genåbn/ret af aktiviteter, auto-godkendelse, .ddd-import, lønkørsel, genåbning af periode, Lønafregning-eksport, springertillæg, medarbejdertillæg, vagtplan-kommentarer og dagsplan-tildelinger. Oprettelse og redigering af medarbejdere og vogne logges IKKE. Hver linje viser tidspunkt, hvilken bruger der udførte handlingen, selve handlingen og en kort detaljetekst. Søgefeltet filtrerer på tværs af bruger, handling og detaljer; '⟲ Opdater' genindlæser listen.</w:t>
       </w:r>
     </w:p>
     <w:p>
@@ -11408,7 +11759,7 @@
                 <w:rFonts w:ascii="Arial" w:hAnsi="Arial"/>
                 <w:sz w:val="20"/>
               </w:rPr>
-              <w:t>Aktivitetens vognnummer – på en fraværsdag vises i stedet fraværstypens navn (fx 'Sygdom'), selvom aktiviteten har et udfyldt vognnummer-felt.</w:t>
+              <w:t>Aktivitetens vognnummer – på en fraværsdag vises i stedet fraværstypens navn (fx 'Sygdom'), selvom aktiviteten har et udfyldt vognnummer-felt. Er vagten kørt i flere biler, får dagen én række pr. bil (2026-09-30). Tid uden bil tæller med på nærmeste bil, og en bil der ikke findes i Vognpark, står uden vognnummer – opret bilen, så kommer vognnummeret med.</w:t>
             </w:r>
           </w:p>
         </w:tc>
@@ -11424,7 +11775,7 @@
           <w:rFonts w:ascii="Arial" w:hAnsi="Arial"/>
           <w:sz w:val="22"/>
         </w:rPr>
-        <w:t>Nederst i hver medarbejders tabel står 'Total løn for [navn]' – den fulde sum for medarbejderen i perioden: arbejdstid, overtid, salttillæg, overnatning, DOB overnatning, springertillæg OG al fraværsbetaling med et beregnet beløb (se afsnit 12.1 for hvilke typer det gælder).</w:t>
+        <w:t>Nederst i hver medarbejders tabel står 'Total løn for [navn]' – den fulde sum for medarbejderen i perioden: arbejdstid, overtid, salttillæg, søn-/helligdagsbetaling, overnatning, DOB overnatning, springertillæg OG al fraværsbetaling med et beregnet beløb (se afsnit 12.1 for hvilke typer det gælder). Søn-/helligdagsbetaling har ingen egen linje i topsummen, men er med i totalen.</w:t>
       </w:r>
     </w:p>
     <w:p>
@@ -11439,7 +11790,7 @@
           <w:color w:val="2E6DB8"/>
           <w:sz w:val="26"/>
         </w:rPr>
-        <w:t>12.3  Periode-visning</w:t>
+        <w:t>12.3  Periode og filtre</w:t>
       </w:r>
     </w:p>
     <w:p>
@@ -11451,7 +11802,7 @@
           <w:rFonts w:ascii="Arial" w:hAnsi="Arial"/>
           <w:sz w:val="22"/>
         </w:rPr>
-        <w:t>Lønafregning har ingen egen periodevælger – siden følger i stedet den periode du senest har navigeret til med pilene (‹ ›) i Aktivitetsoversigten, ligesom Lønkørsel allerede gør. Har du ikke navigeret til en bestemt periode, vises dagens periode. Skal du fx tjekke eller eksportere en periode der er kørt løn for og siden er blevet 'gammel' (dagens periode er rykket videre), skal du først gå til Aktiviteter og bladre tilbage til den ønskede periode med '‹', og derefter klikke på Lønafregning.</w:t>
+        <w:t>Øverst vælger du 'Fra' og 'Til' dato og kan filtrere på disponentgruppe og medarbejder. Klik '🔄 Opdater' efter du har ændret dem. Første gang du åbner fanen, udfyldes datoerne med den periode du står i under Aktiviteter. Kun medarbejdere med mindst én godkendt aktivitet i intervallet vises.</w:t>
       </w:r>
     </w:p>
     <w:p>
@@ -11492,7 +11843,7 @@
           <w:rFonts w:ascii="Arial" w:hAnsi="Arial"/>
           <w:sz w:val="22"/>
         </w:rPr>
-        <w:t>Naviger til den ønskede periode (se afsnit 12.3).</w:t>
+        <w:t>Vælg periode og evt. filtre (se afsnit 12.3).</w:t>
       </w:r>
     </w:p>
     <w:p>
@@ -11532,7 +11883,7 @@
           <w:rFonts w:ascii="Arial" w:hAnsi="Arial"/>
           <w:sz w:val="22"/>
         </w:rPr>
-        <w:t>CSV-filen (semikolon-separeret) indeholder kolonnerne Dato, Lønnummer, Normal timer, Overtid 1 time før, Overtid 1-3 timer efter, Øvrig overtid, Total tid, Total i kr., Vognnummer og Beløb – én række pr. dag pr. medarbejder, efterfulgt af en 'Total løn for [navn]'-række.</w:t>
+        <w:t>CSV-filen (semikolon-separeret) indeholder kolonnerne Dato, Lønnummer, Normal timer, Overtid 1 time før, Overtid 1-3 timer efter, Øvrig overtid, Total tid, Total i kr., Vognnummer og Beløb – én række pr. dag (og vognnummer) pr. medarbejder med data. Der er ingen total-rækker. I filen vises Ferie og Afspadsering altid med 0, og Feriefri med 0 for timelønnede – typens navn står stadig i Vognnummer-kolonnen.</w:t>
       </w:r>
     </w:p>
     <w:p>
@@ -11555,7 +11906,7 @@
           <w:color w:val="606060"/>
           <w:sz w:val="22"/>
         </w:rPr>
-        <w:t>Eksport kræver at den viste periode er låst (der er kørt løn for den under Lønkørsel) – ellers vises en fejlbesked, og der eksporteres ikke. Administratorer er undtaget og kan altid eksportere, uanset periodens status. Selve eksporten LÅSER ikke perioden – det sker kun ved 'Kør løn' under Lønkørsel.</w:t>
+        <w:t>Svarer Fra/Til præcis til en lønperiode, kræver eksporten at perioden er låst (der er kørt løn for den under Lønkørsel) – ellers vises en fejlbesked, og der eksporteres ikke. Et frit datointerval kan altid eksporteres. Administratorer er undtaget og kan altid eksportere, uanset periodens status. Selve eksporten LÅSER ikke perioden – det sker kun ved 'Kør løn' under Lønkørsel.</w:t>
       </w:r>
     </w:p>
     <w:p>
@@ -11587,7 +11938,7 @@
           <w:rFonts w:ascii="Arial" w:hAnsi="Arial"/>
           <w:sz w:val="22"/>
         </w:rPr>
-        <w:t>Klik på '🗓️ Dagsplan' i venstre menu for at se og redigere dagens fordeling af vogne til chauffører – den digitale afløser for det Excel-ark, der tidligere blev brugt uden for systemet. Siden kræver rettigheden 'Se dagsplan'; redigering kræver desuden 'Redigér dagsplan' (se afsnit 11.3). Uden redigeringsrettighed ser du samme visning, men alle felter og knapper er låst.</w:t>
+        <w:t>Klik på '📋 Dagsplan' i venstre menu for at se og redigere dagens fordeling af vogne til chauffører – den digitale afløser for det Excel-ark, der tidligere blev brugt uden for systemet. Siden kræver rettigheden 'Se dagsplan'; redigering kræver desuden 'Redigér dagsplan' (se afsnit 11.3). Uden redigeringsrettighed ser du samme visning, men alle felter og knapper er låst.</w:t>
       </w:r>
     </w:p>
     <w:p>
@@ -11626,7 +11977,7 @@
           <w:rFonts w:ascii="Arial" w:hAnsi="Arial"/>
           <w:sz w:val="22"/>
         </w:rPr>
-        <w:t>Øverst navigerer du mellem dage med ◀ / ▶ eller datovælgeren (default: dags dato). Disponentgruppe-filteret og det søgbare medarbejder-filter indsnævrer kun hovedtabellen – sidelisten med den fulde medarbejderoversigt er altid upåvirket af filtrene.</w:t>
+        <w:t>Øverst navigerer du mellem dage med ◀ / ▶ eller datovælgeren (default: dags dato). Disponentgruppe-filteret og det søgbare medarbejder-filter indsnævrer kun hovedtabellen – sidelisten er altid upåvirket af filtrene. Sidelisten viser aktive medarbejdere i de disponentgrupper der vises i aktivitetsoversigten; medarbejdere uden gruppe er ikke med.</w:t>
       </w:r>
     </w:p>
     <w:tbl>
@@ -11910,7 +12261,7 @@
           <w:rFonts w:ascii="Arial" w:hAnsi="Arial"/>
           <w:sz w:val="22"/>
         </w:rPr>
-        <w:t>En medarbejder med registreret fravær den valgte dag vises med rødt i sidelisten – og forbliver rødt, selv hvis vedkommende samtidig er skrevet i en Chauffør-kolonne.</w:t>
+        <w:t>En medarbejder med registreret fravær den valgte dag vises med rødt i sidelisten – og forbliver rødt, selv hvis vedkommende samtidig er skrevet i en Chauffør-kolonne. OBS: overnatning tæller også som fravær her.</w:t>
       </w:r>
     </w:p>
     <w:p>
@@ -11924,7 +12275,7 @@
           <w:rFonts w:ascii="Arial" w:hAnsi="Arial"/>
           <w:sz w:val="22"/>
         </w:rPr>
-        <w:t>En vogn med meldt materielt fravær (se afsnit 13.2) vises rødt i hovedtabellen.</w:t>
+        <w:t>En medarbejder med en vagtplan-kommentar den dag vises med gult (også hvis der samtidig er fravær – så vises kommentaren). Grøn = tildelt en vogn/EKSTRA-plads, grå = hverken tildelt eller fraværende.</w:t>
       </w:r>
     </w:p>
     <w:p>
@@ -11938,6 +12289,20 @@
           <w:rFonts w:ascii="Arial" w:hAnsi="Arial"/>
           <w:sz w:val="22"/>
         </w:rPr>
+        <w:t>En vogn med meldt materielt fravær (se afsnit 13.2) vises rødt i hovedtabellen.</w:t>
+      </w:r>
+    </w:p>
+    <w:p>
+      <w:pPr>
+        <w:pStyle w:val="ListBullet"/>
+        <w:spacing w:after="40"/>
+        <w:ind w:left="454"/>
+      </w:pPr>
+      <w:r>
+        <w:rPr>
+          <w:rFonts w:ascii="Arial" w:hAnsi="Arial"/>
+          <w:sz w:val="22"/>
+        </w:rPr>
         <w:t>Er der uoverensstemmelse mellem den tildelte vogn og vognnummeret på chaufførens egen 'normal tid'-aktivitet den dag, vises et ⚠️-ikon med tooltip 'vognnummer i løn: xxx' ved chaufførnavnet.</w:t>
       </w:r>
     </w:p>
@@ -12043,7 +12408,7 @@
           <w:rFonts w:ascii="Arial" w:hAnsi="Arial"/>
           <w:sz w:val="22"/>
         </w:rPr>
-        <w:t>Klik på '🗓️ Vagtplan' i venstre menu for at se en 4-ugers oversigt over alle medarbejderes fravær og kommentarer, med ugenummer i kolonneoverskriften. Kræver rettigheden 'Se vagtplan'; redigering kræver desuden enten 'Redigér egen linje i vagtplan' (kun din egen række) eller 'Redigér alle linjer i vagtplan'.</w:t>
+        <w:t>Klik på '🗓️ Vagtplan' i venstre menu for at se en 3-ugers oversigt (forrige, denne og næste uge) over alle medarbejderes fravær og kommentarer, med ugenummer i kolonneoverskriften. Kræver rettigheden 'Se vagtplan'; redigering kræver desuden enten 'Redigér egen linje i vagtplan' (kun din egen række) eller 'Redigér alle linjer i vagtplan'.</w:t>
       </w:r>
     </w:p>
     <w:p>
@@ -12161,6 +12526,29 @@
           <w:sz w:val="22"/>
         </w:rPr>
         <w:t>Vagtplan og Aktivitetsoversigten viser samme underliggende data – opretter du en fraværsaktivitet i Vagtplan, ses den også i Aktivitetsoversigten, og omvendt.</w:t>
+      </w:r>
+    </w:p>
+    <w:p>
+      <w:pPr>
+        <w:spacing w:before="80" w:after="160"/>
+        <w:ind w:left="283" w:right="283"/>
+      </w:pPr>
+      <w:r>
+        <w:rPr>
+          <w:rFonts w:ascii="Arial" w:hAnsi="Arial"/>
+          <w:b/>
+          <w:color w:val="2E6DB8"/>
+          <w:sz w:val="22"/>
+        </w:rPr>
+        <w:t xml:space="preserve">BEMÆRK: </w:t>
+      </w:r>
+      <w:r>
+        <w:rPr>
+          <w:rFonts w:ascii="Arial" w:hAnsi="Arial"/>
+          <w:color w:val="606060"/>
+          <w:sz w:val="22"/>
+        </w:rPr>
+        <w:t>I en låst lønperiode kan du hverken registrere, rette eller fjerne fravær eller kommentarer i Vagtplanen (2026-09-30). Fravær oprettet fra Vagtplanen kan rettes og fjernes af brugere med redigeringsret til linjen, også uden 'Redigér aktiviteter'/'Godkend aktiviteter'.</w:t>
       </w:r>
     </w:p>
     <w:p>
@@ -12600,7 +12988,7 @@
                 <w:rFonts w:ascii="Arial" w:hAnsi="Arial"/>
                 <w:sz w:val="20"/>
               </w:rPr>
-              <w:t>Afkryds for at vognen skal vises i Dagsplans vognkolonne og kunne vælges som 'Fast bil' på en medarbejder (se nedenfor).</w:t>
+              <w:t>Afkryds for at vognen skal vises under fanen 'Vognpark' og i Dagsplans vognkolonne.</w:t>
             </w:r>
           </w:p>
         </w:tc>
@@ -12616,7 +13004,7 @@
           <w:rFonts w:ascii="Arial" w:hAnsi="Arial"/>
           <w:sz w:val="22"/>
         </w:rPr>
-        <w:t>Siden har to underfaner: 'Vognpark' viser kun de vogne der har fluebenet 'Vognpark' sat – det er dem der reelt kører gods og indgår i Dagsplan og 'Fast bil'-valget. 'Alle' viser samtlige oprettede vogne, inklusive interne poster/afdelinger der ikke skal med i den daglige vognfordeling.</w:t>
+        <w:t>Siden har to underfaner: 'Vognpark' viser kun de vogne der har fluebenet 'Vognpark' sat – det er dem der reelt kører gods og indgår i Dagsplan. 'Alle' viser samtlige oprettede vogne, inklusive interne poster/afdelinger der ikke skal med i den daglige vognfordeling.</w:t>
       </w:r>
     </w:p>
     <w:p>
@@ -12639,7 +13027,7 @@
           <w:color w:val="606060"/>
           <w:sz w:val="22"/>
         </w:rPr>
-        <w:t>Nyoprettede vogne har som udgangspunkt IKKE fluebenet 'Vognpark' sat og vises derfor ikke i Dagsplan, før du aktivt går ind under fanen 'Alle' og krydser feltet af. 'Meld materielt fravær' (kapitel 13.2) og medarbejder-modalens 'Fast bil'-søgning viser i øvrigt alle vogne uanset dette flueben.</w:t>
+        <w:t>Nyoprettede vogne har som udgangspunkt IKKE fluebenet 'Vognpark' sat og vises derfor ikke i Dagsplan, før du aktivt går ind under fanen 'Alle' og krydser feltet af. 'Meld materielt fravær' (kapitel 13.2) og medarbejder-modalens 'Fast bil'- og 'Vognnummer ved fravær'-søgning viser i øvrigt alle vogne uanset dette flueben. Listen sorteres efter vognnummer.</w:t>
       </w:r>
     </w:p>
     <w:p>

</xml_diff>

<commit_message>
redigering af start/sluttid af en enkelt dags afspadsering er nu mulig
</commit_message>
<xml_diff>
--- a/docs/Brugervejledning.docx
+++ b/docs/Brugervejledning.docx
@@ -3471,7 +3471,21 @@
           <w:rFonts w:ascii="Arial" w:hAnsi="Arial"/>
           <w:sz w:val="22"/>
         </w:rPr>
-        <w:t>Afspadsering som periode ('Til dato' udfyldt) følger samme regel: 7,4 t (eller medarbejderens skemalagte timer) pr. hverdag, uanset klokketid. En enkelt afspadseringsdag (uden 'Til dato') kan derimod redigeres til en delvis dag med selvvalgt start-/sluttid, og den faktiske varighed bruges da i lønberegningen.</w:t>
+        <w:t>Afspadsering som periode ('Til dato' udfyldt) følger samme regel: 7,4 t (eller medarbejderens skemalagte timer) pr. hverdag, uanset klokketid. En enkelt afspadseringsdag (uden 'Til dato') kan derimod redigeres til en delvis dag med selvvalgt start-/sluttid, og den faktiske varighed bruges da i lønberegningen. Standardtiderne (06:00 + skemalagte timer) sættes kun, når datoen vælges eller ændres – en manuelt rettet start- eller sluttid bevares (rettet 2026-09-30: før sprang starttiden tilbage til 06:00, så snart den blev ændret).</w:t>
+      </w:r>
+    </w:p>
+    <w:p>
+      <w:pPr>
+        <w:pStyle w:val="ListBullet"/>
+        <w:spacing w:after="40"/>
+        <w:ind w:left="454"/>
+      </w:pPr>
+      <w:r>
+        <w:rPr>
+          <w:rFonts w:ascii="Arial" w:hAnsi="Arial"/>
+          <w:sz w:val="22"/>
+        </w:rPr>
+        <w:t>En eksisterende afspadsering (også en dag fra en periode, da hver dag er sin egen aktivitet) kan rettes i aktivitetsvinduet via 'Ret starttid'/'Ret sluttid' → 'Gem ændringer'. Den nye varighed bruges i lønberegningen, og ændringen gælder kun den ene dag. Kræver 'Redigér aktiviteter' og en ikke-låst lønperiode.</w:t>
       </w:r>
     </w:p>
     <w:p>
@@ -3611,7 +3625,7 @@
                 <w:rFonts w:ascii="Arial" w:hAnsi="Arial"/>
                 <w:sz w:val="20"/>
               </w:rPr>
-              <w:t>Registrerer afspadsering. Som periode ('Til dato') tæller hver hverdag 7,4 t/skemalagte timer; som enkeltdag bruges den faktiske start-/sluttid.</w:t>
+              <w:t>Registrerer afspadsering. Som periode ('Til dato') tæller hver hverdag 7,4 t/skemalagte timer; som enkeltdag bruges den faktiske start-/sluttid, som kan rettes både ved oprettelse og bagefter i aktivitetsvinduet.</w:t>
             </w:r>
           </w:p>
         </w:tc>

</xml_diff>

<commit_message>
brugervejledning og teknisk dokumentation er opdateret
</commit_message>
<xml_diff>
--- a/docs/Brugervejledning.docx
+++ b/docs/Brugervejledning.docx
@@ -55,7 +55,7 @@
           <w:color w:val="606060"/>
           <w:sz w:val="22"/>
         </w:rPr>
-        <w:t>September 2026</w:t>
+        <w:t>Oktober 2026</w:t>
       </w:r>
     </w:p>
     <w:p>
@@ -924,7 +924,7 @@
                 <w:rFonts w:ascii="Arial" w:hAnsi="Arial"/>
                 <w:sz w:val="20"/>
               </w:rPr>
-              <w:t>Konfiguration af systemets masterdata: overenskomsttyper, overtidssatser, tillæg, løntypekoder (inkl. CSV-kolonneopsætning), fraværstyper, CVR-numre, helligdage, disponentgrupper, aftaletyper og auto-godkendelse (kapitel 17). Alle typer og koder kan oprettes, redigeres og slettes. Kræver 'Stamdata'-rettigheden.</w:t>
+              <w:t>Konfiguration af systemets masterdata: overenskomsttyper, overtidssatser, tillæg, løntypekoder (inkl. CSV-kolonneopsætning), fraværstyper, CVR-numre, stillinger, helligdage, disponentgrupper, aftaletyper og auto-godkendelse (kapitel 17). Alle typer og koder kan oprettes, redigeres og slettes. Kræver 'Stamdata'-rettigheden.</w:t>
             </w:r>
           </w:p>
         </w:tc>
@@ -2128,7 +2128,7 @@
                 <w:rFonts w:ascii="Arial" w:hAnsi="Arial"/>
                 <w:sz w:val="20"/>
               </w:rPr>
-              <w:t>Aktiviteten har en kommentar. Hold musen over mærket for at læse den (2026-09-30).</w:t>
+              <w:t>Aktiviteten har en kommentar. Hold musen over mærket for at læse den (2026-09-30). Den automatiske tekst 'Split: første del'/'Split: anden del' på opdelte vagter tæller ikke som kommentar og giver intet mærke (2026-10-01).</w:t>
             </w:r>
           </w:p>
         </w:tc>
@@ -3457,7 +3457,7 @@
           <w:rFonts w:ascii="Arial" w:hAnsi="Arial"/>
           <w:sz w:val="22"/>
         </w:rPr>
-        <w:t>Selvbetalt fridag og Løn andet sted fra kan siden 2026-09-22 også oprettes som en periode ('Til dato' udfyldt), på nøjagtig samme måde som Ferie – én aktivitet pr. hverdag i intervallet.</w:t>
+        <w:t>Selvbetalt fridag, Løn andet sted fra og Eksport kan siden 2026-09-22 også oprettes som en periode ('Til dato' udfyldt), på nøjagtig samme måde som Ferie – én aktivitet pr. hverdag i intervallet.</w:t>
       </w:r>
     </w:p>
     <w:p>
@@ -3472,6 +3472,20 @@
           <w:sz w:val="22"/>
         </w:rPr>
         <w:t>Afspadsering som periode ('Til dato' udfyldt) følger samme regel: 7,4 t (eller medarbejderens skemalagte timer) pr. hverdag, uanset klokketid. En enkelt afspadseringsdag (uden 'Til dato') kan derimod redigeres til en delvis dag med selvvalgt start-/sluttid, og den faktiske varighed bruges da i lønberegningen. Standardtiderne (06:00 + skemalagte timer) sættes kun, når datoen vælges eller ændres – en manuelt rettet start- eller sluttid bevares (rettet 2026-09-30: før sprang starttiden tilbage til 06:00, så snart den blev ændret).</w:t>
+      </w:r>
+    </w:p>
+    <w:p>
+      <w:pPr>
+        <w:pStyle w:val="ListBullet"/>
+        <w:spacing w:after="40"/>
+        <w:ind w:left="454"/>
+      </w:pPr>
+      <w:r>
+        <w:rPr>
+          <w:rFonts w:ascii="Arial" w:hAnsi="Arial"/>
+          <w:sz w:val="22"/>
+        </w:rPr>
+        <w:t>Kursus/Skole fungerer siden 2026-10-01 præcis som afspadsering: som periode ('Til dato') får hver hverdag medarbejderens skemalagte (garanterede) timer, og dage med 0 skemalagte timer springes over. En enkelt dag uden 'Til dato' har frie start-/sluttider.</w:t>
       </w:r>
     </w:p>
     <w:p>
@@ -3731,7 +3745,7 @@
                 <w:rFonts w:ascii="Arial" w:hAnsi="Arial"/>
                 <w:sz w:val="20"/>
               </w:rPr>
-              <w:t>Skole/kursus</w:t>
+              <w:t>Eksport</w:t>
             </w:r>
           </w:p>
         </w:tc>
@@ -3751,7 +3765,7 @@
                 <w:rFonts w:ascii="Arial" w:hAnsi="Arial"/>
                 <w:sz w:val="20"/>
               </w:rPr>
-              <w:t>Registrerer skole- eller kursusdag.</w:t>
+              <w:t>Tilføjet 2026-09-30. Har præcis samme egenskaber som Løn andet sted fra (0 kr., ingen linje i Danløn CSV, kan oprettes som periode).</w:t>
             </w:r>
           </w:p>
         </w:tc>
@@ -3773,7 +3787,7 @@
                 <w:rFonts w:ascii="Arial" w:hAnsi="Arial"/>
                 <w:sz w:val="20"/>
               </w:rPr>
-              <w:t>Overnatning</w:t>
+              <w:t>Skole/kursus</w:t>
             </w:r>
           </w:p>
         </w:tc>
@@ -3793,7 +3807,7 @@
                 <w:rFonts w:ascii="Arial" w:hAnsi="Arial"/>
                 <w:sz w:val="20"/>
               </w:rPr>
-              <w:t>Registrerer en overnatning (flat sats pr. forekomst – ikke timer). Angiv datoen, eller udfyld 'Til dato' for at registrere flere overnatninger i træk (se note nedenfor). Satsen hentes automatisk fra Stamdata (Tillæg-fanen).</w:t>
+              <w:t>Registrerer skole- eller kursusdag. Fungerer som Afspadsering: som periode tæller hver hverdag de skemalagte timer (dage med 0 timer springes over); som enkeltdag vælger du selv start- og sluttid.</w:t>
             </w:r>
           </w:p>
         </w:tc>
@@ -3815,7 +3829,7 @@
                 <w:rFonts w:ascii="Arial" w:hAnsi="Arial"/>
                 <w:sz w:val="20"/>
               </w:rPr>
-              <w:t>Overnatning – DOB</w:t>
+              <w:t>Overnatning</w:t>
             </w:r>
           </w:p>
         </w:tc>
@@ -3835,6 +3849,48 @@
                 <w:rFonts w:ascii="Arial" w:hAnsi="Arial"/>
                 <w:sz w:val="20"/>
               </w:rPr>
+              <w:t>Registrerer en overnatning (flat sats pr. forekomst – ikke timer). Angiv datoen, eller udfyld 'Til dato' for at registrere flere overnatninger i træk (se note nedenfor). Satsen hentes automatisk fra Stamdata (Tillæg-fanen).</w:t>
+            </w:r>
+          </w:p>
+        </w:tc>
+      </w:tr>
+      <w:tr>
+        <w:tc>
+          <w:tcPr>
+            <w:tcW w:type="dxa" w:w="4536"/>
+            <w:tcBorders>
+              <w:top w:val="single" w:sz="4" w:color="CCCCCC"/>
+              <w:left w:val="single" w:sz="4" w:color="CCCCCC"/>
+              <w:bottom w:val="single" w:sz="4" w:color="CCCCCC"/>
+              <w:right w:val="single" w:sz="4" w:color="CCCCCC"/>
+            </w:tcBorders>
+          </w:tcPr>
+          <w:p>
+            <w:r>
+              <w:rPr>
+                <w:rFonts w:ascii="Arial" w:hAnsi="Arial"/>
+                <w:sz w:val="20"/>
+              </w:rPr>
+              <w:t>Overnatning – DOB</w:t>
+            </w:r>
+          </w:p>
+        </w:tc>
+        <w:tc>
+          <w:tcPr>
+            <w:tcW w:type="dxa" w:w="4536"/>
+            <w:tcBorders>
+              <w:top w:val="single" w:sz="4" w:color="CCCCCC"/>
+              <w:left w:val="single" w:sz="4" w:color="CCCCCC"/>
+              <w:bottom w:val="single" w:sz="4" w:color="CCCCCC"/>
+              <w:right w:val="single" w:sz="4" w:color="CCCCCC"/>
+            </w:tcBorders>
+          </w:tcPr>
+          <w:p>
+            <w:r>
+              <w:rPr>
+                <w:rFonts w:ascii="Arial" w:hAnsi="Arial"/>
+                <w:sz w:val="20"/>
+              </w:rPr>
               <w:t>Krydses af INDE I Overnatning-oprettelsen (samme modal, ekstra 'DOB'-flueben) – registreres som en separat overnatningstype med sin egen sats i Stamdata → Tillæg. Vises som egen linje i PDF-timesedlen og prøvekørslens Excel-ark. Kommer med i Danløn CSV'en, når der findes en løntypekode for DOB-overnatning i Stamdata → Løntypekoder (fx kode 43) – systemet opretter den ikke selv.</w:t>
             </w:r>
           </w:p>
@@ -4208,7 +4264,7 @@
           <w:rFonts w:ascii="Arial" w:hAnsi="Arial"/>
           <w:sz w:val="22"/>
         </w:rPr>
-        <w:t>Dage der TILFØJES til perioden, får en ny aktivitet med samme standardtimer som ved oprettelse (skemalagte timer, eller 7,4 t hvis de er 0; feriefri altid 7,4 t). Kun for afspadsering springes en dag med 0 skemalagte timer over.</w:t>
+        <w:t>Dage der TILFØJES til perioden, får en ny aktivitet med samme standardtimer som ved oprettelse (skemalagte timer, eller 7,4 t hvis de er 0; feriefri altid 7,4 t). Kun for afspadsering og skole/kursus springes en dag med 0 skemalagte timer over.</w:t>
       </w:r>
     </w:p>
     <w:p>
@@ -4318,7 +4374,7 @@
           <w:rFonts w:ascii="Arial" w:hAnsi="Arial"/>
           <w:sz w:val="22"/>
         </w:rPr>
-        <w:t>Øverst på siden kan medarbejderlisten indsnævres på tre måder, som kan kombineres frit:</w:t>
+        <w:t>Øverst på siden kan medarbejderlisten indsnævres på flere måder, som kan kombineres frit:</w:t>
       </w:r>
     </w:p>
     <w:p>
@@ -4340,7 +4396,7 @@
           <w:rFonts w:ascii="Arial" w:hAnsi="Arial"/>
           <w:sz w:val="22"/>
         </w:rPr>
-        <w:t>skriv et navn eller lønnummer for hurtigt at finde en bestemt medarbejder.</w:t>
+        <w:t>skriv et navn, et lønnummer eller et telefon-/mobilnummer. Ved telefonnumre ignoreres mellemrum og +45, så '12345678' finder '+45 12 34 56 78' (skriv mindst 3 cifre).</w:t>
       </w:r>
     </w:p>
     <w:p>
@@ -4385,6 +4441,106 @@
           <w:sz w:val="22"/>
         </w:rPr>
         <w:t>medtag fratrådte/deaktiverede medarbejdere i listen.</w:t>
+      </w:r>
+    </w:p>
+    <w:p>
+      <w:pPr>
+        <w:pStyle w:val="ListBullet"/>
+        <w:spacing w:after="40"/>
+        <w:ind w:left="454"/>
+      </w:pPr>
+      <w:r>
+        <w:rPr>
+          <w:rFonts w:ascii="Arial" w:hAnsi="Arial"/>
+          <w:b/>
+          <w:sz w:val="22"/>
+        </w:rPr>
+        <w:t xml:space="preserve">Stilling: </w:t>
+      </w:r>
+      <w:r>
+        <w:rPr>
+          <w:rFonts w:ascii="Arial" w:hAnsi="Arial"/>
+          <w:sz w:val="22"/>
+        </w:rPr>
+        <w:t>Alle stillinger, 'Ingen stilling' eller én bestemt stilling.</w:t>
+      </w:r>
+    </w:p>
+    <w:p>
+      <w:pPr>
+        <w:pStyle w:val="ListBullet"/>
+        <w:spacing w:after="40"/>
+        <w:ind w:left="454"/>
+      </w:pPr>
+      <w:r>
+        <w:rPr>
+          <w:rFonts w:ascii="Arial" w:hAnsi="Arial"/>
+          <w:b/>
+          <w:sz w:val="22"/>
+        </w:rPr>
+        <w:t xml:space="preserve">Personaleforening: </w:t>
+      </w:r>
+      <w:r>
+        <w:rPr>
+          <w:rFonts w:ascii="Arial" w:hAnsi="Arial"/>
+          <w:sz w:val="22"/>
+        </w:rPr>
+        <w:t>Medlem / Ikke medlem.</w:t>
+      </w:r>
+    </w:p>
+    <w:p>
+      <w:pPr>
+        <w:pStyle w:val="ListBullet"/>
+        <w:spacing w:after="40"/>
+        <w:ind w:left="454"/>
+      </w:pPr>
+      <w:r>
+        <w:rPr>
+          <w:rFonts w:ascii="Arial" w:hAnsi="Arial"/>
+          <w:b/>
+          <w:sz w:val="22"/>
+        </w:rPr>
+        <w:t xml:space="preserve">Natarbejdetillæg: </w:t>
+      </w:r>
+      <w:r>
+        <w:rPr>
+          <w:rFonts w:ascii="Arial" w:hAnsi="Arial"/>
+          <w:sz w:val="22"/>
+        </w:rPr>
+        <w:t>Ja / Nej.</w:t>
+      </w:r>
+    </w:p>
+    <w:p>
+      <w:pPr>
+        <w:pStyle w:val="ListBullet"/>
+        <w:spacing w:after="40"/>
+        <w:ind w:left="454"/>
+      </w:pPr>
+      <w:r>
+        <w:rPr>
+          <w:rFonts w:ascii="Arial" w:hAnsi="Arial"/>
+          <w:b/>
+          <w:sz w:val="22"/>
+        </w:rPr>
+        <w:t xml:space="preserve">Elev: </w:t>
+      </w:r>
+      <w:r>
+        <w:rPr>
+          <w:rFonts w:ascii="Arial" w:hAnsi="Arial"/>
+          <w:sz w:val="22"/>
+        </w:rPr>
+        <w:t>Elev / Ikke elev.</w:t>
+      </w:r>
+    </w:p>
+    <w:p>
+      <w:pPr>
+        <w:spacing w:after="120"/>
+      </w:pPr>
+      <w:r>
+        <w:rPr>
+          <w:rFonts w:ascii="Arial" w:hAnsi="Arial"/>
+          <w:sz w:val="22"/>
+        </w:rPr>
+        <w:t>Listen viser 'Lønnr. · Stilling' under hvert navn (stillingen udelades, hvis den ikke er udfyldt). Filtrene gælder både liste, tabel og Excel-eksport (afsnit 7.8).</w:t>
       </w:r>
     </w:p>
     <w:p>
@@ -4763,7 +4919,7 @@
                 <w:rFonts w:ascii="Arial" w:hAnsi="Arial"/>
                 <w:sz w:val="20"/>
               </w:rPr>
-              <w:t>Nej</w:t>
+              <w:t>Nej (kun chauffør)</w:t>
             </w:r>
           </w:p>
         </w:tc>
@@ -4825,7 +4981,7 @@
                 <w:rFonts w:ascii="Arial" w:hAnsi="Arial"/>
                 <w:sz w:val="20"/>
               </w:rPr>
-              <w:t>Nej</w:t>
+              <w:t>Nej (kun chauffør)</w:t>
             </w:r>
           </w:p>
         </w:tc>
@@ -4887,7 +5043,7 @@
                 <w:rFonts w:ascii="Arial" w:hAnsi="Arial"/>
                 <w:sz w:val="20"/>
               </w:rPr>
-              <w:t>Nej</w:t>
+              <w:t>Nej (kun chauffør)</w:t>
             </w:r>
           </w:p>
         </w:tc>
@@ -4907,7 +5063,7 @@
                 <w:rFonts w:ascii="Arial" w:hAnsi="Arial"/>
                 <w:sz w:val="20"/>
               </w:rPr>
-              <w:t>Afkryd for en afløser/substitutmedarbejder. Medarbejderen får IKKE søgnehelligdagsbetaling (kode 4/63) på søndage/helligdage medmindre vedkommende faktisk har kørt den dag – se afsnit 9.5. Farvemarkeres separat i medarbejderlisten, Vagtplan og Aktivitetsoversigten.</w:t>
+              <w:t>Afkryd for en afløser/substitutmedarbejder. Medarbejderen får IKKE søgnehelligdagsbetaling (kode 4/63) på søndage/helligdage medmindre vedkommende faktisk har kørt den dag – se afsnit 9.5. Farvemarkeres grønt i medarbejderlisten, Vagtplan og Aktivitetsoversigten.</w:t>
             </w:r>
           </w:p>
         </w:tc>
@@ -5031,7 +5187,7 @@
                 <w:rFonts w:ascii="Arial" w:hAnsi="Arial"/>
                 <w:sz w:val="20"/>
               </w:rPr>
-              <w:t>Unikt lønnummer (bruges i Danløn-eksporten).</w:t>
+              <w:t>Unikt lønnummer (bruges i Danløn-eksporten). Ved oprettelse foreslår systemet automatisk det højeste lønnummer fra 34000 og op + 1 – forslaget kan overskrives. Når du forlader feltet, tjekkes nummeret, og er det allerede i brug, vises en rød besked med navnet på den medarbejder der har det. Du kan ikke gemme, før nummeret er ledigt.</w:t>
             </w:r>
           </w:p>
         </w:tc>
@@ -5073,7 +5229,7 @@
                 <w:rFonts w:ascii="Arial" w:hAnsi="Arial"/>
                 <w:sz w:val="20"/>
               </w:rPr>
-              <w:t>Nej</w:t>
+              <w:t>Ja (kun chauffør)</w:t>
             </w:r>
           </w:p>
         </w:tc>
@@ -5093,7 +5249,7 @@
                 <w:rFonts w:ascii="Arial" w:hAnsi="Arial"/>
                 <w:sz w:val="20"/>
               </w:rPr>
-              <w:t>EU-førerkortnummer – påkrævet for at importere .ddd-filer korrekt. Skjules for aftaletypen 'Funktionær'.</w:t>
+              <w:t>EU-førerkortnummer – bruges til at matche .ddd-filer. Påkrævet for chauffører (2026-10-01), skjult for funktionærer.</w:t>
             </w:r>
           </w:p>
         </w:tc>
@@ -5115,7 +5271,7 @@
                 <w:rFonts w:ascii="Arial" w:hAnsi="Arial"/>
                 <w:sz w:val="20"/>
               </w:rPr>
-              <w:t>Initialer</w:t>
+              <w:t>Stilling</w:t>
             </w:r>
           </w:p>
         </w:tc>
@@ -5135,7 +5291,7 @@
                 <w:rFonts w:ascii="Arial" w:hAnsi="Arial"/>
                 <w:sz w:val="20"/>
               </w:rPr>
-              <w:t>Nej</w:t>
+              <w:t>Ja</w:t>
             </w:r>
           </w:p>
         </w:tc>
@@ -5155,7 +5311,7 @@
                 <w:rFonts w:ascii="Arial" w:hAnsi="Arial"/>
                 <w:sz w:val="20"/>
               </w:rPr>
-              <w:t>Skal svare til brugerens login-initialer, hvis medarbejderen skal kunne redigere sin egen linje i Vagtplan.</w:t>
+              <w:t>Vælg fra listen, der vedligeholdes i Stamdata → Stillinger (2026-10-01).</w:t>
             </w:r>
           </w:p>
         </w:tc>
@@ -5177,7 +5333,7 @@
                 <w:rFonts w:ascii="Arial" w:hAnsi="Arial"/>
                 <w:sz w:val="20"/>
               </w:rPr>
-              <w:t>Navn</w:t>
+              <w:t>Initialer</w:t>
             </w:r>
           </w:p>
         </w:tc>
@@ -5197,7 +5353,7 @@
                 <w:rFonts w:ascii="Arial" w:hAnsi="Arial"/>
                 <w:sz w:val="20"/>
               </w:rPr>
-              <w:t>Ja</w:t>
+              <w:t>Ja for funktionær</w:t>
             </w:r>
           </w:p>
         </w:tc>
@@ -5217,7 +5373,7 @@
                 <w:rFonts w:ascii="Arial" w:hAnsi="Arial"/>
                 <w:sz w:val="20"/>
               </w:rPr>
-              <w:t>Fornavn og efternavn.</w:t>
+              <w:t>Skal svare til brugerens login-initialer, hvis medarbejderen skal kunne redigere sin egen linje i Vagtplan. Påkrævet for funktionærer.</w:t>
             </w:r>
           </w:p>
         </w:tc>
@@ -5239,7 +5395,7 @@
                 <w:rFonts w:ascii="Arial" w:hAnsi="Arial"/>
                 <w:sz w:val="20"/>
               </w:rPr>
-              <w:t>Adresse / postnummer</w:t>
+              <w:t>Navn</w:t>
             </w:r>
           </w:p>
         </w:tc>
@@ -5259,7 +5415,7 @@
                 <w:rFonts w:ascii="Arial" w:hAnsi="Arial"/>
                 <w:sz w:val="20"/>
               </w:rPr>
-              <w:t>Nej</w:t>
+              <w:t>Ja</w:t>
             </w:r>
           </w:p>
         </w:tc>
@@ -5279,7 +5435,7 @@
                 <w:rFonts w:ascii="Arial" w:hAnsi="Arial"/>
                 <w:sz w:val="20"/>
               </w:rPr>
-              <w:t>Adresseoplysninger.</w:t>
+              <w:t>Fornavn og efternavn.</w:t>
             </w:r>
           </w:p>
         </w:tc>
@@ -5301,7 +5457,7 @@
                 <w:rFonts w:ascii="Arial" w:hAnsi="Arial"/>
                 <w:sz w:val="20"/>
               </w:rPr>
-              <w:t>E-mail / telefon / mobil</w:t>
+              <w:t>Adresse / postnummer</w:t>
             </w:r>
           </w:p>
         </w:tc>
@@ -5341,7 +5497,7 @@
                 <w:rFonts w:ascii="Arial" w:hAnsi="Arial"/>
                 <w:sz w:val="20"/>
               </w:rPr>
-              <w:t>Kontaktoplysninger. E-mail bruges til at sende timesedler. Tømmer du et af de valgfri felter (fx e-mail, telefon, adresse, initialer eller førerkortnummer), gemmes det tomt (rettet 2026-09-30 – før blev den gamle værdi stående).</w:t>
+              <w:t>Adresseoplysninger.</w:t>
             </w:r>
           </w:p>
         </w:tc>
@@ -5363,7 +5519,7 @@
                 <w:rFonts w:ascii="Arial" w:hAnsi="Arial"/>
                 <w:sz w:val="20"/>
               </w:rPr>
-              <w:t>Ansættelsesdato</w:t>
+              <w:t>Email</w:t>
             </w:r>
           </w:p>
         </w:tc>
@@ -5403,7 +5559,7 @@
                 <w:rFonts w:ascii="Arial" w:hAnsi="Arial"/>
                 <w:sz w:val="20"/>
               </w:rPr>
-              <w:t>Startdato for ansættelsen. Klik på feltet for at åbne en kalender med måned- og årstaldropdown.</w:t>
+              <w:t>Hedder 'Email (Poulschou)' for funktionærer og 'Email (Privat)' for chauffører – det er samme felt. Bruges bl.a. til at sende timesedler.</w:t>
             </w:r>
           </w:p>
         </w:tc>
@@ -5425,7 +5581,7 @@
                 <w:rFonts w:ascii="Arial" w:hAnsi="Arial"/>
                 <w:sz w:val="20"/>
               </w:rPr>
-              <w:t>Fratrædelsesdato</w:t>
+              <w:t>Telefon / mobil</w:t>
             </w:r>
           </w:p>
         </w:tc>
@@ -5465,7 +5621,7 @@
                 <w:rFonts w:ascii="Arial" w:hAnsi="Arial"/>
                 <w:sz w:val="20"/>
               </w:rPr>
-              <w:t>Udfyldes KUN ved fratrædelse. Default er 31-12-9999. Klik på feltet for at åbne kalender-pickeren.</w:t>
+              <w:t>Kontaktoplysninger – kan søges på (afsnit 7.1). Tømmer du et af de valgfri felter (fx telefon, adresse eller anciennitetsdato), gemmes det tomt.</w:t>
             </w:r>
           </w:p>
         </w:tc>
@@ -5487,7 +5643,7 @@
                 <w:rFonts w:ascii="Arial" w:hAnsi="Arial"/>
                 <w:sz w:val="20"/>
               </w:rPr>
-              <w:t>Aktiv</w:t>
+              <w:t>Ansættelsesdato</w:t>
             </w:r>
           </w:p>
         </w:tc>
@@ -5507,7 +5663,7 @@
                 <w:rFonts w:ascii="Arial" w:hAnsi="Arial"/>
                 <w:sz w:val="20"/>
               </w:rPr>
-              <w:t>—</w:t>
+              <w:t>Ja</w:t>
             </w:r>
           </w:p>
         </w:tc>
@@ -5527,7 +5683,7 @@
                 <w:rFonts w:ascii="Arial" w:hAnsi="Arial"/>
                 <w:sz w:val="20"/>
               </w:rPr>
-              <w:t>Afkryd for at medarbejderen er aktiv i systemet.</w:t>
+              <w:t>Startdato for ansættelsen. Klik på feltet for at åbne en kalender med måned- og årstaldropdown.</w:t>
             </w:r>
           </w:p>
         </w:tc>
@@ -5549,7 +5705,7 @@
                 <w:rFonts w:ascii="Arial" w:hAnsi="Arial"/>
                 <w:sz w:val="20"/>
               </w:rPr>
-              <w:t>Fuldlønnet</w:t>
+              <w:t>Fratrædelsesdato</w:t>
             </w:r>
           </w:p>
         </w:tc>
@@ -5569,7 +5725,7 @@
                 <w:rFonts w:ascii="Arial" w:hAnsi="Arial"/>
                 <w:sz w:val="20"/>
               </w:rPr>
-              <w:t>—</w:t>
+              <w:t>Nej</w:t>
             </w:r>
           </w:p>
         </w:tc>
@@ -5589,7 +5745,7 @@
                 <w:rFonts w:ascii="Arial" w:hAnsi="Arial"/>
                 <w:sz w:val="20"/>
               </w:rPr>
-              <w:t>Afkryd hvis medarbejderen er fuldlønnet.</w:t>
+              <w:t>Udfyldes KUN ved fratrædelse. Default er 31-12-9999. Klik på feltet for at åbne kalender-pickeren.</w:t>
             </w:r>
           </w:p>
         </w:tc>
@@ -5611,7 +5767,7 @@
                 <w:rFonts w:ascii="Arial" w:hAnsi="Arial"/>
                 <w:sz w:val="20"/>
               </w:rPr>
-              <w:t>§56</w:t>
+              <w:t>Anciennitetsdato</w:t>
             </w:r>
           </w:p>
         </w:tc>
@@ -5631,7 +5787,7 @@
                 <w:rFonts w:ascii="Arial" w:hAnsi="Arial"/>
                 <w:sz w:val="20"/>
               </w:rPr>
-              <w:t>—</w:t>
+              <w:t>Nej</w:t>
             </w:r>
           </w:p>
         </w:tc>
@@ -5651,6 +5807,440 @@
                 <w:rFonts w:ascii="Arial" w:hAnsi="Arial"/>
                 <w:sz w:val="20"/>
               </w:rPr>
+              <w:t>Bruges KUN til jubilæumsadvarslen (afsnit 7.9). Er den tom, regnes jubilæum fra ansættelsesdatoen. Påvirker ikke 9-måneders-varslet eller satser.</w:t>
+            </w:r>
+          </w:p>
+        </w:tc>
+      </w:tr>
+      <w:tr>
+        <w:tc>
+          <w:tcPr>
+            <w:tcW w:type="dxa" w:w="3024"/>
+            <w:tcBorders>
+              <w:top w:val="single" w:sz="4" w:color="CCCCCC"/>
+              <w:left w:val="single" w:sz="4" w:color="CCCCCC"/>
+              <w:bottom w:val="single" w:sz="4" w:color="CCCCCC"/>
+              <w:right w:val="single" w:sz="4" w:color="CCCCCC"/>
+            </w:tcBorders>
+          </w:tcPr>
+          <w:p>
+            <w:r>
+              <w:rPr>
+                <w:rFonts w:ascii="Arial" w:hAnsi="Arial"/>
+                <w:sz w:val="20"/>
+              </w:rPr>
+              <w:t>CPR-nummer</w:t>
+            </w:r>
+          </w:p>
+        </w:tc>
+        <w:tc>
+          <w:tcPr>
+            <w:tcW w:type="dxa" w:w="3024"/>
+            <w:tcBorders>
+              <w:top w:val="single" w:sz="4" w:color="CCCCCC"/>
+              <w:left w:val="single" w:sz="4" w:color="CCCCCC"/>
+              <w:bottom w:val="single" w:sz="4" w:color="CCCCCC"/>
+              <w:right w:val="single" w:sz="4" w:color="CCCCCC"/>
+            </w:tcBorders>
+          </w:tcPr>
+          <w:p>
+            <w:r>
+              <w:rPr>
+                <w:rFonts w:ascii="Arial" w:hAnsi="Arial"/>
+                <w:sz w:val="20"/>
+              </w:rPr>
+              <w:t>Nej</w:t>
+            </w:r>
+          </w:p>
+        </w:tc>
+        <w:tc>
+          <w:tcPr>
+            <w:tcW w:type="dxa" w:w="3024"/>
+            <w:tcBorders>
+              <w:top w:val="single" w:sz="4" w:color="CCCCCC"/>
+              <w:left w:val="single" w:sz="4" w:color="CCCCCC"/>
+              <w:bottom w:val="single" w:sz="4" w:color="CCCCCC"/>
+              <w:right w:val="single" w:sz="4" w:color="CCCCCC"/>
+            </w:tcBorders>
+          </w:tcPr>
+          <w:p>
+            <w:r>
+              <w:rPr>
+                <w:rFonts w:ascii="Arial" w:hAnsi="Arial"/>
+                <w:sz w:val="20"/>
+              </w:rPr>
+              <w:t>Format ddmmåå-xxxx – de første 6 cifre skal være en gyldig dato. Uden rettigheden 'Se CPR-nummer' vises det som fx 120385-****. Lader du det maskerede felt stå, bevares det gemte CPR; skriver du et nyt fuldt CPR, overskrives det.</w:t>
+            </w:r>
+          </w:p>
+        </w:tc>
+      </w:tr>
+      <w:tr>
+        <w:tc>
+          <w:tcPr>
+            <w:tcW w:type="dxa" w:w="3024"/>
+            <w:tcBorders>
+              <w:top w:val="single" w:sz="4" w:color="CCCCCC"/>
+              <w:left w:val="single" w:sz="4" w:color="CCCCCC"/>
+              <w:bottom w:val="single" w:sz="4" w:color="CCCCCC"/>
+              <w:right w:val="single" w:sz="4" w:color="CCCCCC"/>
+            </w:tcBorders>
+          </w:tcPr>
+          <w:p>
+            <w:r>
+              <w:rPr>
+                <w:rFonts w:ascii="Arial" w:hAnsi="Arial"/>
+                <w:sz w:val="20"/>
+              </w:rPr>
+              <w:t>Aktiv</w:t>
+            </w:r>
+          </w:p>
+        </w:tc>
+        <w:tc>
+          <w:tcPr>
+            <w:tcW w:type="dxa" w:w="3024"/>
+            <w:tcBorders>
+              <w:top w:val="single" w:sz="4" w:color="CCCCCC"/>
+              <w:left w:val="single" w:sz="4" w:color="CCCCCC"/>
+              <w:bottom w:val="single" w:sz="4" w:color="CCCCCC"/>
+              <w:right w:val="single" w:sz="4" w:color="CCCCCC"/>
+            </w:tcBorders>
+          </w:tcPr>
+          <w:p>
+            <w:r>
+              <w:rPr>
+                <w:rFonts w:ascii="Arial" w:hAnsi="Arial"/>
+                <w:sz w:val="20"/>
+              </w:rPr>
+              <w:t>—</w:t>
+            </w:r>
+          </w:p>
+        </w:tc>
+        <w:tc>
+          <w:tcPr>
+            <w:tcW w:type="dxa" w:w="3024"/>
+            <w:tcBorders>
+              <w:top w:val="single" w:sz="4" w:color="CCCCCC"/>
+              <w:left w:val="single" w:sz="4" w:color="CCCCCC"/>
+              <w:bottom w:val="single" w:sz="4" w:color="CCCCCC"/>
+              <w:right w:val="single" w:sz="4" w:color="CCCCCC"/>
+            </w:tcBorders>
+          </w:tcPr>
+          <w:p>
+            <w:r>
+              <w:rPr>
+                <w:rFonts w:ascii="Arial" w:hAnsi="Arial"/>
+                <w:sz w:val="20"/>
+              </w:rPr>
+              <w:t>Afkryd for at medarbejderen er aktiv i systemet.</w:t>
+            </w:r>
+          </w:p>
+        </w:tc>
+      </w:tr>
+      <w:tr>
+        <w:tc>
+          <w:tcPr>
+            <w:tcW w:type="dxa" w:w="3024"/>
+            <w:tcBorders>
+              <w:top w:val="single" w:sz="4" w:color="CCCCCC"/>
+              <w:left w:val="single" w:sz="4" w:color="CCCCCC"/>
+              <w:bottom w:val="single" w:sz="4" w:color="CCCCCC"/>
+              <w:right w:val="single" w:sz="4" w:color="CCCCCC"/>
+            </w:tcBorders>
+          </w:tcPr>
+          <w:p>
+            <w:r>
+              <w:rPr>
+                <w:rFonts w:ascii="Arial" w:hAnsi="Arial"/>
+                <w:sz w:val="20"/>
+              </w:rPr>
+              <w:t>Fuldlønnet</w:t>
+            </w:r>
+          </w:p>
+        </w:tc>
+        <w:tc>
+          <w:tcPr>
+            <w:tcW w:type="dxa" w:w="3024"/>
+            <w:tcBorders>
+              <w:top w:val="single" w:sz="4" w:color="CCCCCC"/>
+              <w:left w:val="single" w:sz="4" w:color="CCCCCC"/>
+              <w:bottom w:val="single" w:sz="4" w:color="CCCCCC"/>
+              <w:right w:val="single" w:sz="4" w:color="CCCCCC"/>
+            </w:tcBorders>
+          </w:tcPr>
+          <w:p>
+            <w:r>
+              <w:rPr>
+                <w:rFonts w:ascii="Arial" w:hAnsi="Arial"/>
+                <w:sz w:val="20"/>
+              </w:rPr>
+              <w:t>—</w:t>
+            </w:r>
+          </w:p>
+        </w:tc>
+        <w:tc>
+          <w:tcPr>
+            <w:tcW w:type="dxa" w:w="3024"/>
+            <w:tcBorders>
+              <w:top w:val="single" w:sz="4" w:color="CCCCCC"/>
+              <w:left w:val="single" w:sz="4" w:color="CCCCCC"/>
+              <w:bottom w:val="single" w:sz="4" w:color="CCCCCC"/>
+              <w:right w:val="single" w:sz="4" w:color="CCCCCC"/>
+            </w:tcBorders>
+          </w:tcPr>
+          <w:p>
+            <w:r>
+              <w:rPr>
+                <w:rFonts w:ascii="Arial" w:hAnsi="Arial"/>
+                <w:sz w:val="20"/>
+              </w:rPr>
+              <w:t>Afkryd hvis medarbejderen er fuldlønnet.</w:t>
+            </w:r>
+          </w:p>
+        </w:tc>
+      </w:tr>
+      <w:tr>
+        <w:tc>
+          <w:tcPr>
+            <w:tcW w:type="dxa" w:w="3024"/>
+            <w:tcBorders>
+              <w:top w:val="single" w:sz="4" w:color="CCCCCC"/>
+              <w:left w:val="single" w:sz="4" w:color="CCCCCC"/>
+              <w:bottom w:val="single" w:sz="4" w:color="CCCCCC"/>
+              <w:right w:val="single" w:sz="4" w:color="CCCCCC"/>
+            </w:tcBorders>
+          </w:tcPr>
+          <w:p>
+            <w:r>
+              <w:rPr>
+                <w:rFonts w:ascii="Arial" w:hAnsi="Arial"/>
+                <w:sz w:val="20"/>
+              </w:rPr>
+              <w:t>Medlem af Personaleforening</w:t>
+            </w:r>
+          </w:p>
+        </w:tc>
+        <w:tc>
+          <w:tcPr>
+            <w:tcW w:type="dxa" w:w="3024"/>
+            <w:tcBorders>
+              <w:top w:val="single" w:sz="4" w:color="CCCCCC"/>
+              <w:left w:val="single" w:sz="4" w:color="CCCCCC"/>
+              <w:bottom w:val="single" w:sz="4" w:color="CCCCCC"/>
+              <w:right w:val="single" w:sz="4" w:color="CCCCCC"/>
+            </w:tcBorders>
+          </w:tcPr>
+          <w:p>
+            <w:r>
+              <w:rPr>
+                <w:rFonts w:ascii="Arial" w:hAnsi="Arial"/>
+                <w:sz w:val="20"/>
+              </w:rPr>
+              <w:t>—</w:t>
+            </w:r>
+          </w:p>
+        </w:tc>
+        <w:tc>
+          <w:tcPr>
+            <w:tcW w:type="dxa" w:w="3024"/>
+            <w:tcBorders>
+              <w:top w:val="single" w:sz="4" w:color="CCCCCC"/>
+              <w:left w:val="single" w:sz="4" w:color="CCCCCC"/>
+              <w:bottom w:val="single" w:sz="4" w:color="CCCCCC"/>
+              <w:right w:val="single" w:sz="4" w:color="CCCCCC"/>
+            </w:tcBorders>
+          </w:tcPr>
+          <w:p>
+            <w:r>
+              <w:rPr>
+                <w:rFonts w:ascii="Arial" w:hAnsi="Arial"/>
+                <w:sz w:val="20"/>
+              </w:rPr>
+              <w:t>Afkrydset som standard ved nye medarbejdere. Eksisterende medarbejdere er ikke afkrydset og skal rettes manuelt.</w:t>
+            </w:r>
+          </w:p>
+        </w:tc>
+      </w:tr>
+      <w:tr>
+        <w:tc>
+          <w:tcPr>
+            <w:tcW w:type="dxa" w:w="3024"/>
+            <w:tcBorders>
+              <w:top w:val="single" w:sz="4" w:color="CCCCCC"/>
+              <w:left w:val="single" w:sz="4" w:color="CCCCCC"/>
+              <w:bottom w:val="single" w:sz="4" w:color="CCCCCC"/>
+              <w:right w:val="single" w:sz="4" w:color="CCCCCC"/>
+            </w:tcBorders>
+          </w:tcPr>
+          <w:p>
+            <w:r>
+              <w:rPr>
+                <w:rFonts w:ascii="Arial" w:hAnsi="Arial"/>
+                <w:sz w:val="20"/>
+              </w:rPr>
+              <w:t>Elev</w:t>
+            </w:r>
+          </w:p>
+        </w:tc>
+        <w:tc>
+          <w:tcPr>
+            <w:tcW w:type="dxa" w:w="3024"/>
+            <w:tcBorders>
+              <w:top w:val="single" w:sz="4" w:color="CCCCCC"/>
+              <w:left w:val="single" w:sz="4" w:color="CCCCCC"/>
+              <w:bottom w:val="single" w:sz="4" w:color="CCCCCC"/>
+              <w:right w:val="single" w:sz="4" w:color="CCCCCC"/>
+            </w:tcBorders>
+          </w:tcPr>
+          <w:p>
+            <w:r>
+              <w:rPr>
+                <w:rFonts w:ascii="Arial" w:hAnsi="Arial"/>
+                <w:sz w:val="20"/>
+              </w:rPr>
+              <w:t>— (kun chauffør)</w:t>
+            </w:r>
+          </w:p>
+        </w:tc>
+        <w:tc>
+          <w:tcPr>
+            <w:tcW w:type="dxa" w:w="3024"/>
+            <w:tcBorders>
+              <w:top w:val="single" w:sz="4" w:color="CCCCCC"/>
+              <w:left w:val="single" w:sz="4" w:color="CCCCCC"/>
+              <w:bottom w:val="single" w:sz="4" w:color="CCCCCC"/>
+              <w:right w:val="single" w:sz="4" w:color="CCCCCC"/>
+            </w:tcBorders>
+          </w:tcPr>
+          <w:p>
+            <w:r>
+              <w:rPr>
+                <w:rFonts w:ascii="Arial" w:hAnsi="Arial"/>
+                <w:sz w:val="20"/>
+              </w:rPr>
+              <w:t>Afkryds for en elev. Så vises Elev startdato og Elev slutdato, som begge er påkrævede (slut efter start). Har ingen betydning for lønnen – bruges til elevadvarsel, filter og gul farvemarkering.</w:t>
+            </w:r>
+          </w:p>
+        </w:tc>
+      </w:tr>
+      <w:tr>
+        <w:tc>
+          <w:tcPr>
+            <w:tcW w:type="dxa" w:w="3024"/>
+            <w:tcBorders>
+              <w:top w:val="single" w:sz="4" w:color="CCCCCC"/>
+              <w:left w:val="single" w:sz="4" w:color="CCCCCC"/>
+              <w:bottom w:val="single" w:sz="4" w:color="CCCCCC"/>
+              <w:right w:val="single" w:sz="4" w:color="CCCCCC"/>
+            </w:tcBorders>
+          </w:tcPr>
+          <w:p>
+            <w:r>
+              <w:rPr>
+                <w:rFonts w:ascii="Arial" w:hAnsi="Arial"/>
+                <w:sz w:val="20"/>
+              </w:rPr>
+              <w:t>Natarbejdetillæg</w:t>
+            </w:r>
+          </w:p>
+        </w:tc>
+        <w:tc>
+          <w:tcPr>
+            <w:tcW w:type="dxa" w:w="3024"/>
+            <w:tcBorders>
+              <w:top w:val="single" w:sz="4" w:color="CCCCCC"/>
+              <w:left w:val="single" w:sz="4" w:color="CCCCCC"/>
+              <w:bottom w:val="single" w:sz="4" w:color="CCCCCC"/>
+              <w:right w:val="single" w:sz="4" w:color="CCCCCC"/>
+            </w:tcBorders>
+          </w:tcPr>
+          <w:p>
+            <w:r>
+              <w:rPr>
+                <w:rFonts w:ascii="Arial" w:hAnsi="Arial"/>
+                <w:sz w:val="20"/>
+              </w:rPr>
+              <w:t>— (kun chauffør)</w:t>
+            </w:r>
+          </w:p>
+        </w:tc>
+        <w:tc>
+          <w:tcPr>
+            <w:tcW w:type="dxa" w:w="3024"/>
+            <w:tcBorders>
+              <w:top w:val="single" w:sz="4" w:color="CCCCCC"/>
+              <w:left w:val="single" w:sz="4" w:color="CCCCCC"/>
+              <w:bottom w:val="single" w:sz="4" w:color="CCCCCC"/>
+              <w:right w:val="single" w:sz="4" w:color="CCCCCC"/>
+            </w:tcBorders>
+          </w:tcPr>
+          <w:p>
+            <w:r>
+              <w:rPr>
+                <w:rFonts w:ascii="Arial" w:hAnsi="Arial"/>
+                <w:sz w:val="20"/>
+              </w:rPr>
+              <w:t>Markering til filtrering og tabelvisning. Påvirker ikke lønberegningen.</w:t>
+            </w:r>
+          </w:p>
+        </w:tc>
+      </w:tr>
+      <w:tr>
+        <w:tc>
+          <w:tcPr>
+            <w:tcW w:type="dxa" w:w="3024"/>
+            <w:tcBorders>
+              <w:top w:val="single" w:sz="4" w:color="CCCCCC"/>
+              <w:left w:val="single" w:sz="4" w:color="CCCCCC"/>
+              <w:bottom w:val="single" w:sz="4" w:color="CCCCCC"/>
+              <w:right w:val="single" w:sz="4" w:color="CCCCCC"/>
+            </w:tcBorders>
+          </w:tcPr>
+          <w:p>
+            <w:r>
+              <w:rPr>
+                <w:rFonts w:ascii="Arial" w:hAnsi="Arial"/>
+                <w:sz w:val="20"/>
+              </w:rPr>
+              <w:t>§56</w:t>
+            </w:r>
+          </w:p>
+        </w:tc>
+        <w:tc>
+          <w:tcPr>
+            <w:tcW w:type="dxa" w:w="3024"/>
+            <w:tcBorders>
+              <w:top w:val="single" w:sz="4" w:color="CCCCCC"/>
+              <w:left w:val="single" w:sz="4" w:color="CCCCCC"/>
+              <w:bottom w:val="single" w:sz="4" w:color="CCCCCC"/>
+              <w:right w:val="single" w:sz="4" w:color="CCCCCC"/>
+            </w:tcBorders>
+          </w:tcPr>
+          <w:p>
+            <w:r>
+              <w:rPr>
+                <w:rFonts w:ascii="Arial" w:hAnsi="Arial"/>
+                <w:sz w:val="20"/>
+              </w:rPr>
+              <w:t>—</w:t>
+            </w:r>
+          </w:p>
+        </w:tc>
+        <w:tc>
+          <w:tcPr>
+            <w:tcW w:type="dxa" w:w="3024"/>
+            <w:tcBorders>
+              <w:top w:val="single" w:sz="4" w:color="CCCCCC"/>
+              <w:left w:val="single" w:sz="4" w:color="CCCCCC"/>
+              <w:bottom w:val="single" w:sz="4" w:color="CCCCCC"/>
+              <w:right w:val="single" w:sz="4" w:color="CCCCCC"/>
+            </w:tcBorders>
+          </w:tcPr>
+          <w:p>
+            <w:r>
+              <w:rPr>
+                <w:rFonts w:ascii="Arial" w:hAnsi="Arial"/>
+                <w:sz w:val="20"/>
+              </w:rPr>
               <w:t>Afkryd hvis medarbejderen har en §56-aftale. Herefter skal start- og slutdato udfyldes (begge påkrævede, rød *) – slutdatoen skal ligge efter startdatoen. Se afsnit 7.6 om §56-advarslen.</w:t>
             </w:r>
           </w:p>
@@ -5678,7 +6268,7 @@
           <w:color w:val="606060"/>
           <w:sz w:val="22"/>
         </w:rPr>
-        <w:t>De tilgængelige aftaletyper administreres i Stamdata-modulet under fanen 'Aftale'. Her kan en administrator ændre teksten på de to oprindelige typer, samt tilføje flere aftaletyper og bestemme om Overenskomsttype skal være påkrævet for hver af dem. Vælges en type der ikke kræver Overenskomsttype, skjules feltet helt.</w:t>
+        <w:t>Felter der ikke gælder for en funktionær (Førerkortnummer, Elev, Natarbejdetillæg, Afløser, Fast bil og Særaftale) skjules, men den gemte værdi bevares, hvis du skifter tilbage. Gemmer du en funktionær, der stadig har Afløser, Fast bil eller Særaftale afkrydset fra chauffør-tiden, spørger systemet for hver markering, om den skal beholdes eller fjernes. De nye påkrævede felter (Stilling, Email, Initialer/Førerkortnummer) gør ikke eksisterende medarbejdere ugyldige – de skal først udfyldes, næste gang medarbejderen gemmes.</w:t>
       </w:r>
     </w:p>
     <w:p>
@@ -5693,7 +6283,7 @@
           <w:color w:val="2E6DB8"/>
           <w:sz w:val="22"/>
         </w:rPr>
-        <w:t xml:space="preserve">VIGTIGT: </w:t>
+        <w:t xml:space="preserve">GODT AT VIDE: </w:t>
       </w:r>
       <w:r>
         <w:rPr>
@@ -5701,7 +6291,7 @@
           <w:color w:val="606060"/>
           <w:sz w:val="22"/>
         </w:rPr>
-        <w:t>Opret KUN en ny aftaletype hvis du er indforstået med konsekvensen: medarbejdere på en aftaletype ud over de to oprindelige ('Timelønnet, fast arbejdstid' og 'Timelønnet, ikke fastlagt arbejdstid') får IKKE noget overtidstillæg og INGEN søgnehelligdagsbetaling overhovedet – kun almindelig timeløn for de faktisk arbejdede timer, uanset tidspunkt eller dagtype. Den konkrete beregningsregel for en ny aftaletype skal udvikles særskilt, hvis den overhovedet skal afvige fra flad timeløn. Kontakt systemudvikler før en ny aftaletype tages i brug til en medarbejder, hvis der forventes overtid/SH-betaling.</w:t>
+        <w:t>De tilgængelige aftaletyper administreres i Stamdata-modulet under fanen 'Aftale'. Her kan en administrator ændre teksten på de to oprindelige typer, samt tilføje flere aftaletyper og bestemme om Overenskomsttype skal være påkrævet for hver af dem. Vælges en type der ikke kræver Overenskomsttype, skjules feltet helt.</w:t>
       </w:r>
     </w:p>
     <w:p>
@@ -5716,6 +6306,29 @@
           <w:color w:val="2E6DB8"/>
           <w:sz w:val="22"/>
         </w:rPr>
+        <w:t xml:space="preserve">VIGTIGT: </w:t>
+      </w:r>
+      <w:r>
+        <w:rPr>
+          <w:rFonts w:ascii="Arial" w:hAnsi="Arial"/>
+          <w:color w:val="606060"/>
+          <w:sz w:val="22"/>
+        </w:rPr>
+        <w:t>Opret KUN en ny aftaletype hvis du er indforstået med konsekvensen: medarbejdere på en aftaletype ud over de to oprindelige ('Timelønnet, fast arbejdstid' og 'Timelønnet, ikke fastlagt arbejdstid') får IKKE noget overtidstillæg og INGEN søgnehelligdagsbetaling overhovedet – kun almindelig timeløn for de faktisk arbejdede timer, uanset tidspunkt eller dagtype. Den konkrete beregningsregel for en ny aftaletype skal udvikles særskilt, hvis den overhovedet skal afvige fra flad timeløn. Kontakt systemudvikler før en ny aftaletype tages i brug til en medarbejder, hvis der forventes overtid/SH-betaling.</w:t>
+      </w:r>
+    </w:p>
+    <w:p>
+      <w:pPr>
+        <w:spacing w:before="80" w:after="160"/>
+        <w:ind w:left="283" w:right="283"/>
+      </w:pPr>
+      <w:r>
+        <w:rPr>
+          <w:rFonts w:ascii="Arial" w:hAnsi="Arial"/>
+          <w:b/>
+          <w:color w:val="2E6DB8"/>
+          <w:sz w:val="22"/>
+        </w:rPr>
         <w:t xml:space="preserve">BEMÆRK: </w:t>
       </w:r>
       <w:r>
@@ -6164,6 +6777,348 @@
           <w:sz w:val="22"/>
         </w:rPr>
         <w:t>Opretter du en 'Sygdom'-aktivitet for en medarbejder der har §56 afkrydset, spørger systemet om aktiviteten skal forblive almindelig 'Sygdom', eller i stedet oprettes som den eksisterende fraværstype '§56 syg'. Fortryder du dialogen (klik uden for/Annuller), oprettes ingen aktivitet overhovedet.</w:t>
+      </w:r>
+    </w:p>
+    <w:p>
+      <w:pPr>
+        <w:pStyle w:val="Heading2"/>
+        <w:spacing w:before="200" w:after="120"/>
+      </w:pPr>
+      <w:r>
+        <w:rPr>
+          <w:rFonts w:ascii="Arial" w:hAnsi="Arial"/>
+          <w:b/>
+          <w:color w:val="2E6DB8"/>
+          <w:sz w:val="26"/>
+        </w:rPr>
+        <w:t>7.8  Tabelvisning og Excel-eksport</w:t>
+      </w:r>
+    </w:p>
+    <w:p>
+      <w:pPr>
+        <w:spacing w:after="120"/>
+      </w:pPr>
+      <w:r>
+        <w:rPr>
+          <w:rFonts w:ascii="Arial" w:hAnsi="Arial"/>
+          <w:sz w:val="22"/>
+        </w:rPr>
+        <w:t>Med rettigheden 'Tabelvisning af medarbejdere' vises knappen 'Tabel' i værktøjslinjen. Den skifter mellem liste og tabel, og valget huskes i din browser. Tabellen har kolonnerne Lønnummer, Navn, Fuldlønnet, Natarbejdetillæg, Stilling, Disponentgruppe, Ansættelsesdato, Telefon, Mobil, Email og Elev (med elevperiode). Klik på en kolonneoverskrift for at sortere; klik igen for at vende rækkefølgen. Klik på en række åbner medarbejderen, hvis du har 'Tilføj medarbejdere'.</w:t>
+      </w:r>
+    </w:p>
+    <w:p>
+      <w:pPr>
+        <w:spacing w:after="120"/>
+      </w:pPr>
+      <w:r>
+        <w:rPr>
+          <w:rFonts w:ascii="Arial" w:hAnsi="Arial"/>
+          <w:sz w:val="22"/>
+        </w:rPr>
+        <w:t>Med rettigheden 'Eksportér medarbejderregister' vises 'Eksportér til Excel' i tabelvisningen. Filen (Medarbejderregister_ÅÅÅÅ-MM-DD.xlsx) hentes direkte i browseren og indeholder præcis de medarbejdere og den rækkefølge, du ser – efter filtre, søgning og sortering. Elev er delt i tre kolonner: Elev, Elev start og Elev slut. CPR-nummer kommer aldrig med, hverken i tabel eller eksport.</w:t>
+      </w:r>
+    </w:p>
+    <w:p>
+      <w:pPr>
+        <w:spacing w:after="120"/>
+      </w:pPr>
+      <w:r>
+        <w:rPr>
+          <w:rFonts w:ascii="Arial" w:hAnsi="Arial"/>
+          <w:sz w:val="22"/>
+        </w:rPr>
+        <w:t>Elever markeres med gul farve (avatar i listen, rækken i tabellen og navnecellen i Vagtplan og Aktivitetsoversigten), så de kan skelnes fra afløsere, der fortsat er grønne. Er en medarbejder både elev og afløser, vises elev-farven.</w:t>
+      </w:r>
+    </w:p>
+    <w:p>
+      <w:pPr>
+        <w:pStyle w:val="Heading2"/>
+        <w:spacing w:before="200" w:after="120"/>
+      </w:pPr>
+      <w:r>
+        <w:rPr>
+          <w:rFonts w:ascii="Arial" w:hAnsi="Arial"/>
+          <w:b/>
+          <w:color w:val="2E6DB8"/>
+          <w:sz w:val="26"/>
+        </w:rPr>
+        <w:t>7.9  Mærkedagsadvarsler</w:t>
+      </w:r>
+    </w:p>
+    <w:p>
+      <w:pPr>
+        <w:spacing w:after="120"/>
+      </w:pPr>
+      <w:r>
+        <w:rPr>
+          <w:rFonts w:ascii="Arial" w:hAnsi="Arial"/>
+          <w:sz w:val="22"/>
+        </w:rPr>
+        <w:t>Ud over anciennitets- og §56-varslerne kan systemet vise en pop-up efter login om tre slags mærkedage. Hver kræver sin egen rettighed i Brugerstyring – kun Administrator har dem fra start:</w:t>
+      </w:r>
+    </w:p>
+    <w:tbl>
+      <w:tblPr>
+        <w:tblStyle w:val="TableGrid"/>
+        <w:tblW w:type="auto" w:w="0"/>
+        <w:tblLook w:firstColumn="1" w:firstRow="1" w:lastColumn="0" w:lastRow="0" w:noHBand="0" w:noVBand="1" w:val="04A0"/>
+      </w:tblPr>
+      <w:tblGrid>
+        <w:gridCol w:w="3024"/>
+        <w:gridCol w:w="3024"/>
+        <w:gridCol w:w="3024"/>
+      </w:tblGrid>
+      <w:tr>
+        <w:tc>
+          <w:tcPr>
+            <w:tcW w:type="dxa" w:w="3024"/>
+            <w:shd w:val="clear" w:color="auto" w:fill="1B3A6B"/>
+          </w:tcPr>
+          <w:p>
+            <w:r>
+              <w:rPr>
+                <w:rFonts w:ascii="Arial" w:hAnsi="Arial"/>
+                <w:b/>
+                <w:color w:val="FFFFFF"/>
+                <w:sz w:val="20"/>
+              </w:rPr>
+              <w:t>Advarsel</w:t>
+            </w:r>
+          </w:p>
+        </w:tc>
+        <w:tc>
+          <w:tcPr>
+            <w:tcW w:type="dxa" w:w="3024"/>
+            <w:shd w:val="clear" w:color="auto" w:fill="1B3A6B"/>
+          </w:tcPr>
+          <w:p>
+            <w:r>
+              <w:rPr>
+                <w:rFonts w:ascii="Arial" w:hAnsi="Arial"/>
+                <w:b/>
+                <w:color w:val="FFFFFF"/>
+                <w:sz w:val="20"/>
+              </w:rPr>
+              <w:t>Hvornår</w:t>
+            </w:r>
+          </w:p>
+        </w:tc>
+        <w:tc>
+          <w:tcPr>
+            <w:tcW w:type="dxa" w:w="3024"/>
+            <w:shd w:val="clear" w:color="auto" w:fill="1B3A6B"/>
+          </w:tcPr>
+          <w:p>
+            <w:r>
+              <w:rPr>
+                <w:rFonts w:ascii="Arial" w:hAnsi="Arial"/>
+                <w:b/>
+                <w:color w:val="FFFFFF"/>
+                <w:sz w:val="20"/>
+              </w:rPr>
+              <w:t>Rettighed</w:t>
+            </w:r>
+          </w:p>
+        </w:tc>
+      </w:tr>
+      <w:tr>
+        <w:tc>
+          <w:tcPr>
+            <w:tcW w:type="dxa" w:w="3024"/>
+            <w:tcBorders>
+              <w:top w:val="single" w:sz="4" w:color="CCCCCC"/>
+              <w:left w:val="single" w:sz="4" w:color="CCCCCC"/>
+              <w:bottom w:val="single" w:sz="4" w:color="CCCCCC"/>
+              <w:right w:val="single" w:sz="4" w:color="CCCCCC"/>
+            </w:tcBorders>
+          </w:tcPr>
+          <w:p>
+            <w:r>
+              <w:rPr>
+                <w:rFonts w:ascii="Arial" w:hAnsi="Arial"/>
+                <w:sz w:val="20"/>
+              </w:rPr>
+              <w:t>Jubilæum 25, 40 og 50 år</w:t>
+            </w:r>
+          </w:p>
+        </w:tc>
+        <w:tc>
+          <w:tcPr>
+            <w:tcW w:type="dxa" w:w="3024"/>
+            <w:tcBorders>
+              <w:top w:val="single" w:sz="4" w:color="CCCCCC"/>
+              <w:left w:val="single" w:sz="4" w:color="CCCCCC"/>
+              <w:bottom w:val="single" w:sz="4" w:color="CCCCCC"/>
+              <w:right w:val="single" w:sz="4" w:color="CCCCCC"/>
+            </w:tcBorders>
+          </w:tcPr>
+          <w:p>
+            <w:r>
+              <w:rPr>
+                <w:rFonts w:ascii="Arial" w:hAnsi="Arial"/>
+                <w:sz w:val="20"/>
+              </w:rPr>
+              <w:t>Regnes fra Anciennitetsdato, eller fra Ansættelsesdato hvis den er tom</w:t>
+            </w:r>
+          </w:p>
+        </w:tc>
+        <w:tc>
+          <w:tcPr>
+            <w:tcW w:type="dxa" w:w="3024"/>
+            <w:tcBorders>
+              <w:top w:val="single" w:sz="4" w:color="CCCCCC"/>
+              <w:left w:val="single" w:sz="4" w:color="CCCCCC"/>
+              <w:bottom w:val="single" w:sz="4" w:color="CCCCCC"/>
+              <w:right w:val="single" w:sz="4" w:color="CCCCCC"/>
+            </w:tcBorders>
+          </w:tcPr>
+          <w:p>
+            <w:r>
+              <w:rPr>
+                <w:rFonts w:ascii="Arial" w:hAnsi="Arial"/>
+                <w:sz w:val="20"/>
+              </w:rPr>
+              <w:t>Jubilæumsadvarsel</w:t>
+            </w:r>
+          </w:p>
+        </w:tc>
+      </w:tr>
+      <w:tr>
+        <w:tc>
+          <w:tcPr>
+            <w:tcW w:type="dxa" w:w="3024"/>
+            <w:tcBorders>
+              <w:top w:val="single" w:sz="4" w:color="CCCCCC"/>
+              <w:left w:val="single" w:sz="4" w:color="CCCCCC"/>
+              <w:bottom w:val="single" w:sz="4" w:color="CCCCCC"/>
+              <w:right w:val="single" w:sz="4" w:color="CCCCCC"/>
+            </w:tcBorders>
+          </w:tcPr>
+          <w:p>
+            <w:r>
+              <w:rPr>
+                <w:rFonts w:ascii="Arial" w:hAnsi="Arial"/>
+                <w:sz w:val="20"/>
+              </w:rPr>
+              <w:t>Elev slutter</w:t>
+            </w:r>
+          </w:p>
+        </w:tc>
+        <w:tc>
+          <w:tcPr>
+            <w:tcW w:type="dxa" w:w="3024"/>
+            <w:tcBorders>
+              <w:top w:val="single" w:sz="4" w:color="CCCCCC"/>
+              <w:left w:val="single" w:sz="4" w:color="CCCCCC"/>
+              <w:bottom w:val="single" w:sz="4" w:color="CCCCCC"/>
+              <w:right w:val="single" w:sz="4" w:color="CCCCCC"/>
+            </w:tcBorders>
+          </w:tcPr>
+          <w:p>
+            <w:r>
+              <w:rPr>
+                <w:rFonts w:ascii="Arial" w:hAnsi="Arial"/>
+                <w:sz w:val="20"/>
+              </w:rPr>
+              <w:t>Ud fra Elev slutdato (kun chauffører med Elev afkrydset)</w:t>
+            </w:r>
+          </w:p>
+        </w:tc>
+        <w:tc>
+          <w:tcPr>
+            <w:tcW w:type="dxa" w:w="3024"/>
+            <w:tcBorders>
+              <w:top w:val="single" w:sz="4" w:color="CCCCCC"/>
+              <w:left w:val="single" w:sz="4" w:color="CCCCCC"/>
+              <w:bottom w:val="single" w:sz="4" w:color="CCCCCC"/>
+              <w:right w:val="single" w:sz="4" w:color="CCCCCC"/>
+            </w:tcBorders>
+          </w:tcPr>
+          <w:p>
+            <w:r>
+              <w:rPr>
+                <w:rFonts w:ascii="Arial" w:hAnsi="Arial"/>
+                <w:sz w:val="20"/>
+              </w:rPr>
+              <w:t>Elevadvarsel</w:t>
+            </w:r>
+          </w:p>
+        </w:tc>
+      </w:tr>
+      <w:tr>
+        <w:tc>
+          <w:tcPr>
+            <w:tcW w:type="dxa" w:w="3024"/>
+            <w:tcBorders>
+              <w:top w:val="single" w:sz="4" w:color="CCCCCC"/>
+              <w:left w:val="single" w:sz="4" w:color="CCCCCC"/>
+              <w:bottom w:val="single" w:sz="4" w:color="CCCCCC"/>
+              <w:right w:val="single" w:sz="4" w:color="CCCCCC"/>
+            </w:tcBorders>
+          </w:tcPr>
+          <w:p>
+            <w:r>
+              <w:rPr>
+                <w:rFonts w:ascii="Arial" w:hAnsi="Arial"/>
+                <w:sz w:val="20"/>
+              </w:rPr>
+              <w:t>Rund fødselsdag</w:t>
+            </w:r>
+          </w:p>
+        </w:tc>
+        <w:tc>
+          <w:tcPr>
+            <w:tcW w:type="dxa" w:w="3024"/>
+            <w:tcBorders>
+              <w:top w:val="single" w:sz="4" w:color="CCCCCC"/>
+              <w:left w:val="single" w:sz="4" w:color="CCCCCC"/>
+              <w:bottom w:val="single" w:sz="4" w:color="CCCCCC"/>
+              <w:right w:val="single" w:sz="4" w:color="CCCCCC"/>
+            </w:tcBorders>
+          </w:tcPr>
+          <w:p>
+            <w:r>
+              <w:rPr>
+                <w:rFonts w:ascii="Arial" w:hAnsi="Arial"/>
+                <w:sz w:val="20"/>
+              </w:rPr>
+              <w:t>10, 20, 30 … år – fødselsdatoen læses af CPR-nummeret</w:t>
+            </w:r>
+          </w:p>
+        </w:tc>
+        <w:tc>
+          <w:tcPr>
+            <w:tcW w:type="dxa" w:w="3024"/>
+            <w:tcBorders>
+              <w:top w:val="single" w:sz="4" w:color="CCCCCC"/>
+              <w:left w:val="single" w:sz="4" w:color="CCCCCC"/>
+              <w:bottom w:val="single" w:sz="4" w:color="CCCCCC"/>
+              <w:right w:val="single" w:sz="4" w:color="CCCCCC"/>
+            </w:tcBorders>
+          </w:tcPr>
+          <w:p>
+            <w:r>
+              <w:rPr>
+                <w:rFonts w:ascii="Arial" w:hAnsi="Arial"/>
+                <w:sz w:val="20"/>
+              </w:rPr>
+              <w:t>Fødselsdagsadvarsel</w:t>
+            </w:r>
+          </w:p>
+        </w:tc>
+      </w:tr>
+    </w:tbl>
+    <w:p/>
+    <w:p>
+      <w:pPr>
+        <w:spacing w:after="120"/>
+      </w:pPr>
+      <w:r>
+        <w:rPr>
+          <w:rFonts w:ascii="Arial" w:hAnsi="Arial"/>
+          <w:sz w:val="22"/>
+        </w:rPr>
+        <w:t>Advarslen vises fra samme dato måneden før til og med selve dagen (fx en fødselsdag den 15/11 fra den 15/10). Er dagen passeret, vises den ikke. Kun aktive medarbejdere tæller med. Pop-up'en viser den første advarsel og '+ N flere'; klik 'Gå til medarbejder' for at åbne medarbejderen. Klikker du 'OK' eller 'Luk', kommer netop den advarsel ikke igen for dig – men kolleger ser den stadig, og næste runde fødselsdag/jubilæum giver en ny advarsel. Ændres elevens slutdato, kommer elevadvarslen igen. Lukker du med × i hjørnet, vises den igen ved næste login.</w:t>
       </w:r>
     </w:p>
     <w:p>
@@ -10073,7 +11028,7 @@
                 <w:rFonts w:ascii="Arial" w:hAnsi="Arial"/>
                 <w:sz w:val="20"/>
               </w:rPr>
-              <w:t>Menupunktet '⚙️ Stamdata' – alle ti faner. Helligdage kræver 'Administrér helligdage', Auto-godkendelse-fanen desuden 'manage_auto_approval'.</w:t>
+              <w:t>Menupunktet '⚙️ Stamdata' – alle elleve faner (inkl. Stillinger). Helligdage kræver 'Administrér helligdage', Auto-godkendelse-fanen desuden 'manage_auto_approval'.</w:t>
             </w:r>
           </w:p>
         </w:tc>
@@ -10135,7 +11090,7 @@
                 <w:rFonts w:ascii="Arial" w:hAnsi="Arial"/>
                 <w:sz w:val="20"/>
               </w:rPr>
-              <w:t>Menupunktet 'Medarbejdere' (læse-adgang) og medarbejdernes kontakt-, løn- og førerkortoplysninger. Uden den ser brugeren stadig navne i fx Aktiviteter og Vagtplan, men ikke adresse, e-mail, telefon, førerkortnummer, timesats og CVR.</w:t>
+              <w:t>Menupunktet 'Medarbejdere' (læse-adgang) og medarbejdernes kontakt-, løn- og førerkortoplysninger. Uden den ser brugeren stadig navne i fx Aktiviteter og Vagtplan, men ikke adresse, e-mail, telefon, førerkortnummer, timesats, CVR og CPR.</w:t>
             </w:r>
           </w:p>
         </w:tc>
@@ -11376,6 +12331,378 @@
                 <w:sz w:val="20"/>
               </w:rPr>
               <w:t>Redigér tildelinger og 'informeret'-afkrydsning, meld/fjern materielt fravær. Tildeles ikke automatisk nogen rolle.</w:t>
+            </w:r>
+          </w:p>
+        </w:tc>
+      </w:tr>
+      <w:tr>
+        <w:tc>
+          <w:tcPr>
+            <w:tcW w:type="dxa" w:w="3024"/>
+            <w:tcBorders>
+              <w:top w:val="single" w:sz="4" w:color="CCCCCC"/>
+              <w:left w:val="single" w:sz="4" w:color="CCCCCC"/>
+              <w:bottom w:val="single" w:sz="4" w:color="CCCCCC"/>
+              <w:right w:val="single" w:sz="4" w:color="CCCCCC"/>
+            </w:tcBorders>
+          </w:tcPr>
+          <w:p>
+            <w:r>
+              <w:rPr>
+                <w:rFonts w:ascii="Arial" w:hAnsi="Arial"/>
+                <w:sz w:val="20"/>
+              </w:rPr>
+              <w:t>view_cpr</w:t>
+            </w:r>
+          </w:p>
+        </w:tc>
+        <w:tc>
+          <w:tcPr>
+            <w:tcW w:type="dxa" w:w="3024"/>
+            <w:tcBorders>
+              <w:top w:val="single" w:sz="4" w:color="CCCCCC"/>
+              <w:left w:val="single" w:sz="4" w:color="CCCCCC"/>
+              <w:bottom w:val="single" w:sz="4" w:color="CCCCCC"/>
+              <w:right w:val="single" w:sz="4" w:color="CCCCCC"/>
+            </w:tcBorders>
+          </w:tcPr>
+          <w:p>
+            <w:r>
+              <w:rPr>
+                <w:rFonts w:ascii="Arial" w:hAnsi="Arial"/>
+                <w:sz w:val="20"/>
+              </w:rPr>
+              <w:t>Se CPR-nummer</w:t>
+            </w:r>
+          </w:p>
+        </w:tc>
+        <w:tc>
+          <w:tcPr>
+            <w:tcW w:type="dxa" w:w="3024"/>
+            <w:tcBorders>
+              <w:top w:val="single" w:sz="4" w:color="CCCCCC"/>
+              <w:left w:val="single" w:sz="4" w:color="CCCCCC"/>
+              <w:bottom w:val="single" w:sz="4" w:color="CCCCCC"/>
+              <w:right w:val="single" w:sz="4" w:color="CCCCCC"/>
+            </w:tcBorders>
+          </w:tcPr>
+          <w:p>
+            <w:r>
+              <w:rPr>
+                <w:rFonts w:ascii="Arial" w:hAnsi="Arial"/>
+                <w:sz w:val="20"/>
+              </w:rPr>
+              <w:t>Se medarbejdernes fulde CPR-nummer. Uden den vises de sidste 4 cifre som ****. Kun Administrator fra start.</w:t>
+            </w:r>
+          </w:p>
+        </w:tc>
+      </w:tr>
+      <w:tr>
+        <w:tc>
+          <w:tcPr>
+            <w:tcW w:type="dxa" w:w="3024"/>
+            <w:tcBorders>
+              <w:top w:val="single" w:sz="4" w:color="CCCCCC"/>
+              <w:left w:val="single" w:sz="4" w:color="CCCCCC"/>
+              <w:bottom w:val="single" w:sz="4" w:color="CCCCCC"/>
+              <w:right w:val="single" w:sz="4" w:color="CCCCCC"/>
+            </w:tcBorders>
+          </w:tcPr>
+          <w:p>
+            <w:r>
+              <w:rPr>
+                <w:rFonts w:ascii="Arial" w:hAnsi="Arial"/>
+                <w:sz w:val="20"/>
+              </w:rPr>
+              <w:t>jubilee_alert</w:t>
+            </w:r>
+          </w:p>
+        </w:tc>
+        <w:tc>
+          <w:tcPr>
+            <w:tcW w:type="dxa" w:w="3024"/>
+            <w:tcBorders>
+              <w:top w:val="single" w:sz="4" w:color="CCCCCC"/>
+              <w:left w:val="single" w:sz="4" w:color="CCCCCC"/>
+              <w:bottom w:val="single" w:sz="4" w:color="CCCCCC"/>
+              <w:right w:val="single" w:sz="4" w:color="CCCCCC"/>
+            </w:tcBorders>
+          </w:tcPr>
+          <w:p>
+            <w:r>
+              <w:rPr>
+                <w:rFonts w:ascii="Arial" w:hAnsi="Arial"/>
+                <w:sz w:val="20"/>
+              </w:rPr>
+              <w:t>Jubilæumsadvarsel</w:t>
+            </w:r>
+          </w:p>
+        </w:tc>
+        <w:tc>
+          <w:tcPr>
+            <w:tcW w:type="dxa" w:w="3024"/>
+            <w:tcBorders>
+              <w:top w:val="single" w:sz="4" w:color="CCCCCC"/>
+              <w:left w:val="single" w:sz="4" w:color="CCCCCC"/>
+              <w:bottom w:val="single" w:sz="4" w:color="CCCCCC"/>
+              <w:right w:val="single" w:sz="4" w:color="CCCCCC"/>
+            </w:tcBorders>
+          </w:tcPr>
+          <w:p>
+            <w:r>
+              <w:rPr>
+                <w:rFonts w:ascii="Arial" w:hAnsi="Arial"/>
+                <w:sz w:val="20"/>
+              </w:rPr>
+              <w:t>Pop-up om 25-, 40- og 50-års jubilæum (afsnit 7.9). Kun Administrator fra start.</w:t>
+            </w:r>
+          </w:p>
+        </w:tc>
+      </w:tr>
+      <w:tr>
+        <w:tc>
+          <w:tcPr>
+            <w:tcW w:type="dxa" w:w="3024"/>
+            <w:tcBorders>
+              <w:top w:val="single" w:sz="4" w:color="CCCCCC"/>
+              <w:left w:val="single" w:sz="4" w:color="CCCCCC"/>
+              <w:bottom w:val="single" w:sz="4" w:color="CCCCCC"/>
+              <w:right w:val="single" w:sz="4" w:color="CCCCCC"/>
+            </w:tcBorders>
+          </w:tcPr>
+          <w:p>
+            <w:r>
+              <w:rPr>
+                <w:rFonts w:ascii="Arial" w:hAnsi="Arial"/>
+                <w:sz w:val="20"/>
+              </w:rPr>
+              <w:t>elev_alert</w:t>
+            </w:r>
+          </w:p>
+        </w:tc>
+        <w:tc>
+          <w:tcPr>
+            <w:tcW w:type="dxa" w:w="3024"/>
+            <w:tcBorders>
+              <w:top w:val="single" w:sz="4" w:color="CCCCCC"/>
+              <w:left w:val="single" w:sz="4" w:color="CCCCCC"/>
+              <w:bottom w:val="single" w:sz="4" w:color="CCCCCC"/>
+              <w:right w:val="single" w:sz="4" w:color="CCCCCC"/>
+            </w:tcBorders>
+          </w:tcPr>
+          <w:p>
+            <w:r>
+              <w:rPr>
+                <w:rFonts w:ascii="Arial" w:hAnsi="Arial"/>
+                <w:sz w:val="20"/>
+              </w:rPr>
+              <w:t>Elevadvarsel</w:t>
+            </w:r>
+          </w:p>
+        </w:tc>
+        <w:tc>
+          <w:tcPr>
+            <w:tcW w:type="dxa" w:w="3024"/>
+            <w:tcBorders>
+              <w:top w:val="single" w:sz="4" w:color="CCCCCC"/>
+              <w:left w:val="single" w:sz="4" w:color="CCCCCC"/>
+              <w:bottom w:val="single" w:sz="4" w:color="CCCCCC"/>
+              <w:right w:val="single" w:sz="4" w:color="CCCCCC"/>
+            </w:tcBorders>
+          </w:tcPr>
+          <w:p>
+            <w:r>
+              <w:rPr>
+                <w:rFonts w:ascii="Arial" w:hAnsi="Arial"/>
+                <w:sz w:val="20"/>
+              </w:rPr>
+              <w:t>Pop-up når en elevtid slutter (afsnit 7.9). Kun Administrator fra start.</w:t>
+            </w:r>
+          </w:p>
+        </w:tc>
+      </w:tr>
+      <w:tr>
+        <w:tc>
+          <w:tcPr>
+            <w:tcW w:type="dxa" w:w="3024"/>
+            <w:tcBorders>
+              <w:top w:val="single" w:sz="4" w:color="CCCCCC"/>
+              <w:left w:val="single" w:sz="4" w:color="CCCCCC"/>
+              <w:bottom w:val="single" w:sz="4" w:color="CCCCCC"/>
+              <w:right w:val="single" w:sz="4" w:color="CCCCCC"/>
+            </w:tcBorders>
+          </w:tcPr>
+          <w:p>
+            <w:r>
+              <w:rPr>
+                <w:rFonts w:ascii="Arial" w:hAnsi="Arial"/>
+                <w:sz w:val="20"/>
+              </w:rPr>
+              <w:t>birthday_alert</w:t>
+            </w:r>
+          </w:p>
+        </w:tc>
+        <w:tc>
+          <w:tcPr>
+            <w:tcW w:type="dxa" w:w="3024"/>
+            <w:tcBorders>
+              <w:top w:val="single" w:sz="4" w:color="CCCCCC"/>
+              <w:left w:val="single" w:sz="4" w:color="CCCCCC"/>
+              <w:bottom w:val="single" w:sz="4" w:color="CCCCCC"/>
+              <w:right w:val="single" w:sz="4" w:color="CCCCCC"/>
+            </w:tcBorders>
+          </w:tcPr>
+          <w:p>
+            <w:r>
+              <w:rPr>
+                <w:rFonts w:ascii="Arial" w:hAnsi="Arial"/>
+                <w:sz w:val="20"/>
+              </w:rPr>
+              <w:t>Fødselsdagsadvarsel</w:t>
+            </w:r>
+          </w:p>
+        </w:tc>
+        <w:tc>
+          <w:tcPr>
+            <w:tcW w:type="dxa" w:w="3024"/>
+            <w:tcBorders>
+              <w:top w:val="single" w:sz="4" w:color="CCCCCC"/>
+              <w:left w:val="single" w:sz="4" w:color="CCCCCC"/>
+              <w:bottom w:val="single" w:sz="4" w:color="CCCCCC"/>
+              <w:right w:val="single" w:sz="4" w:color="CCCCCC"/>
+            </w:tcBorders>
+          </w:tcPr>
+          <w:p>
+            <w:r>
+              <w:rPr>
+                <w:rFonts w:ascii="Arial" w:hAnsi="Arial"/>
+                <w:sz w:val="20"/>
+              </w:rPr>
+              <w:t>Pop-up om runde fødselsdage (afsnit 7.9). Kun Administrator fra start.</w:t>
+            </w:r>
+          </w:p>
+        </w:tc>
+      </w:tr>
+      <w:tr>
+        <w:tc>
+          <w:tcPr>
+            <w:tcW w:type="dxa" w:w="3024"/>
+            <w:tcBorders>
+              <w:top w:val="single" w:sz="4" w:color="CCCCCC"/>
+              <w:left w:val="single" w:sz="4" w:color="CCCCCC"/>
+              <w:bottom w:val="single" w:sz="4" w:color="CCCCCC"/>
+              <w:right w:val="single" w:sz="4" w:color="CCCCCC"/>
+            </w:tcBorders>
+          </w:tcPr>
+          <w:p>
+            <w:r>
+              <w:rPr>
+                <w:rFonts w:ascii="Arial" w:hAnsi="Arial"/>
+                <w:sz w:val="20"/>
+              </w:rPr>
+              <w:t>employee_table_view</w:t>
+            </w:r>
+          </w:p>
+        </w:tc>
+        <w:tc>
+          <w:tcPr>
+            <w:tcW w:type="dxa" w:w="3024"/>
+            <w:tcBorders>
+              <w:top w:val="single" w:sz="4" w:color="CCCCCC"/>
+              <w:left w:val="single" w:sz="4" w:color="CCCCCC"/>
+              <w:bottom w:val="single" w:sz="4" w:color="CCCCCC"/>
+              <w:right w:val="single" w:sz="4" w:color="CCCCCC"/>
+            </w:tcBorders>
+          </w:tcPr>
+          <w:p>
+            <w:r>
+              <w:rPr>
+                <w:rFonts w:ascii="Arial" w:hAnsi="Arial"/>
+                <w:sz w:val="20"/>
+              </w:rPr>
+              <w:t>Tabelvisning af medarbejdere</w:t>
+            </w:r>
+          </w:p>
+        </w:tc>
+        <w:tc>
+          <w:tcPr>
+            <w:tcW w:type="dxa" w:w="3024"/>
+            <w:tcBorders>
+              <w:top w:val="single" w:sz="4" w:color="CCCCCC"/>
+              <w:left w:val="single" w:sz="4" w:color="CCCCCC"/>
+              <w:bottom w:val="single" w:sz="4" w:color="CCCCCC"/>
+              <w:right w:val="single" w:sz="4" w:color="CCCCCC"/>
+            </w:tcBorders>
+          </w:tcPr>
+          <w:p>
+            <w:r>
+              <w:rPr>
+                <w:rFonts w:ascii="Arial" w:hAnsi="Arial"/>
+                <w:sz w:val="20"/>
+              </w:rPr>
+              <w:t>Knappen 'Tabel' på Medarbejdere-siden (afsnit 7.8). Kun Administrator fra start.</w:t>
+            </w:r>
+          </w:p>
+        </w:tc>
+      </w:tr>
+      <w:tr>
+        <w:tc>
+          <w:tcPr>
+            <w:tcW w:type="dxa" w:w="3024"/>
+            <w:tcBorders>
+              <w:top w:val="single" w:sz="4" w:color="CCCCCC"/>
+              <w:left w:val="single" w:sz="4" w:color="CCCCCC"/>
+              <w:bottom w:val="single" w:sz="4" w:color="CCCCCC"/>
+              <w:right w:val="single" w:sz="4" w:color="CCCCCC"/>
+            </w:tcBorders>
+          </w:tcPr>
+          <w:p>
+            <w:r>
+              <w:rPr>
+                <w:rFonts w:ascii="Arial" w:hAnsi="Arial"/>
+                <w:sz w:val="20"/>
+              </w:rPr>
+              <w:t>employee_export</w:t>
+            </w:r>
+          </w:p>
+        </w:tc>
+        <w:tc>
+          <w:tcPr>
+            <w:tcW w:type="dxa" w:w="3024"/>
+            <w:tcBorders>
+              <w:top w:val="single" w:sz="4" w:color="CCCCCC"/>
+              <w:left w:val="single" w:sz="4" w:color="CCCCCC"/>
+              <w:bottom w:val="single" w:sz="4" w:color="CCCCCC"/>
+              <w:right w:val="single" w:sz="4" w:color="CCCCCC"/>
+            </w:tcBorders>
+          </w:tcPr>
+          <w:p>
+            <w:r>
+              <w:rPr>
+                <w:rFonts w:ascii="Arial" w:hAnsi="Arial"/>
+                <w:sz w:val="20"/>
+              </w:rPr>
+              <w:t>Eksportér medarbejderregister</w:t>
+            </w:r>
+          </w:p>
+        </w:tc>
+        <w:tc>
+          <w:tcPr>
+            <w:tcW w:type="dxa" w:w="3024"/>
+            <w:tcBorders>
+              <w:top w:val="single" w:sz="4" w:color="CCCCCC"/>
+              <w:left w:val="single" w:sz="4" w:color="CCCCCC"/>
+              <w:bottom w:val="single" w:sz="4" w:color="CCCCCC"/>
+              <w:right w:val="single" w:sz="4" w:color="CCCCCC"/>
+            </w:tcBorders>
+          </w:tcPr>
+          <w:p>
+            <w:r>
+              <w:rPr>
+                <w:rFonts w:ascii="Arial" w:hAnsi="Arial"/>
+                <w:sz w:val="20"/>
+              </w:rPr>
+              <w:t>Knappen 'Eksportér til Excel' i tabelvisningen (afsnit 7.8). Kun Administrator fra start.</w:t>
             </w:r>
           </w:p>
         </w:tc>

</xml_diff>

<commit_message>
tillæg afsluttes nu den dag, der trykkes afslut. historikken forbliver. Tillæg tæller ikke dobbelt i perioden. dokumentation er også opdateret. Har man en periode med to forskellige tillæg, laves en gennemsnitssats og puttes på linjen i CSV-filen.
</commit_message>
<xml_diff>
--- a/docs/Brugervejledning.docx
+++ b/docs/Brugervejledning.docx
@@ -6540,7 +6540,7 @@
           <w:rFonts w:ascii="Arial" w:hAnsi="Arial"/>
           <w:sz w:val="22"/>
         </w:rPr>
-        <w:t>Klik på medarbejderen. En boks åbner sig med medarbejderens fulde tillægshistorik: status (Aktiv/Inaktiv), lønnummer, tillægsnavn, type, gyldighedsperiode og værdi i kr. Brug 'Fra'/'Til'-felterne til at indsnævre visningen til en bestemt periode – lader du dem stå tomme, vises hele historikken.</w:t>
+        <w:t>Klik på medarbejderen. En boks åbner sig med medarbejderens fulde tillægshistorik: status (Aktiv/Inaktiv/Afsluttet), lønnummer, tillægsnavn, type, gyldighedsperiode og værdi i kr. Brug 'Fra'/'Til'-felterne til at indsnævre visningen til en bestemt periode – lader du dem stå tomme, vises hele historikken.</w:t>
       </w:r>
     </w:p>
     <w:p>
@@ -6585,7 +6585,7 @@
           <w:color w:val="606060"/>
           <w:sz w:val="22"/>
         </w:rPr>
-        <w:t>Når et nyt tillæg oprettes, bliver medarbejderens tidligere tillæg automatisk gjort inaktivt fra og med dagen før den nye startdato. Der findes ikke en 'rediger'-funktion – en fejl rettes ved at oprette et nyt tillæg med den korrekte værdi.</w:t>
+        <w:t>En medarbejder kan have flere aktive tillæg på samme tid – de lægges sammen i lønberegningen. Når et nyt tillæg oprettes, fortsætter de eksisterende derfor uændret. Skal en sats ændres, afslut det gamle tillæg og opret et nyt. Der findes ikke en 'rediger'-funktion.</w:t>
       </w:r>
     </w:p>
     <w:p>
@@ -6597,7 +6597,7 @@
           <w:rFonts w:ascii="Arial" w:hAnsi="Arial"/>
           <w:sz w:val="22"/>
         </w:rPr>
-        <w:t>Har en medarbejder et aktivt tillæg der ikke længere skal gælde, klik 'Afslut' på den aktive række. Tillægget fortsætter med at gælde resten af den igangværende lønperiode og bortfalder først fra den efterfølgende periode – det stopper altså ikke med øjeblikkelig virkning midt i en periode.</w:t>
+        <w:t>Har en medarbejder et aktivt tillæg der ikke længere skal gælde, klik 'Afslut' på den aktive række. Dags dato bliver tillæggets sidste gyldige dag, og det vises derefter som 'Afsluttet'. Tillægget tæller stadig med for de dage, hvor det har været gyldigt – også hvis en tidligere periode køres igen. Starter eller slutter et tillæg midt i en lønperiode, gives det kun for timerne på de dage, hvor det var gyldigt; satsen på lønsedlen/Danløn er så et vægtet gennemsnit.</w:t>
       </w:r>
     </w:p>
     <w:p>

</xml_diff>

<commit_message>
seneste ændring resten af filerne
</commit_message>
<xml_diff>
--- a/docs/Brugervejledning.docx
+++ b/docs/Brugervejledning.docx
@@ -13890,6 +13890,101 @@
           <w:sz w:val="22"/>
         </w:rPr>
         <w:t>I en låst lønperiode kan du hverken registrere, rette eller fjerne fravær eller kommentarer i Vagtplanen (2026-09-30). Fravær oprettet fra Vagtplanen kan rettes og fjernes af brugere med redigeringsret til linjen, også uden 'Redigér aktiviteter'/'Godkend aktiviteter'.</w:t>
+      </w:r>
+    </w:p>
+    <w:p>
+      <w:pPr>
+        <w:pStyle w:val="Heading2"/>
+        <w:spacing w:before="200" w:after="120"/>
+      </w:pPr>
+      <w:r>
+        <w:rPr>
+          <w:rFonts w:ascii="Arial" w:hAnsi="Arial"/>
+          <w:b/>
+          <w:color w:val="2E6DB8"/>
+          <w:sz w:val="26"/>
+        </w:rPr>
+        <w:t>14.3  Gentagelse</w:t>
+      </w:r>
+    </w:p>
+    <w:p>
+      <w:pPr>
+        <w:spacing w:after="120"/>
+      </w:pPr>
+      <w:r>
+        <w:rPr>
+          <w:rFonts w:ascii="Arial" w:hAnsi="Arial"/>
+          <w:sz w:val="22"/>
+        </w:rPr>
+        <w:t>Afkryds 'Gentagelse' i registreringsvinduet for at oprette det samme fravær eller den samme kommentar flere gange:</w:t>
+      </w:r>
+    </w:p>
+    <w:p>
+      <w:pPr>
+        <w:pStyle w:val="ListBullet"/>
+        <w:spacing w:after="40"/>
+        <w:ind w:left="454"/>
+      </w:pPr>
+      <w:r>
+        <w:rPr>
+          <w:rFonts w:ascii="Arial" w:hAnsi="Arial"/>
+          <w:sz w:val="22"/>
+        </w:rPr>
+        <w:t>Ugentligt: vælg en eller flere ugedage (fx hver mandag og torsdag) og evt. 'Hver 2. uge' (1-4, talt fra startdatoens uge).</w:t>
+      </w:r>
+    </w:p>
+    <w:p>
+      <w:pPr>
+        <w:pStyle w:val="ListBullet"/>
+        <w:spacing w:after="40"/>
+        <w:ind w:left="454"/>
+      </w:pPr>
+      <w:r>
+        <w:rPr>
+          <w:rFonts w:ascii="Arial" w:hAnsi="Arial"/>
+          <w:sz w:val="22"/>
+        </w:rPr>
+        <w:t>Månedligt: samme ugedag i måneden som startdatoen (fx hver 2. tirsdag – eller sidste fredag).</w:t>
+      </w:r>
+    </w:p>
+    <w:p>
+      <w:pPr>
+        <w:pStyle w:val="ListBullet"/>
+        <w:spacing w:after="40"/>
+        <w:ind w:left="454"/>
+      </w:pPr>
+      <w:r>
+        <w:rPr>
+          <w:rFonts w:ascii="Arial" w:hAnsi="Arial"/>
+          <w:sz w:val="22"/>
+        </w:rPr>
+        <w:t>Slutter: efter et antal gange (maks. 100) eller på en dato (maks. 1 år frem).</w:t>
+      </w:r>
+    </w:p>
+    <w:p>
+      <w:pPr>
+        <w:pStyle w:val="ListBullet"/>
+        <w:spacing w:after="40"/>
+        <w:ind w:left="454"/>
+      </w:pPr>
+      <w:r>
+        <w:rPr>
+          <w:rFonts w:ascii="Arial" w:hAnsi="Arial"/>
+          <w:sz w:val="22"/>
+        </w:rPr>
+        <w:t>Fravær springer helligdage over og tager næste dag i stedet; kommentarer oprettes også på helligdage. Findes der allerede en kommentar på en dag, overskrives den ikke.</w:t>
+      </w:r>
+    </w:p>
+    <w:p>
+      <w:pPr>
+        <w:spacing w:after="120"/>
+      </w:pPr>
+      <w:r>
+        <w:rPr>
+          <w:rFonts w:ascii="Arial" w:hAnsi="Arial"/>
+          <w:sz w:val="22"/>
+        </w:rPr>
+        <w:t>Åbn en vilkårlig forekomst for at ændre antal/slutdato for hele serien, slette kun denne forekomst eller slette hele serien. Forekomster i en låst lønperiode bevares altid.</w:t>
       </w:r>
     </w:p>
     <w:p>

</xml_diff>

<commit_message>
dagsplan opdateret med filtre og funktioner
</commit_message>
<xml_diff>
--- a/docs/Brugervejledning.docx
+++ b/docs/Brugervejledning.docx
@@ -13318,7 +13318,19 @@
           <w:rFonts w:ascii="Arial" w:hAnsi="Arial"/>
           <w:sz w:val="22"/>
         </w:rPr>
-        <w:t>Øverst navigerer du mellem dage med ◀ / ▶ eller datovælgeren (default: dags dato). Disponentgruppe-filteret og det søgbare medarbejder-filter indsnævrer kun hovedtabellen – sidelisten er altid upåvirket af filtrene. Sidelisten viser aktive medarbejdere i de disponentgrupper der vises i aktivitetsoversigten; medarbejdere uden gruppe er ikke med.</w:t>
+        <w:t>Øverst navigerer du mellem dage med ◀ / ▶ eller datovælgeren (default: dags dato). Disponentgruppe-filteret (viser kun grupper med 'Medtag i Dagsplan') og det søgbare medarbejder-filter indsnævrer kun hovedtabellen – sidelisten er altid upåvirket af filtrene. Sidelisten og chauffør-vælgeren viser de samme personer: aktive medarbejdere, der ikke er funktionærer, i disponentgrupper med fluebenet 'Medtag i Dagsplan' (Stamdata → Disponentgrupper). Medarbejdere uden gruppe er ikke med.</w:t>
+      </w:r>
+    </w:p>
+    <w:p>
+      <w:pPr>
+        <w:spacing w:after="120"/>
+      </w:pPr>
+      <w:r>
+        <w:rPr>
+          <w:rFonts w:ascii="Arial" w:hAnsi="Arial"/>
+          <w:sz w:val="22"/>
+        </w:rPr>
+        <w:t>Vogntype-filteret (afkrydsning, flere valg) indsnævrer også kun hovedtabellen. Typen udledes af første bogstav i vognens Beskrivelse – store/små bogstaver og mellemrum foran ignoreres:</w:t>
       </w:r>
     </w:p>
     <w:tbl>
@@ -13334,35 +13346,43 @@
       <w:tr>
         <w:tc>
           <w:tcPr>
-            <w:tcW w:type="dxa" w:w="4536"/>
-            <w:shd w:val="clear" w:color="auto" w:fill="1B3A6B"/>
+            <w:tcW w:type="dxa" w:w="2835"/>
+            <w:shd w:val="clear" w:color="auto" w:fill="D5E8F5"/>
+            <w:tcBorders>
+              <w:top w:val="single" w:sz="4" w:color="9BBDD6"/>
+              <w:left w:val="single" w:sz="4" w:color="9BBDD6"/>
+              <w:bottom w:val="single" w:sz="4" w:color="9BBDD6"/>
+              <w:right w:val="single" w:sz="4" w:color="9BBDD6"/>
+            </w:tcBorders>
           </w:tcPr>
           <w:p>
             <w:r>
               <w:rPr>
                 <w:rFonts w:ascii="Arial" w:hAnsi="Arial"/>
                 <w:b/>
-                <w:color w:val="FFFFFF"/>
-                <w:sz w:val="20"/>
-              </w:rPr>
-              <w:t>Kolonne</w:t>
-            </w:r>
-          </w:p>
-        </w:tc>
-        <w:tc>
-          <w:tcPr>
-            <w:tcW w:type="dxa" w:w="4536"/>
-            <w:shd w:val="clear" w:color="auto" w:fill="1B3A6B"/>
-          </w:tcPr>
-          <w:p>
-            <w:r>
-              <w:rPr>
-                <w:rFonts w:ascii="Arial" w:hAnsi="Arial"/>
-                <w:b/>
-                <w:color w:val="FFFFFF"/>
-                <w:sz w:val="20"/>
-              </w:rPr>
-              <w:t>Indhold</w:t>
+                <w:sz w:val="20"/>
+              </w:rPr>
+              <w:t>Forvogn</w:t>
+            </w:r>
+          </w:p>
+        </w:tc>
+        <w:tc>
+          <w:tcPr>
+            <w:tcW w:type="dxa" w:w="6520"/>
+            <w:tcBorders>
+              <w:top w:val="single" w:sz="4" w:color="9BBDD6"/>
+              <w:left w:val="single" w:sz="4" w:color="9BBDD6"/>
+              <w:bottom w:val="single" w:sz="4" w:color="9BBDD6"/>
+              <w:right w:val="single" w:sz="4" w:color="9BBDD6"/>
+            </w:tcBorders>
+          </w:tcPr>
+          <w:p>
+            <w:r>
+              <w:rPr>
+                <w:rFonts w:ascii="Arial" w:hAnsi="Arial"/>
+                <w:sz w:val="20"/>
+              </w:rPr>
+              <w:t>Beskrivelsen starter med F eller M.</w:t>
             </w:r>
           </w:p>
         </w:tc>
@@ -13370,41 +13390,43 @@
       <w:tr>
         <w:tc>
           <w:tcPr>
-            <w:tcW w:type="dxa" w:w="4536"/>
-            <w:tcBorders>
-              <w:top w:val="single" w:sz="4" w:color="CCCCCC"/>
-              <w:left w:val="single" w:sz="4" w:color="CCCCCC"/>
-              <w:bottom w:val="single" w:sz="4" w:color="CCCCCC"/>
-              <w:right w:val="single" w:sz="4" w:color="CCCCCC"/>
-            </w:tcBorders>
-          </w:tcPr>
-          <w:p>
-            <w:r>
-              <w:rPr>
-                <w:rFonts w:ascii="Arial" w:hAnsi="Arial"/>
-                <w:sz w:val="20"/>
-              </w:rPr>
-              <w:t>Vognnummer</w:t>
-            </w:r>
-          </w:p>
-        </w:tc>
-        <w:tc>
-          <w:tcPr>
-            <w:tcW w:type="dxa" w:w="4536"/>
-            <w:tcBorders>
-              <w:top w:val="single" w:sz="4" w:color="CCCCCC"/>
-              <w:left w:val="single" w:sz="4" w:color="CCCCCC"/>
-              <w:bottom w:val="single" w:sz="4" w:color="CCCCCC"/>
-              <w:right w:val="single" w:sz="4" w:color="CCCCCC"/>
-            </w:tcBorders>
-          </w:tcPr>
-          <w:p>
-            <w:r>
-              <w:rPr>
-                <w:rFonts w:ascii="Arial" w:hAnsi="Arial"/>
-                <w:sz w:val="20"/>
-              </w:rPr>
-              <w:t>Vognens nummer (fra Vognpark).</w:t>
+            <w:tcW w:type="dxa" w:w="2835"/>
+            <w:shd w:val="clear" w:color="auto" w:fill="D5E8F5"/>
+            <w:tcBorders>
+              <w:top w:val="single" w:sz="4" w:color="9BBDD6"/>
+              <w:left w:val="single" w:sz="4" w:color="9BBDD6"/>
+              <w:bottom w:val="single" w:sz="4" w:color="9BBDD6"/>
+              <w:right w:val="single" w:sz="4" w:color="9BBDD6"/>
+            </w:tcBorders>
+          </w:tcPr>
+          <w:p>
+            <w:r>
+              <w:rPr>
+                <w:rFonts w:ascii="Arial" w:hAnsi="Arial"/>
+                <w:b/>
+                <w:sz w:val="20"/>
+              </w:rPr>
+              <w:t>Trækker</w:t>
+            </w:r>
+          </w:p>
+        </w:tc>
+        <w:tc>
+          <w:tcPr>
+            <w:tcW w:type="dxa" w:w="6520"/>
+            <w:tcBorders>
+              <w:top w:val="single" w:sz="4" w:color="9BBDD6"/>
+              <w:left w:val="single" w:sz="4" w:color="9BBDD6"/>
+              <w:bottom w:val="single" w:sz="4" w:color="9BBDD6"/>
+              <w:right w:val="single" w:sz="4" w:color="9BBDD6"/>
+            </w:tcBorders>
+          </w:tcPr>
+          <w:p>
+            <w:r>
+              <w:rPr>
+                <w:rFonts w:ascii="Arial" w:hAnsi="Arial"/>
+                <w:sz w:val="20"/>
+              </w:rPr>
+              <w:t>Beskrivelsen starter med T.</w:t>
             </w:r>
           </w:p>
         </w:tc>
@@ -13412,41 +13434,43 @@
       <w:tr>
         <w:tc>
           <w:tcPr>
-            <w:tcW w:type="dxa" w:w="4536"/>
-            <w:tcBorders>
-              <w:top w:val="single" w:sz="4" w:color="CCCCCC"/>
-              <w:left w:val="single" w:sz="4" w:color="CCCCCC"/>
-              <w:bottom w:val="single" w:sz="4" w:color="CCCCCC"/>
-              <w:right w:val="single" w:sz="4" w:color="CCCCCC"/>
-            </w:tcBorders>
-          </w:tcPr>
-          <w:p>
-            <w:r>
-              <w:rPr>
-                <w:rFonts w:ascii="Arial" w:hAnsi="Arial"/>
-                <w:sz w:val="20"/>
-              </w:rPr>
-              <w:t>Beskrivelse</w:t>
-            </w:r>
-          </w:p>
-        </w:tc>
-        <w:tc>
-          <w:tcPr>
-            <w:tcW w:type="dxa" w:w="4536"/>
-            <w:tcBorders>
-              <w:top w:val="single" w:sz="4" w:color="CCCCCC"/>
-              <w:left w:val="single" w:sz="4" w:color="CCCCCC"/>
-              <w:bottom w:val="single" w:sz="4" w:color="CCCCCC"/>
-              <w:right w:val="single" w:sz="4" w:color="CCCCCC"/>
-            </w:tcBorders>
-          </w:tcPr>
-          <w:p>
-            <w:r>
-              <w:rPr>
-                <w:rFonts w:ascii="Arial" w:hAnsi="Arial"/>
-                <w:sz w:val="20"/>
-              </w:rPr>
-              <w:t>Vognens beskrivelse, hvis udfyldt under Vognpark.</w:t>
+            <w:tcW w:type="dxa" w:w="2835"/>
+            <w:shd w:val="clear" w:color="auto" w:fill="D5E8F5"/>
+            <w:tcBorders>
+              <w:top w:val="single" w:sz="4" w:color="9BBDD6"/>
+              <w:left w:val="single" w:sz="4" w:color="9BBDD6"/>
+              <w:bottom w:val="single" w:sz="4" w:color="9BBDD6"/>
+              <w:right w:val="single" w:sz="4" w:color="9BBDD6"/>
+            </w:tcBorders>
+          </w:tcPr>
+          <w:p>
+            <w:r>
+              <w:rPr>
+                <w:rFonts w:ascii="Arial" w:hAnsi="Arial"/>
+                <w:b/>
+                <w:sz w:val="20"/>
+              </w:rPr>
+              <w:t>Ladbil</w:t>
+            </w:r>
+          </w:p>
+        </w:tc>
+        <w:tc>
+          <w:tcPr>
+            <w:tcW w:type="dxa" w:w="6520"/>
+            <w:tcBorders>
+              <w:top w:val="single" w:sz="4" w:color="9BBDD6"/>
+              <w:left w:val="single" w:sz="4" w:color="9BBDD6"/>
+              <w:bottom w:val="single" w:sz="4" w:color="9BBDD6"/>
+              <w:right w:val="single" w:sz="4" w:color="9BBDD6"/>
+            </w:tcBorders>
+          </w:tcPr>
+          <w:p>
+            <w:r>
+              <w:rPr>
+                <w:rFonts w:ascii="Arial" w:hAnsi="Arial"/>
+                <w:sz w:val="20"/>
+              </w:rPr>
+              <w:t>Beskrivelsen starter med L.</w:t>
             </w:r>
           </w:p>
         </w:tc>
@@ -13454,125 +13478,43 @@
       <w:tr>
         <w:tc>
           <w:tcPr>
-            <w:tcW w:type="dxa" w:w="4536"/>
-            <w:tcBorders>
-              <w:top w:val="single" w:sz="4" w:color="CCCCCC"/>
-              <w:left w:val="single" w:sz="4" w:color="CCCCCC"/>
-              <w:bottom w:val="single" w:sz="4" w:color="CCCCCC"/>
-              <w:right w:val="single" w:sz="4" w:color="CCCCCC"/>
-            </w:tcBorders>
-          </w:tcPr>
-          <w:p>
-            <w:r>
-              <w:rPr>
-                <w:rFonts w:ascii="Arial" w:hAnsi="Arial"/>
-                <w:sz w:val="20"/>
-              </w:rPr>
-              <w:t>Chauffør</w:t>
-            </w:r>
-          </w:p>
-        </w:tc>
-        <w:tc>
-          <w:tcPr>
-            <w:tcW w:type="dxa" w:w="4536"/>
-            <w:tcBorders>
-              <w:top w:val="single" w:sz="4" w:color="CCCCCC"/>
-              <w:left w:val="single" w:sz="4" w:color="CCCCCC"/>
-              <w:bottom w:val="single" w:sz="4" w:color="CCCCCC"/>
-              <w:right w:val="single" w:sz="4" w:color="CCCCCC"/>
-            </w:tcBorders>
-          </w:tcPr>
-          <w:p>
-            <w:r>
-              <w:rPr>
-                <w:rFonts w:ascii="Arial" w:hAnsi="Arial"/>
-                <w:sz w:val="20"/>
-              </w:rPr>
-              <w:t>Søgbar medarbejder-vælger. Er medarbejderens 'Fast bil' sat til denne vogn (se afsnit 7.2), foreslås vedkommende automatisk – forslaget kan altid ændres.</w:t>
-            </w:r>
-          </w:p>
-        </w:tc>
-      </w:tr>
-      <w:tr>
-        <w:tc>
-          <w:tcPr>
-            <w:tcW w:type="dxa" w:w="4536"/>
-            <w:tcBorders>
-              <w:top w:val="single" w:sz="4" w:color="CCCCCC"/>
-              <w:left w:val="single" w:sz="4" w:color="CCCCCC"/>
-              <w:bottom w:val="single" w:sz="4" w:color="CCCCCC"/>
-              <w:right w:val="single" w:sz="4" w:color="CCCCCC"/>
-            </w:tcBorders>
-          </w:tcPr>
-          <w:p>
-            <w:r>
-              <w:rPr>
-                <w:rFonts w:ascii="Arial" w:hAnsi="Arial"/>
-                <w:sz w:val="20"/>
-              </w:rPr>
-              <w:t>Opgave</w:t>
-            </w:r>
-          </w:p>
-        </w:tc>
-        <w:tc>
-          <w:tcPr>
-            <w:tcW w:type="dxa" w:w="4536"/>
-            <w:tcBorders>
-              <w:top w:val="single" w:sz="4" w:color="CCCCCC"/>
-              <w:left w:val="single" w:sz="4" w:color="CCCCCC"/>
-              <w:bottom w:val="single" w:sz="4" w:color="CCCCCC"/>
-              <w:right w:val="single" w:sz="4" w:color="CCCCCC"/>
-            </w:tcBorders>
-          </w:tcPr>
-          <w:p>
-            <w:r>
-              <w:rPr>
-                <w:rFonts w:ascii="Arial" w:hAnsi="Arial"/>
-                <w:sz w:val="20"/>
-              </w:rPr>
-              <w:t>Frit tekstfelt.</w:t>
-            </w:r>
-          </w:p>
-        </w:tc>
-      </w:tr>
-      <w:tr>
-        <w:tc>
-          <w:tcPr>
-            <w:tcW w:type="dxa" w:w="4536"/>
-            <w:tcBorders>
-              <w:top w:val="single" w:sz="4" w:color="CCCCCC"/>
-              <w:left w:val="single" w:sz="4" w:color="CCCCCC"/>
-              <w:bottom w:val="single" w:sz="4" w:color="CCCCCC"/>
-              <w:right w:val="single" w:sz="4" w:color="CCCCCC"/>
-            </w:tcBorders>
-          </w:tcPr>
-          <w:p>
-            <w:r>
-              <w:rPr>
-                <w:rFonts w:ascii="Arial" w:hAnsi="Arial"/>
-                <w:sz w:val="20"/>
-              </w:rPr>
-              <w:t>Informeret</w:t>
-            </w:r>
-          </w:p>
-        </w:tc>
-        <w:tc>
-          <w:tcPr>
-            <w:tcW w:type="dxa" w:w="4536"/>
-            <w:tcBorders>
-              <w:top w:val="single" w:sz="4" w:color="CCCCCC"/>
-              <w:left w:val="single" w:sz="4" w:color="CCCCCC"/>
-              <w:bottom w:val="single" w:sz="4" w:color="CCCCCC"/>
-              <w:right w:val="single" w:sz="4" w:color="CCCCCC"/>
-            </w:tcBorders>
-          </w:tcPr>
-          <w:p>
-            <w:r>
-              <w:rPr>
-                <w:rFonts w:ascii="Arial" w:hAnsi="Arial"/>
-                <w:sz w:val="20"/>
-              </w:rPr>
-              <w:t>Afkrydsningsfelt – markér når chaufføren er informeret om dagens tildeling.</w:t>
+            <w:tcW w:type="dxa" w:w="2835"/>
+            <w:shd w:val="clear" w:color="auto" w:fill="D5E8F5"/>
+            <w:tcBorders>
+              <w:top w:val="single" w:sz="4" w:color="9BBDD6"/>
+              <w:left w:val="single" w:sz="4" w:color="9BBDD6"/>
+              <w:bottom w:val="single" w:sz="4" w:color="9BBDD6"/>
+              <w:right w:val="single" w:sz="4" w:color="9BBDD6"/>
+            </w:tcBorders>
+          </w:tcPr>
+          <w:p>
+            <w:r>
+              <w:rPr>
+                <w:rFonts w:ascii="Arial" w:hAnsi="Arial"/>
+                <w:b/>
+                <w:sz w:val="20"/>
+              </w:rPr>
+              <w:t>Øvrige</w:t>
+            </w:r>
+          </w:p>
+        </w:tc>
+        <w:tc>
+          <w:tcPr>
+            <w:tcW w:type="dxa" w:w="6520"/>
+            <w:tcBorders>
+              <w:top w:val="single" w:sz="4" w:color="9BBDD6"/>
+              <w:left w:val="single" w:sz="4" w:color="9BBDD6"/>
+              <w:bottom w:val="single" w:sz="4" w:color="9BBDD6"/>
+              <w:right w:val="single" w:sz="4" w:color="9BBDD6"/>
+            </w:tcBorders>
+          </w:tcPr>
+          <w:p>
+            <w:r>
+              <w:rPr>
+                <w:rFonts w:ascii="Arial" w:hAnsi="Arial"/>
+                <w:sz w:val="20"/>
+              </w:rPr>
+              <w:t>Alt andet, også vogne uden beskrivelse.</w:t>
             </w:r>
           </w:p>
         </w:tc>
@@ -13588,63 +13530,7 @@
           <w:rFonts w:ascii="Arial" w:hAnsi="Arial"/>
           <w:sz w:val="22"/>
         </w:rPr>
-        <w:t>Under hovedtabellen findes 10 faste 'EKSTRA'-rækker til hjælp på pladsen eller lærlinge – samme felter som ovenfor, men uden vognnummer og uden vognnummer-autoudfyldning på aktiviteter.</w:t>
-      </w:r>
-    </w:p>
-    <w:p>
-      <w:pPr>
-        <w:pStyle w:val="ListBullet"/>
-        <w:spacing w:after="40"/>
-        <w:ind w:left="454"/>
-      </w:pPr>
-      <w:r>
-        <w:rPr>
-          <w:rFonts w:ascii="Arial" w:hAnsi="Arial"/>
-          <w:sz w:val="22"/>
-        </w:rPr>
-        <w:t>En medarbejder med registreret fravær den valgte dag vises med rødt i sidelisten – og forbliver rødt, selv hvis vedkommende samtidig er skrevet i en Chauffør-kolonne. OBS: overnatning tæller også som fravær her.</w:t>
-      </w:r>
-    </w:p>
-    <w:p>
-      <w:pPr>
-        <w:pStyle w:val="ListBullet"/>
-        <w:spacing w:after="40"/>
-        <w:ind w:left="454"/>
-      </w:pPr>
-      <w:r>
-        <w:rPr>
-          <w:rFonts w:ascii="Arial" w:hAnsi="Arial"/>
-          <w:sz w:val="22"/>
-        </w:rPr>
-        <w:t>En medarbejder med en vagtplan-kommentar den dag vises med gult (også hvis der samtidig er fravær – så vises kommentaren). Grøn = tildelt en vogn/EKSTRA-plads, grå = hverken tildelt eller fraværende.</w:t>
-      </w:r>
-    </w:p>
-    <w:p>
-      <w:pPr>
-        <w:pStyle w:val="ListBullet"/>
-        <w:spacing w:after="40"/>
-        <w:ind w:left="454"/>
-      </w:pPr>
-      <w:r>
-        <w:rPr>
-          <w:rFonts w:ascii="Arial" w:hAnsi="Arial"/>
-          <w:sz w:val="22"/>
-        </w:rPr>
-        <w:t>En vogn med meldt materielt fravær (se afsnit 13.2) vises rødt i hovedtabellen.</w:t>
-      </w:r>
-    </w:p>
-    <w:p>
-      <w:pPr>
-        <w:pStyle w:val="ListBullet"/>
-        <w:spacing w:after="40"/>
-        <w:ind w:left="454"/>
-      </w:pPr>
-      <w:r>
-        <w:rPr>
-          <w:rFonts w:ascii="Arial" w:hAnsi="Arial"/>
-          <w:sz w:val="22"/>
-        </w:rPr>
-        <w:t>Er der uoverensstemmelse mellem den tildelte vogn og vognnummeret på chaufførens egen 'normal tid'-aktivitet den dag, vises et ⚠️-ikon med tooltip 'vognnummer i løn: xxx' ved chaufførnavnet.</w:t>
+        <w:t>Er intet afkrydset, vises alle vogne. Når en type er valgt, vises EKSTRA-rækker kun, hvis der er valgt en vogn på rækken, som passer til filtrene – tomme EKSTRA-rækker skjules.</w:t>
       </w:r>
     </w:p>
     <w:p>
@@ -13659,7 +13545,7 @@
           <w:color w:val="2E6DB8"/>
           <w:sz w:val="22"/>
         </w:rPr>
-        <w:t xml:space="preserve">BEMÆRK: </w:t>
+        <w:t xml:space="preserve">GODT AT VIDE: </w:t>
       </w:r>
       <w:r>
         <w:rPr>
@@ -13667,7 +13553,7 @@
           <w:color w:val="606060"/>
           <w:sz w:val="22"/>
         </w:rPr>
-        <w:t>Forsøger du at tildele en medarbejder, der allerede har en anden tildeling (eller registreret fravær) samme dag, viser systemet en advarsel i stedet for at blokere handlingen – bekræfter du, gennemføres dobbelttildelingen alligevel.</w:t>
+        <w:t>Afdeling og vogntype lægges SAMMEN: vælger du fx afdelingen Storkran og krydser 'Trækker' af, ser du alle Storkrans vogne PLUS alle afdelingers trækkere. Medarbejder-filteret skal derimod altid passe – vælger du en medarbejder, vises kun vogne med den medarbejder.</w:t>
       </w:r>
     </w:p>
     <w:p>
@@ -13682,7 +13568,7 @@
           <w:color w:val="2E6DB8"/>
           <w:sz w:val="22"/>
         </w:rPr>
-        <w:t xml:space="preserve">GODT AT VIDE: </w:t>
+        <w:t xml:space="preserve">VIGTIGT: </w:t>
       </w:r>
       <w:r>
         <w:rPr>
@@ -13690,487 +13576,7 @@
           <w:color w:val="606060"/>
           <w:sz w:val="22"/>
         </w:rPr>
-        <w:t>Opretter du en 'normal tid'-aktivitet for en chauffør med en tildelt vogn i Dagsplan den pågældende dag, udfyldes vognnummeret automatisk på aktiviteten – medmindre feltet allerede er udfyldt. Dette rører ikke ved fraværstyper eller EKSTRA-rækkerne.</w:t>
-      </w:r>
-    </w:p>
-    <w:p>
-      <w:pPr>
-        <w:pStyle w:val="Heading2"/>
-        <w:spacing w:before="200" w:after="120"/>
-      </w:pPr>
-      <w:r>
-        <w:rPr>
-          <w:rFonts w:ascii="Arial" w:hAnsi="Arial"/>
-          <w:b/>
-          <w:color w:val="2E6DB8"/>
-          <w:sz w:val="26"/>
-        </w:rPr>
-        <w:t>13.2  Materiel fravær-fanen</w:t>
-      </w:r>
-    </w:p>
-    <w:p>
-      <w:pPr>
-        <w:spacing w:after="120"/>
-      </w:pPr>
-      <w:r>
-        <w:rPr>
-          <w:rFonts w:ascii="Arial" w:hAnsi="Arial"/>
-          <w:sz w:val="22"/>
-        </w:rPr>
-        <w:t>Registrér når en vogn er ude af drift (værksted, reparation m.m.). Klik 'Meld materielt fravær' (kræver 'Redigér dagsplan') og angiv vogn, 'Fra dato' (default: fanens valgte dato), en valgfri 'Til dato' (tom betyder étdags-fravær) samt en kommentar. Tabellen nedenfor viser dagens meldte fravær med en slet-knap.</w:t>
-      </w:r>
-    </w:p>
-    <w:p>
-      <w:r>
-        <w:br w:type="page"/>
-      </w:r>
-    </w:p>
-    <w:p>
-      <w:pPr>
-        <w:pStyle w:val="Heading1"/>
-        <w:spacing w:before="360" w:after="120"/>
-      </w:pPr>
-      <w:r>
-        <w:rPr>
-          <w:rFonts w:ascii="Arial" w:hAnsi="Arial"/>
-          <w:b/>
-          <w:color w:val="1B3A6B"/>
-          <w:sz w:val="32"/>
-        </w:rPr>
-        <w:t>14  Vagtplan</w:t>
-      </w:r>
-    </w:p>
-    <w:p>
-      <w:pPr>
-        <w:spacing w:after="120"/>
-      </w:pPr>
-      <w:r>
-        <w:rPr>
-          <w:rFonts w:ascii="Arial" w:hAnsi="Arial"/>
-          <w:sz w:val="22"/>
-        </w:rPr>
-        <w:t>Klik på '🗓️ Vagtplan' i venstre menu for at se en 3-ugers oversigt (forrige, denne og næste uge) over alle medarbejderes fravær og kommentarer, med ugenummer i kolonneoverskriften. Kræver rettigheden 'Se vagtplan'; redigering kræver desuden enten 'Redigér egen linje i vagtplan' (kun din egen række) eller 'Redigér alle linjer i vagtplan'.</w:t>
-      </w:r>
-    </w:p>
-    <w:p>
-      <w:pPr>
-        <w:pStyle w:val="Heading2"/>
-        <w:spacing w:before="200" w:after="120"/>
-      </w:pPr>
-      <w:r>
-        <w:rPr>
-          <w:rFonts w:ascii="Arial" w:hAnsi="Arial"/>
-          <w:b/>
-          <w:color w:val="2E6DB8"/>
-          <w:sz w:val="26"/>
-        </w:rPr>
-        <w:t>14.1  Registrering</w:t>
-      </w:r>
-    </w:p>
-    <w:p>
-      <w:pPr>
-        <w:spacing w:after="120"/>
-      </w:pPr>
-      <w:r>
-        <w:rPr>
-          <w:rFonts w:ascii="Arial" w:hAnsi="Arial"/>
-          <w:sz w:val="22"/>
-        </w:rPr>
-        <w:t>Klik på en tom celle for at registrere fravær eller en kommentar for medarbejderen den dag:</w:t>
-      </w:r>
-    </w:p>
-    <w:p>
-      <w:pPr>
-        <w:pStyle w:val="ListBullet"/>
-        <w:spacing w:after="40"/>
-        <w:ind w:left="454"/>
-      </w:pPr>
-      <w:r>
-        <w:rPr>
-          <w:rFonts w:ascii="Arial" w:hAnsi="Arial"/>
-          <w:sz w:val="22"/>
-        </w:rPr>
-        <w:t>Vælg en almindelig fraværstype (ferie, sygdom osv.) for at oprette en rigtig aktivitet – nøjagtig samme modal som i Aktivitetsoversigten (kapitel 6).</w:t>
-      </w:r>
-    </w:p>
-    <w:p>
-      <w:pPr>
-        <w:pStyle w:val="ListBullet"/>
-        <w:spacing w:after="40"/>
-        <w:ind w:left="454"/>
-      </w:pPr>
-      <w:r>
-        <w:rPr>
-          <w:rFonts w:ascii="Arial" w:hAnsi="Arial"/>
-          <w:sz w:val="22"/>
-        </w:rPr>
-        <w:t>Vælg 'Ingen (kun kommentar)' for blot at skrive en fri tekstnote uden at oprette nogen aktivitet – bruges fx til 'ringer ind kl. 10' eller lignende driftsnoter.</w:t>
-      </w:r>
-    </w:p>
-    <w:p>
-      <w:pPr>
-        <w:spacing w:after="120"/>
-      </w:pPr>
-      <w:r>
-        <w:rPr>
-          <w:rFonts w:ascii="Arial" w:hAnsi="Arial"/>
-          <w:sz w:val="22"/>
-        </w:rPr>
-        <w:t>Klik på en udfyldt celle for at se/redigere den. Fraværsaktiviteter åbner samme aktivitetsdetalje som i Aktivitetsoversigten; rene kommentarer åbner en lille rediger/slet-boks.</w:t>
-      </w:r>
-    </w:p>
-    <w:p>
-      <w:pPr>
-        <w:pStyle w:val="Heading2"/>
-        <w:spacing w:before="200" w:after="120"/>
-      </w:pPr>
-      <w:r>
-        <w:rPr>
-          <w:rFonts w:ascii="Arial" w:hAnsi="Arial"/>
-          <w:b/>
-          <w:color w:val="2E6DB8"/>
-          <w:sz w:val="26"/>
-        </w:rPr>
-        <w:t>14.2  Filtrering og 'Fravær i morgen'</w:t>
-      </w:r>
-    </w:p>
-    <w:p>
-      <w:pPr>
-        <w:spacing w:after="120"/>
-      </w:pPr>
-      <w:r>
-        <w:rPr>
-          <w:rFonts w:ascii="Arial" w:hAnsi="Arial"/>
-          <w:sz w:val="22"/>
-        </w:rPr>
-        <w:t>Afdelingsfiltret er en flervalgsliste (klik for at vælge flere grupper ad gangen; klik 'Vælg alle' først for kun at isolere én gruppe). Knappen 'Fravær i morgen' åbner en hurtig opsummering af alle medarbejdere (inden for det valgte filter) der har fravær eller en kommentar registreret på dagen efter i dag – uden at du behøver bladre en hel uge frem.</w:t>
-      </w:r>
-    </w:p>
-    <w:p>
-      <w:pPr>
-        <w:spacing w:before="80" w:after="160"/>
-        <w:ind w:left="283" w:right="283"/>
-      </w:pPr>
-      <w:r>
-        <w:rPr>
-          <w:rFonts w:ascii="Arial" w:hAnsi="Arial"/>
-          <w:b/>
-          <w:color w:val="2E6DB8"/>
-          <w:sz w:val="22"/>
-        </w:rPr>
-        <w:t xml:space="preserve">GODT AT VIDE: </w:t>
-      </w:r>
-      <w:r>
-        <w:rPr>
-          <w:rFonts w:ascii="Arial" w:hAnsi="Arial"/>
-          <w:color w:val="606060"/>
-          <w:sz w:val="22"/>
-        </w:rPr>
-        <w:t>Vagtplan og Aktivitetsoversigten viser samme underliggende data – opretter du en fraværsaktivitet i Vagtplan, ses den også i Aktivitetsoversigten, og omvendt.</w:t>
-      </w:r>
-    </w:p>
-    <w:p>
-      <w:pPr>
-        <w:spacing w:before="80" w:after="160"/>
-        <w:ind w:left="283" w:right="283"/>
-      </w:pPr>
-      <w:r>
-        <w:rPr>
-          <w:rFonts w:ascii="Arial" w:hAnsi="Arial"/>
-          <w:b/>
-          <w:color w:val="2E6DB8"/>
-          <w:sz w:val="22"/>
-        </w:rPr>
-        <w:t xml:space="preserve">BEMÆRK: </w:t>
-      </w:r>
-      <w:r>
-        <w:rPr>
-          <w:rFonts w:ascii="Arial" w:hAnsi="Arial"/>
-          <w:color w:val="606060"/>
-          <w:sz w:val="22"/>
-        </w:rPr>
-        <w:t>I en låst lønperiode kan du hverken registrere, rette eller fjerne fravær eller kommentarer i Vagtplanen (2026-09-30). Fravær oprettet fra Vagtplanen kan rettes og fjernes af brugere med redigeringsret til linjen, også uden 'Redigér aktiviteter'/'Godkend aktiviteter'.</w:t>
-      </w:r>
-    </w:p>
-    <w:p>
-      <w:pPr>
-        <w:pStyle w:val="Heading2"/>
-        <w:spacing w:before="200" w:after="120"/>
-      </w:pPr>
-      <w:r>
-        <w:rPr>
-          <w:rFonts w:ascii="Arial" w:hAnsi="Arial"/>
-          <w:b/>
-          <w:color w:val="2E6DB8"/>
-          <w:sz w:val="26"/>
-        </w:rPr>
-        <w:t>14.3  Gentagelse</w:t>
-      </w:r>
-    </w:p>
-    <w:p>
-      <w:pPr>
-        <w:spacing w:after="120"/>
-      </w:pPr>
-      <w:r>
-        <w:rPr>
-          <w:rFonts w:ascii="Arial" w:hAnsi="Arial"/>
-          <w:sz w:val="22"/>
-        </w:rPr>
-        <w:t>Afkryds 'Gentagelse' i registreringsvinduet for at oprette det samme fravær eller den samme kommentar flere gange:</w:t>
-      </w:r>
-    </w:p>
-    <w:p>
-      <w:pPr>
-        <w:pStyle w:val="ListBullet"/>
-        <w:spacing w:after="40"/>
-        <w:ind w:left="454"/>
-      </w:pPr>
-      <w:r>
-        <w:rPr>
-          <w:rFonts w:ascii="Arial" w:hAnsi="Arial"/>
-          <w:sz w:val="22"/>
-        </w:rPr>
-        <w:t>Ugentligt: vælg en eller flere ugedage (fx hver mandag og torsdag) og evt. 'Hver 2. uge' (1-4, talt fra startdatoens uge).</w:t>
-      </w:r>
-    </w:p>
-    <w:p>
-      <w:pPr>
-        <w:pStyle w:val="ListBullet"/>
-        <w:spacing w:after="40"/>
-        <w:ind w:left="454"/>
-      </w:pPr>
-      <w:r>
-        <w:rPr>
-          <w:rFonts w:ascii="Arial" w:hAnsi="Arial"/>
-          <w:sz w:val="22"/>
-        </w:rPr>
-        <w:t>Månedligt: samme ugedag i måneden som startdatoen (fx hver 2. tirsdag – eller sidste fredag).</w:t>
-      </w:r>
-    </w:p>
-    <w:p>
-      <w:pPr>
-        <w:pStyle w:val="ListBullet"/>
-        <w:spacing w:after="40"/>
-        <w:ind w:left="454"/>
-      </w:pPr>
-      <w:r>
-        <w:rPr>
-          <w:rFonts w:ascii="Arial" w:hAnsi="Arial"/>
-          <w:sz w:val="22"/>
-        </w:rPr>
-        <w:t>Slutter: efter et antal gange (maks. 100) eller på en dato (maks. 1 år frem).</w:t>
-      </w:r>
-    </w:p>
-    <w:p>
-      <w:pPr>
-        <w:pStyle w:val="ListBullet"/>
-        <w:spacing w:after="40"/>
-        <w:ind w:left="454"/>
-      </w:pPr>
-      <w:r>
-        <w:rPr>
-          <w:rFonts w:ascii="Arial" w:hAnsi="Arial"/>
-          <w:sz w:val="22"/>
-        </w:rPr>
-        <w:t>Fravær springer helligdage over og tager næste dag i stedet; kommentarer oprettes også på helligdage. Findes der allerede en kommentar på en dag, overskrives den ikke.</w:t>
-      </w:r>
-    </w:p>
-    <w:p>
-      <w:pPr>
-        <w:spacing w:after="120"/>
-      </w:pPr>
-      <w:r>
-        <w:rPr>
-          <w:rFonts w:ascii="Arial" w:hAnsi="Arial"/>
-          <w:sz w:val="22"/>
-        </w:rPr>
-        <w:t>Åbn en vilkårlig forekomst for at ændre antal/slutdato for hele serien, slette kun denne forekomst eller slette hele serien. Forekomster i en låst lønperiode bevares altid.</w:t>
-      </w:r>
-    </w:p>
-    <w:p>
-      <w:r>
-        <w:br w:type="page"/>
-      </w:r>
-    </w:p>
-    <w:p>
-      <w:pPr>
-        <w:pStyle w:val="Heading1"/>
-        <w:spacing w:before="360" w:after="120"/>
-      </w:pPr>
-      <w:r>
-        <w:rPr>
-          <w:rFonts w:ascii="Arial" w:hAnsi="Arial"/>
-          <w:b/>
-          <w:color w:val="1B3A6B"/>
-          <w:sz w:val="32"/>
-        </w:rPr>
-        <w:t>15  Fraværsoversigt</w:t>
-      </w:r>
-    </w:p>
-    <w:p>
-      <w:pPr>
-        <w:spacing w:after="120"/>
-      </w:pPr>
-      <w:r>
-        <w:rPr>
-          <w:rFonts w:ascii="Arial" w:hAnsi="Arial"/>
-          <w:sz w:val="22"/>
-        </w:rPr>
-        <w:t>Klik på '📊 Fraværsoversigt' i venstre menu for et samlet overblik over fravær pr. medarbejder og pr. fraværstype over en valgfri periode – uafhængig af de faste 14-dages lønperioder. Kræver rettigheden 'Fraværsoversigt'.</w:t>
-      </w:r>
-    </w:p>
-    <w:p>
-      <w:pPr>
-        <w:pStyle w:val="ListBullet"/>
-        <w:spacing w:after="40"/>
-        <w:ind w:left="454"/>
-      </w:pPr>
-      <w:r>
-        <w:rPr>
-          <w:rFonts w:ascii="Arial" w:hAnsi="Arial"/>
-          <w:sz w:val="22"/>
-        </w:rPr>
-        <w:t>Vælg en fra- og til-dato for den ønskede periode.</w:t>
-      </w:r>
-    </w:p>
-    <w:p>
-      <w:pPr>
-        <w:pStyle w:val="ListBullet"/>
-        <w:spacing w:after="40"/>
-        <w:ind w:left="454"/>
-      </w:pPr>
-      <w:r>
-        <w:rPr>
-          <w:rFonts w:ascii="Arial" w:hAnsi="Arial"/>
-          <w:sz w:val="22"/>
-        </w:rPr>
-        <w:t>Tabellen viser fraværstimer/-dage summeret pr. medarbejder og pr. fraværstype, samt en sats i kr/time pr. række.</w:t>
-      </w:r>
-    </w:p>
-    <w:p>
-      <w:pPr>
-        <w:spacing w:before="80" w:after="160"/>
-        <w:ind w:left="283" w:right="283"/>
-      </w:pPr>
-      <w:r>
-        <w:rPr>
-          <w:rFonts w:ascii="Arial" w:hAnsi="Arial"/>
-          <w:b/>
-          <w:color w:val="2E6DB8"/>
-          <w:sz w:val="22"/>
-        </w:rPr>
-        <w:t xml:space="preserve">BEMÆRK: </w:t>
-      </w:r>
-      <w:r>
-        <w:rPr>
-          <w:rFonts w:ascii="Arial" w:hAnsi="Arial"/>
-          <w:color w:val="606060"/>
-          <w:sz w:val="22"/>
-        </w:rPr>
-        <w:t>Satsen der vises her, opdateres IKKE nødvendigvis, hvis I ændrer satser i Stamdata. Særligt §56-satsen kan afvige fra den aktuelle værdi i Stamdata → Tillæg, og fraværstyper som Ferie, Feriefri og Afspadsering vises med 0 kr/t her, selvom de udbetales i den faktiske lønkørsel. Brug Lønafregning (kapitel 12) eller den endelige Danløn-eksport som facit for hvad der reelt udbetales – Fraværsoversigtens sats-kolonne er kun vejledende.</w:t>
-      </w:r>
-    </w:p>
-    <w:p>
-      <w:pPr>
-        <w:pStyle w:val="Heading2"/>
-        <w:spacing w:before="200" w:after="120"/>
-      </w:pPr>
-      <w:r>
-        <w:rPr>
-          <w:rFonts w:ascii="Arial" w:hAnsi="Arial"/>
-          <w:b/>
-          <w:color w:val="2E6DB8"/>
-          <w:sz w:val="26"/>
-        </w:rPr>
-        <w:t>15.1  Eksport</w:t>
-      </w:r>
-    </w:p>
-    <w:p>
-      <w:pPr>
-        <w:spacing w:after="120"/>
-      </w:pPr>
-      <w:r>
-        <w:rPr>
-          <w:rFonts w:ascii="Arial" w:hAnsi="Arial"/>
-          <w:sz w:val="22"/>
-        </w:rPr>
-        <w:t>To eksportknapper downloader Excel-filer med samme datointerval som den valgte visning:</w:t>
-      </w:r>
-    </w:p>
-    <w:p>
-      <w:pPr>
-        <w:pStyle w:val="ListBullet"/>
-        <w:spacing w:after="40"/>
-        <w:ind w:left="454"/>
-      </w:pPr>
-      <w:r>
-        <w:rPr>
-          <w:rFonts w:ascii="Arial" w:hAnsi="Arial"/>
-          <w:b/>
-          <w:sz w:val="22"/>
-        </w:rPr>
-        <w:t xml:space="preserve">Eksportér pr. medarbejder: </w:t>
-      </w:r>
-      <w:r>
-        <w:rPr>
-          <w:rFonts w:ascii="Arial" w:hAnsi="Arial"/>
-          <w:sz w:val="22"/>
-        </w:rPr>
-        <w:t>Eksporterer én række pr. kalenderdag med fravær, valgfrit afgrænset til alle medarbejdere, én disponentgruppe eller én enkelt medarbejder.</w:t>
-      </w:r>
-    </w:p>
-    <w:p>
-      <w:pPr>
-        <w:pStyle w:val="ListBullet"/>
-        <w:spacing w:after="40"/>
-        <w:ind w:left="454"/>
-      </w:pPr>
-      <w:r>
-        <w:rPr>
-          <w:rFonts w:ascii="Arial" w:hAnsi="Arial"/>
-          <w:b/>
-          <w:sz w:val="22"/>
-        </w:rPr>
-        <w:t xml:space="preserve">Eksportér pr. fraværstype: </w:t>
-      </w:r>
-      <w:r>
-        <w:rPr>
-          <w:rFonts w:ascii="Arial" w:hAnsi="Arial"/>
-          <w:sz w:val="22"/>
-        </w:rPr>
-        <w:t>Eksporterer summeret pr. fraværstype – vælg i en afkrydsningsliste hvilke fraværstyper der skal med (eller markér 'alle').</w:t>
-      </w:r>
-    </w:p>
-    <w:p>
-      <w:r>
-        <w:br w:type="page"/>
-      </w:r>
-    </w:p>
-    <w:p>
-      <w:pPr>
-        <w:pStyle w:val="Heading1"/>
-        <w:spacing w:before="360" w:after="120"/>
-      </w:pPr>
-      <w:r>
-        <w:rPr>
-          <w:rFonts w:ascii="Arial" w:hAnsi="Arial"/>
-          <w:b/>
-          <w:color w:val="1B3A6B"/>
-          <w:sz w:val="32"/>
-        </w:rPr>
-        <w:t>16  Vognpark</w:t>
-      </w:r>
-    </w:p>
-    <w:p>
-      <w:pPr>
-        <w:spacing w:after="120"/>
-      </w:pPr>
-      <w:r>
-        <w:rPr>
-          <w:rFonts w:ascii="Arial" w:hAnsi="Arial"/>
-          <w:sz w:val="22"/>
-        </w:rPr>
-        <w:t>Klik på '🚛 Vognpark' i venstre menu for at se og redigere køretøjer. Kræver mindst 'Se vognpark'; opret/rediger/slet kræver 'Tilføj vogn'.</w:t>
+        <w:t>Er listen tom, er der endnu ingen disponentgrupper med 'Medtag i Dagsplan'. Grupper der fandtes før 8/10-2026 står som udgangspunkt til Nej og skal slås til i Stamdata.</w:t>
       </w:r>
     </w:p>
     <w:tbl>
@@ -14197,7 +13603,7 @@
                 <w:color w:val="FFFFFF"/>
                 <w:sz w:val="20"/>
               </w:rPr>
-              <w:t>Felt</w:t>
+              <w:t>Kolonne</w:t>
             </w:r>
           </w:p>
         </w:tc>
@@ -14214,7 +13620,7 @@
                 <w:color w:val="FFFFFF"/>
                 <w:sz w:val="20"/>
               </w:rPr>
-              <w:t>Beskrivelse</w:t>
+              <w:t>Indhold</w:t>
             </w:r>
           </w:p>
         </w:tc>
@@ -14236,7 +13642,7 @@
                 <w:rFonts w:ascii="Arial" w:hAnsi="Arial"/>
                 <w:sz w:val="20"/>
               </w:rPr>
-              <w:t>Nummerplade</w:t>
+              <w:t>Vognnummer</w:t>
             </w:r>
           </w:p>
         </w:tc>
@@ -14256,7 +13662,7 @@
                 <w:rFonts w:ascii="Arial" w:hAnsi="Arial"/>
                 <w:sz w:val="20"/>
               </w:rPr>
-              <w:t>Registreringsnummer, fx 'DF67671'.</w:t>
+              <w:t>Vognens nummer (fra Vognpark).</w:t>
             </w:r>
           </w:p>
         </w:tc>
@@ -14278,7 +13684,7 @@
                 <w:rFonts w:ascii="Arial" w:hAnsi="Arial"/>
                 <w:sz w:val="20"/>
               </w:rPr>
-              <w:t>Vognnummer</w:t>
+              <w:t>Beskrivelse</w:t>
             </w:r>
           </w:p>
         </w:tc>
@@ -14298,7 +13704,7 @@
                 <w:rFonts w:ascii="Arial" w:hAnsi="Arial"/>
                 <w:sz w:val="20"/>
               </w:rPr>
-              <w:t>Internt vognnummer.</w:t>
+              <w:t>Vognens beskrivelse, hvis udfyldt under Vognpark.</w:t>
             </w:r>
           </w:p>
         </w:tc>
@@ -14320,7 +13726,7 @@
                 <w:rFonts w:ascii="Arial" w:hAnsi="Arial"/>
                 <w:sz w:val="20"/>
               </w:rPr>
-              <w:t>Beskrivelse</w:t>
+              <w:t>Chauffør</w:t>
             </w:r>
           </w:p>
         </w:tc>
@@ -14340,7 +13746,7 @@
                 <w:rFonts w:ascii="Arial" w:hAnsi="Arial"/>
                 <w:sz w:val="20"/>
               </w:rPr>
-              <w:t>Fri tekst, vises som ekstra kolonne i Dagsplan (kapitel 13).</w:t>
+              <w:t>Søgbar medarbejder-vælger. Er medarbejderens 'Fast bil' sat til denne vogn (se afsnit 7.2), foreslås vedkommende automatisk – forslaget kan altid ændres.</w:t>
             </w:r>
           </w:p>
         </w:tc>
@@ -14362,7 +13768,7 @@
                 <w:rFonts w:ascii="Arial" w:hAnsi="Arial"/>
                 <w:sz w:val="20"/>
               </w:rPr>
-              <w:t>Disponentgruppe</w:t>
+              <w:t>Opgave</w:t>
             </w:r>
           </w:p>
         </w:tc>
@@ -14382,7 +13788,7 @@
                 <w:rFonts w:ascii="Arial" w:hAnsi="Arial"/>
                 <w:sz w:val="20"/>
               </w:rPr>
-              <w:t>Valgfri – knytter vognen til en afdeling.</w:t>
+              <w:t>Frit tekstfelt. Lang tekst ombrydes, så rækken bliver højere og al tekst kan ses. Enter gemmer.</w:t>
             </w:r>
           </w:p>
         </w:tc>
@@ -14404,7 +13810,7 @@
                 <w:rFonts w:ascii="Arial" w:hAnsi="Arial"/>
                 <w:sz w:val="20"/>
               </w:rPr>
-              <w:t>Vognpark</w:t>
+              <w:t>Informeret</w:t>
             </w:r>
           </w:p>
         </w:tc>
@@ -14424,7 +13830,7 @@
                 <w:rFonts w:ascii="Arial" w:hAnsi="Arial"/>
                 <w:sz w:val="20"/>
               </w:rPr>
-              <w:t>Afkryds for at vognen skal vises under fanen 'Vognpark' og i Dagsplans vognkolonne.</w:t>
+              <w:t>Afkrydsningsfelt – markér når chaufføren er informeret om dagens tildeling.</w:t>
             </w:r>
           </w:p>
         </w:tc>
@@ -14440,7 +13846,89 @@
           <w:rFonts w:ascii="Arial" w:hAnsi="Arial"/>
           <w:sz w:val="22"/>
         </w:rPr>
-        <w:t>Siden har to underfaner: 'Vognpark' viser kun de vogne der har fluebenet 'Vognpark' sat – det er dem der reelt kører gods og indgår i Dagsplan. 'Alle' viser samtlige oprettede vogne, inklusive interne poster/afdelinger der ikke skal med i den daglige vognfordeling.</w:t>
+        <w:t>Under hovedtabellen findes 10 faste 'EKSTRA'-rækker til hjælp på pladsen eller lærlinge – samme felter som ovenfor, men uden vognnummer-autoudfyldning på aktiviteter.</w:t>
+      </w:r>
+    </w:p>
+    <w:p>
+      <w:pPr>
+        <w:spacing w:after="120"/>
+      </w:pPr>
+      <w:r>
+        <w:rPr>
+          <w:rFonts w:ascii="Arial" w:hAnsi="Arial"/>
+          <w:sz w:val="22"/>
+        </w:rPr>
+        <w:t>Vil du sætte en vogn på en EKSTRA-række, så klik i feltet hvor der står 'EKSTRA' og vælg en vogn. Du kan kun vælge vogne, der ikke har fluebenet 'Vognpark' (de har allerede deres egen række). Vognens beskrivelse vises, og har vognen en fast chauffør, skrives vedkommende automatisk ind. Vognen gælder kun den valgte dag – næste dag står rækken som EKSTRA igen. Vælg '— EKSTRA (ingen vogn) —' eller tøm feltet for at fjerne vognen – så fjernes chaufføren også, og rækken bliver grå igen.</w:t>
+      </w:r>
+    </w:p>
+    <w:p>
+      <w:pPr>
+        <w:pStyle w:val="ListBullet"/>
+        <w:spacing w:after="40"/>
+        <w:ind w:left="454"/>
+      </w:pPr>
+      <w:r>
+        <w:rPr>
+          <w:rFonts w:ascii="Arial" w:hAnsi="Arial"/>
+          <w:sz w:val="22"/>
+        </w:rPr>
+        <w:t>En medarbejder med registreret fravær den valgte dag vises med rødt i sidelisten – og forbliver rødt, selv hvis vedkommende samtidig er skrevet i en Chauffør-kolonne. Overnatning tæller ikke som fravær.</w:t>
+      </w:r>
+    </w:p>
+    <w:p>
+      <w:pPr>
+        <w:pStyle w:val="ListBullet"/>
+        <w:spacing w:after="40"/>
+        <w:ind w:left="454"/>
+      </w:pPr>
+      <w:r>
+        <w:rPr>
+          <w:rFonts w:ascii="Arial" w:hAnsi="Arial"/>
+          <w:sz w:val="22"/>
+        </w:rPr>
+        <w:t>En medarbejder med en vagtplan-kommentar den dag vises med gult (også hvis der samtidig er fravær – så vises kommentaren). Grøn = tildelt en vogn/EKSTRA-plads, grå = hverken tildelt eller fraværende.</w:t>
+      </w:r>
+    </w:p>
+    <w:p>
+      <w:pPr>
+        <w:pStyle w:val="ListBullet"/>
+        <w:spacing w:after="40"/>
+        <w:ind w:left="454"/>
+      </w:pPr>
+      <w:r>
+        <w:rPr>
+          <w:rFonts w:ascii="Arial" w:hAnsi="Arial"/>
+          <w:sz w:val="22"/>
+        </w:rPr>
+        <w:t>En vogn med meldt materielt fravær (se afsnit 13.2) vises rødt i hovedtabellen.</w:t>
+      </w:r>
+    </w:p>
+    <w:p>
+      <w:pPr>
+        <w:pStyle w:val="ListBullet"/>
+        <w:spacing w:after="40"/>
+        <w:ind w:left="454"/>
+      </w:pPr>
+      <w:r>
+        <w:rPr>
+          <w:rFonts w:ascii="Arial" w:hAnsi="Arial"/>
+          <w:sz w:val="22"/>
+        </w:rPr>
+        <w:t>Har chaufføren den dag kørt i en anden bil end den tildelte (også hvis det kun var en del af vagten), vises et ⚠️-ikon med tooltip 'vognnummer i løn: xxx' ved chaufførnavnet. Deaktiverede aktiviteter tæller ikke med.</w:t>
+      </w:r>
+    </w:p>
+    <w:p>
+      <w:pPr>
+        <w:pStyle w:val="ListBullet"/>
+        <w:spacing w:after="40"/>
+        <w:ind w:left="454"/>
+      </w:pPr>
+      <w:r>
+        <w:rPr>
+          <w:rFonts w:ascii="Arial" w:hAnsi="Arial"/>
+          <w:sz w:val="22"/>
+        </w:rPr>
+        <w:t>En vogn der er slettet fra Vognpark, vises på gamle datoer, hvor den var tildelt, som en grå række med '(slettet)'. Den kan ikke redigeres.</w:t>
       </w:r>
     </w:p>
     <w:p>
@@ -14463,7 +13951,886 @@
           <w:color w:val="606060"/>
           <w:sz w:val="22"/>
         </w:rPr>
+        <w:t>Forsøger du at tildele en medarbejder, der allerede har en anden tildeling (eller registreret fravær) samme dag, viser systemet en advarsel i stedet for at blokere handlingen – bekræfter du, gennemføres dobbelttildelingen alligevel.</w:t>
+      </w:r>
+    </w:p>
+    <w:p>
+      <w:pPr>
+        <w:spacing w:before="80" w:after="160"/>
+        <w:ind w:left="283" w:right="283"/>
+      </w:pPr>
+      <w:r>
+        <w:rPr>
+          <w:rFonts w:ascii="Arial" w:hAnsi="Arial"/>
+          <w:b/>
+          <w:color w:val="2E6DB8"/>
+          <w:sz w:val="22"/>
+        </w:rPr>
+        <w:t xml:space="preserve">GODT AT VIDE: </w:t>
+      </w:r>
+      <w:r>
+        <w:rPr>
+          <w:rFonts w:ascii="Arial" w:hAnsi="Arial"/>
+          <w:color w:val="606060"/>
+          <w:sz w:val="22"/>
+        </w:rPr>
+        <w:t>Opretter du en 'normal tid'-aktivitet for en chauffør, der står på en vogn i Dagsplan den pågældende dag (tildelt eller via 'Fast bil'), udfyldes vognnummeret automatisk på aktiviteten – medmindre feltet allerede er udfyldt. Det er altid den vogn, du ser i Dagsplanen. Dette rører ikke ved fraværstyper eller EKSTRA-rækkerne.</w:t>
+      </w:r>
+    </w:p>
+    <w:p>
+      <w:pPr>
+        <w:pStyle w:val="Heading2"/>
+        <w:spacing w:before="200" w:after="120"/>
+      </w:pPr>
+      <w:r>
+        <w:rPr>
+          <w:rFonts w:ascii="Arial" w:hAnsi="Arial"/>
+          <w:b/>
+          <w:color w:val="2E6DB8"/>
+          <w:sz w:val="26"/>
+        </w:rPr>
+        <w:t>13.2  Materiel fravær-fanen</w:t>
+      </w:r>
+    </w:p>
+    <w:p>
+      <w:pPr>
+        <w:spacing w:after="120"/>
+      </w:pPr>
+      <w:r>
+        <w:rPr>
+          <w:rFonts w:ascii="Arial" w:hAnsi="Arial"/>
+          <w:sz w:val="22"/>
+        </w:rPr>
+        <w:t>Registrér når en vogn er ude af drift (værksted, reparation m.m.). Klik 'Meld materielt fravær' (kræver 'Redigér dagsplan') og angiv vogn, 'Fra dato' (default: fanens valgte dato), en valgfri 'Til dato' (tom betyder étdags-fravær) samt en kommentar. Tabellen nedenfor viser dagens meldte fravær med en slet-knap.</w:t>
+      </w:r>
+    </w:p>
+    <w:p>
+      <w:r>
+        <w:br w:type="page"/>
+      </w:r>
+    </w:p>
+    <w:p>
+      <w:pPr>
+        <w:pStyle w:val="Heading1"/>
+        <w:spacing w:before="360" w:after="120"/>
+      </w:pPr>
+      <w:r>
+        <w:rPr>
+          <w:rFonts w:ascii="Arial" w:hAnsi="Arial"/>
+          <w:b/>
+          <w:color w:val="1B3A6B"/>
+          <w:sz w:val="32"/>
+        </w:rPr>
+        <w:t>14  Vagtplan</w:t>
+      </w:r>
+    </w:p>
+    <w:p>
+      <w:pPr>
+        <w:spacing w:after="120"/>
+      </w:pPr>
+      <w:r>
+        <w:rPr>
+          <w:rFonts w:ascii="Arial" w:hAnsi="Arial"/>
+          <w:sz w:val="22"/>
+        </w:rPr>
+        <w:t>Klik på '🗓️ Vagtplan' i venstre menu for at se en 3-ugers oversigt (forrige, denne og næste uge) over alle medarbejderes fravær og kommentarer, med ugenummer i kolonneoverskriften. Kræver rettigheden 'Se vagtplan'; redigering kræver desuden enten 'Redigér egen linje i vagtplan' (kun din egen række) eller 'Redigér alle linjer i vagtplan'.</w:t>
+      </w:r>
+    </w:p>
+    <w:p>
+      <w:pPr>
+        <w:pStyle w:val="Heading2"/>
+        <w:spacing w:before="200" w:after="120"/>
+      </w:pPr>
+      <w:r>
+        <w:rPr>
+          <w:rFonts w:ascii="Arial" w:hAnsi="Arial"/>
+          <w:b/>
+          <w:color w:val="2E6DB8"/>
+          <w:sz w:val="26"/>
+        </w:rPr>
+        <w:t>14.1  Registrering</w:t>
+      </w:r>
+    </w:p>
+    <w:p>
+      <w:pPr>
+        <w:spacing w:after="120"/>
+      </w:pPr>
+      <w:r>
+        <w:rPr>
+          <w:rFonts w:ascii="Arial" w:hAnsi="Arial"/>
+          <w:sz w:val="22"/>
+        </w:rPr>
+        <w:t>Klik på en tom celle for at registrere fravær eller en kommentar for medarbejderen den dag:</w:t>
+      </w:r>
+    </w:p>
+    <w:p>
+      <w:pPr>
+        <w:pStyle w:val="ListBullet"/>
+        <w:spacing w:after="40"/>
+        <w:ind w:left="454"/>
+      </w:pPr>
+      <w:r>
+        <w:rPr>
+          <w:rFonts w:ascii="Arial" w:hAnsi="Arial"/>
+          <w:sz w:val="22"/>
+        </w:rPr>
+        <w:t>Vælg en almindelig fraværstype (ferie, sygdom osv.) for at oprette en rigtig aktivitet – nøjagtig samme modal som i Aktivitetsoversigten (kapitel 6).</w:t>
+      </w:r>
+    </w:p>
+    <w:p>
+      <w:pPr>
+        <w:pStyle w:val="ListBullet"/>
+        <w:spacing w:after="40"/>
+        <w:ind w:left="454"/>
+      </w:pPr>
+      <w:r>
+        <w:rPr>
+          <w:rFonts w:ascii="Arial" w:hAnsi="Arial"/>
+          <w:sz w:val="22"/>
+        </w:rPr>
+        <w:t>Vælg 'Ingen (kun kommentar)' for blot at skrive en fri tekstnote uden at oprette nogen aktivitet – bruges fx til 'ringer ind kl. 10' eller lignende driftsnoter.</w:t>
+      </w:r>
+    </w:p>
+    <w:p>
+      <w:pPr>
+        <w:spacing w:after="120"/>
+      </w:pPr>
+      <w:r>
+        <w:rPr>
+          <w:rFonts w:ascii="Arial" w:hAnsi="Arial"/>
+          <w:sz w:val="22"/>
+        </w:rPr>
+        <w:t>Klik på en udfyldt celle for at se/redigere den. Fraværsaktiviteter åbner samme aktivitetsdetalje som i Aktivitetsoversigten; rene kommentarer åbner en lille rediger/slet-boks.</w:t>
+      </w:r>
+    </w:p>
+    <w:p>
+      <w:pPr>
+        <w:pStyle w:val="Heading2"/>
+        <w:spacing w:before="200" w:after="120"/>
+      </w:pPr>
+      <w:r>
+        <w:rPr>
+          <w:rFonts w:ascii="Arial" w:hAnsi="Arial"/>
+          <w:b/>
+          <w:color w:val="2E6DB8"/>
+          <w:sz w:val="26"/>
+        </w:rPr>
+        <w:t>14.2  Filtrering og 'Fravær i morgen'</w:t>
+      </w:r>
+    </w:p>
+    <w:p>
+      <w:pPr>
+        <w:spacing w:after="120"/>
+      </w:pPr>
+      <w:r>
+        <w:rPr>
+          <w:rFonts w:ascii="Arial" w:hAnsi="Arial"/>
+          <w:sz w:val="22"/>
+        </w:rPr>
+        <w:t>Afdelingsfiltret er en flervalgsliste (klik for at vælge flere grupper ad gangen; klik 'Vælg alle' først for kun at isolere én gruppe). Knappen 'Fravær i morgen' åbner en hurtig opsummering af alle medarbejdere (inden for det valgte filter) der har fravær eller en kommentar registreret på dagen efter i dag – uden at du behøver bladre en hel uge frem.</w:t>
+      </w:r>
+    </w:p>
+    <w:p>
+      <w:pPr>
+        <w:spacing w:before="80" w:after="160"/>
+        <w:ind w:left="283" w:right="283"/>
+      </w:pPr>
+      <w:r>
+        <w:rPr>
+          <w:rFonts w:ascii="Arial" w:hAnsi="Arial"/>
+          <w:b/>
+          <w:color w:val="2E6DB8"/>
+          <w:sz w:val="22"/>
+        </w:rPr>
+        <w:t xml:space="preserve">GODT AT VIDE: </w:t>
+      </w:r>
+      <w:r>
+        <w:rPr>
+          <w:rFonts w:ascii="Arial" w:hAnsi="Arial"/>
+          <w:color w:val="606060"/>
+          <w:sz w:val="22"/>
+        </w:rPr>
+        <w:t>Vagtplan og Aktivitetsoversigten viser samme underliggende data – opretter du en fraværsaktivitet i Vagtplan, ses den også i Aktivitetsoversigten, og omvendt.</w:t>
+      </w:r>
+    </w:p>
+    <w:p>
+      <w:pPr>
+        <w:spacing w:before="80" w:after="160"/>
+        <w:ind w:left="283" w:right="283"/>
+      </w:pPr>
+      <w:r>
+        <w:rPr>
+          <w:rFonts w:ascii="Arial" w:hAnsi="Arial"/>
+          <w:b/>
+          <w:color w:val="2E6DB8"/>
+          <w:sz w:val="22"/>
+        </w:rPr>
+        <w:t xml:space="preserve">BEMÆRK: </w:t>
+      </w:r>
+      <w:r>
+        <w:rPr>
+          <w:rFonts w:ascii="Arial" w:hAnsi="Arial"/>
+          <w:color w:val="606060"/>
+          <w:sz w:val="22"/>
+        </w:rPr>
+        <w:t>I en låst lønperiode kan du hverken registrere, rette eller fjerne fravær eller kommentarer i Vagtplanen (2026-09-30). Fravær oprettet fra Vagtplanen kan rettes og fjernes af brugere med redigeringsret til linjen, også uden 'Redigér aktiviteter'/'Godkend aktiviteter'.</w:t>
+      </w:r>
+    </w:p>
+    <w:p>
+      <w:pPr>
+        <w:pStyle w:val="Heading2"/>
+        <w:spacing w:before="200" w:after="120"/>
+      </w:pPr>
+      <w:r>
+        <w:rPr>
+          <w:rFonts w:ascii="Arial" w:hAnsi="Arial"/>
+          <w:b/>
+          <w:color w:val="2E6DB8"/>
+          <w:sz w:val="26"/>
+        </w:rPr>
+        <w:t>14.3  Gentagelse</w:t>
+      </w:r>
+    </w:p>
+    <w:p>
+      <w:pPr>
+        <w:spacing w:after="120"/>
+      </w:pPr>
+      <w:r>
+        <w:rPr>
+          <w:rFonts w:ascii="Arial" w:hAnsi="Arial"/>
+          <w:sz w:val="22"/>
+        </w:rPr>
+        <w:t>Afkryds 'Gentagelse' i registreringsvinduet for at oprette det samme fravær eller den samme kommentar flere gange:</w:t>
+      </w:r>
+    </w:p>
+    <w:p>
+      <w:pPr>
+        <w:pStyle w:val="ListBullet"/>
+        <w:spacing w:after="40"/>
+        <w:ind w:left="454"/>
+      </w:pPr>
+      <w:r>
+        <w:rPr>
+          <w:rFonts w:ascii="Arial" w:hAnsi="Arial"/>
+          <w:sz w:val="22"/>
+        </w:rPr>
+        <w:t>Ugentligt: vælg en eller flere ugedage (fx hver mandag og torsdag) og evt. 'Hver 2. uge' (1-4, talt fra startdatoens uge).</w:t>
+      </w:r>
+    </w:p>
+    <w:p>
+      <w:pPr>
+        <w:pStyle w:val="ListBullet"/>
+        <w:spacing w:after="40"/>
+        <w:ind w:left="454"/>
+      </w:pPr>
+      <w:r>
+        <w:rPr>
+          <w:rFonts w:ascii="Arial" w:hAnsi="Arial"/>
+          <w:sz w:val="22"/>
+        </w:rPr>
+        <w:t>Månedligt: samme ugedag i måneden som startdatoen (fx hver 2. tirsdag – eller sidste fredag).</w:t>
+      </w:r>
+    </w:p>
+    <w:p>
+      <w:pPr>
+        <w:pStyle w:val="ListBullet"/>
+        <w:spacing w:after="40"/>
+        <w:ind w:left="454"/>
+      </w:pPr>
+      <w:r>
+        <w:rPr>
+          <w:rFonts w:ascii="Arial" w:hAnsi="Arial"/>
+          <w:sz w:val="22"/>
+        </w:rPr>
+        <w:t>Slutter: efter et antal gange (maks. 100) eller på en dato (maks. 1 år frem).</w:t>
+      </w:r>
+    </w:p>
+    <w:p>
+      <w:pPr>
+        <w:pStyle w:val="ListBullet"/>
+        <w:spacing w:after="40"/>
+        <w:ind w:left="454"/>
+      </w:pPr>
+      <w:r>
+        <w:rPr>
+          <w:rFonts w:ascii="Arial" w:hAnsi="Arial"/>
+          <w:sz w:val="22"/>
+        </w:rPr>
+        <w:t>Fravær springer helligdage over og tager næste dag i stedet; kommentarer oprettes også på helligdage. Findes der allerede en kommentar på en dag, overskrives den ikke.</w:t>
+      </w:r>
+    </w:p>
+    <w:p>
+      <w:pPr>
+        <w:spacing w:after="120"/>
+      </w:pPr>
+      <w:r>
+        <w:rPr>
+          <w:rFonts w:ascii="Arial" w:hAnsi="Arial"/>
+          <w:sz w:val="22"/>
+        </w:rPr>
+        <w:t>Åbn en vilkårlig forekomst for at ændre antal/slutdato for hele serien, slette kun denne forekomst eller slette hele serien. Forekomster i en låst lønperiode bevares altid.</w:t>
+      </w:r>
+    </w:p>
+    <w:p>
+      <w:r>
+        <w:br w:type="page"/>
+      </w:r>
+    </w:p>
+    <w:p>
+      <w:pPr>
+        <w:pStyle w:val="Heading1"/>
+        <w:spacing w:before="360" w:after="120"/>
+      </w:pPr>
+      <w:r>
+        <w:rPr>
+          <w:rFonts w:ascii="Arial" w:hAnsi="Arial"/>
+          <w:b/>
+          <w:color w:val="1B3A6B"/>
+          <w:sz w:val="32"/>
+        </w:rPr>
+        <w:t>15  Fraværsoversigt</w:t>
+      </w:r>
+    </w:p>
+    <w:p>
+      <w:pPr>
+        <w:spacing w:after="120"/>
+      </w:pPr>
+      <w:r>
+        <w:rPr>
+          <w:rFonts w:ascii="Arial" w:hAnsi="Arial"/>
+          <w:sz w:val="22"/>
+        </w:rPr>
+        <w:t>Klik på '📊 Fraværsoversigt' i venstre menu for et samlet overblik over fravær pr. medarbejder og pr. fraværstype over en valgfri periode – uafhængig af de faste 14-dages lønperioder. Kræver rettigheden 'Fraværsoversigt'.</w:t>
+      </w:r>
+    </w:p>
+    <w:p>
+      <w:pPr>
+        <w:pStyle w:val="ListBullet"/>
+        <w:spacing w:after="40"/>
+        <w:ind w:left="454"/>
+      </w:pPr>
+      <w:r>
+        <w:rPr>
+          <w:rFonts w:ascii="Arial" w:hAnsi="Arial"/>
+          <w:sz w:val="22"/>
+        </w:rPr>
+        <w:t>Vælg en fra- og til-dato for den ønskede periode.</w:t>
+      </w:r>
+    </w:p>
+    <w:p>
+      <w:pPr>
+        <w:pStyle w:val="ListBullet"/>
+        <w:spacing w:after="40"/>
+        <w:ind w:left="454"/>
+      </w:pPr>
+      <w:r>
+        <w:rPr>
+          <w:rFonts w:ascii="Arial" w:hAnsi="Arial"/>
+          <w:sz w:val="22"/>
+        </w:rPr>
+        <w:t>Tabellen viser fraværstimer/-dage summeret pr. medarbejder og pr. fraværstype, samt en sats i kr/time pr. række.</w:t>
+      </w:r>
+    </w:p>
+    <w:p>
+      <w:pPr>
+        <w:spacing w:before="80" w:after="160"/>
+        <w:ind w:left="283" w:right="283"/>
+      </w:pPr>
+      <w:r>
+        <w:rPr>
+          <w:rFonts w:ascii="Arial" w:hAnsi="Arial"/>
+          <w:b/>
+          <w:color w:val="2E6DB8"/>
+          <w:sz w:val="22"/>
+        </w:rPr>
+        <w:t xml:space="preserve">BEMÆRK: </w:t>
+      </w:r>
+      <w:r>
+        <w:rPr>
+          <w:rFonts w:ascii="Arial" w:hAnsi="Arial"/>
+          <w:color w:val="606060"/>
+          <w:sz w:val="22"/>
+        </w:rPr>
+        <w:t>Satsen der vises her, opdateres IKKE nødvendigvis, hvis I ændrer satser i Stamdata. Særligt §56-satsen kan afvige fra den aktuelle værdi i Stamdata → Tillæg, og fraværstyper som Ferie, Feriefri og Afspadsering vises med 0 kr/t her, selvom de udbetales i den faktiske lønkørsel. Brug Lønafregning (kapitel 12) eller den endelige Danløn-eksport som facit for hvad der reelt udbetales – Fraværsoversigtens sats-kolonne er kun vejledende.</w:t>
+      </w:r>
+    </w:p>
+    <w:p>
+      <w:pPr>
+        <w:pStyle w:val="Heading2"/>
+        <w:spacing w:before="200" w:after="120"/>
+      </w:pPr>
+      <w:r>
+        <w:rPr>
+          <w:rFonts w:ascii="Arial" w:hAnsi="Arial"/>
+          <w:b/>
+          <w:color w:val="2E6DB8"/>
+          <w:sz w:val="26"/>
+        </w:rPr>
+        <w:t>15.1  Eksport</w:t>
+      </w:r>
+    </w:p>
+    <w:p>
+      <w:pPr>
+        <w:spacing w:after="120"/>
+      </w:pPr>
+      <w:r>
+        <w:rPr>
+          <w:rFonts w:ascii="Arial" w:hAnsi="Arial"/>
+          <w:sz w:val="22"/>
+        </w:rPr>
+        <w:t>To eksportknapper downloader Excel-filer med samme datointerval som den valgte visning:</w:t>
+      </w:r>
+    </w:p>
+    <w:p>
+      <w:pPr>
+        <w:pStyle w:val="ListBullet"/>
+        <w:spacing w:after="40"/>
+        <w:ind w:left="454"/>
+      </w:pPr>
+      <w:r>
+        <w:rPr>
+          <w:rFonts w:ascii="Arial" w:hAnsi="Arial"/>
+          <w:b/>
+          <w:sz w:val="22"/>
+        </w:rPr>
+        <w:t xml:space="preserve">Eksportér pr. medarbejder: </w:t>
+      </w:r>
+      <w:r>
+        <w:rPr>
+          <w:rFonts w:ascii="Arial" w:hAnsi="Arial"/>
+          <w:sz w:val="22"/>
+        </w:rPr>
+        <w:t>Eksporterer én række pr. kalenderdag med fravær, valgfrit afgrænset til alle medarbejdere, én disponentgruppe eller én enkelt medarbejder.</w:t>
+      </w:r>
+    </w:p>
+    <w:p>
+      <w:pPr>
+        <w:pStyle w:val="ListBullet"/>
+        <w:spacing w:after="40"/>
+        <w:ind w:left="454"/>
+      </w:pPr>
+      <w:r>
+        <w:rPr>
+          <w:rFonts w:ascii="Arial" w:hAnsi="Arial"/>
+          <w:b/>
+          <w:sz w:val="22"/>
+        </w:rPr>
+        <w:t xml:space="preserve">Eksportér pr. fraværstype: </w:t>
+      </w:r>
+      <w:r>
+        <w:rPr>
+          <w:rFonts w:ascii="Arial" w:hAnsi="Arial"/>
+          <w:sz w:val="22"/>
+        </w:rPr>
+        <w:t>Eksporterer summeret pr. fraværstype – vælg i en afkrydsningsliste hvilke fraværstyper der skal med (eller markér 'alle').</w:t>
+      </w:r>
+    </w:p>
+    <w:p>
+      <w:r>
+        <w:br w:type="page"/>
+      </w:r>
+    </w:p>
+    <w:p>
+      <w:pPr>
+        <w:pStyle w:val="Heading1"/>
+        <w:spacing w:before="360" w:after="120"/>
+      </w:pPr>
+      <w:r>
+        <w:rPr>
+          <w:rFonts w:ascii="Arial" w:hAnsi="Arial"/>
+          <w:b/>
+          <w:color w:val="1B3A6B"/>
+          <w:sz w:val="32"/>
+        </w:rPr>
+        <w:t>16  Vognpark</w:t>
+      </w:r>
+    </w:p>
+    <w:p>
+      <w:pPr>
+        <w:spacing w:after="120"/>
+      </w:pPr>
+      <w:r>
+        <w:rPr>
+          <w:rFonts w:ascii="Arial" w:hAnsi="Arial"/>
+          <w:sz w:val="22"/>
+        </w:rPr>
+        <w:t>Klik på '🚛 Vognpark' i venstre menu for at se og redigere køretøjer. Kræver mindst 'Se vognpark'; opret/rediger/slet kræver 'Tilføj vogn'.</w:t>
+      </w:r>
+    </w:p>
+    <w:tbl>
+      <w:tblPr>
+        <w:tblStyle w:val="TableGrid"/>
+        <w:tblW w:type="auto" w:w="0"/>
+        <w:tblLook w:firstColumn="1" w:firstRow="1" w:lastColumn="0" w:lastRow="0" w:noHBand="0" w:noVBand="1" w:val="04A0"/>
+      </w:tblPr>
+      <w:tblGrid>
+        <w:gridCol w:w="4536"/>
+        <w:gridCol w:w="4536"/>
+      </w:tblGrid>
+      <w:tr>
+        <w:tc>
+          <w:tcPr>
+            <w:tcW w:type="dxa" w:w="4536"/>
+            <w:shd w:val="clear" w:color="auto" w:fill="1B3A6B"/>
+          </w:tcPr>
+          <w:p>
+            <w:r>
+              <w:rPr>
+                <w:rFonts w:ascii="Arial" w:hAnsi="Arial"/>
+                <w:b/>
+                <w:color w:val="FFFFFF"/>
+                <w:sz w:val="20"/>
+              </w:rPr>
+              <w:t>Felt</w:t>
+            </w:r>
+          </w:p>
+        </w:tc>
+        <w:tc>
+          <w:tcPr>
+            <w:tcW w:type="dxa" w:w="4536"/>
+            <w:shd w:val="clear" w:color="auto" w:fill="1B3A6B"/>
+          </w:tcPr>
+          <w:p>
+            <w:r>
+              <w:rPr>
+                <w:rFonts w:ascii="Arial" w:hAnsi="Arial"/>
+                <w:b/>
+                <w:color w:val="FFFFFF"/>
+                <w:sz w:val="20"/>
+              </w:rPr>
+              <w:t>Beskrivelse</w:t>
+            </w:r>
+          </w:p>
+        </w:tc>
+      </w:tr>
+      <w:tr>
+        <w:tc>
+          <w:tcPr>
+            <w:tcW w:type="dxa" w:w="4536"/>
+            <w:tcBorders>
+              <w:top w:val="single" w:sz="4" w:color="CCCCCC"/>
+              <w:left w:val="single" w:sz="4" w:color="CCCCCC"/>
+              <w:bottom w:val="single" w:sz="4" w:color="CCCCCC"/>
+              <w:right w:val="single" w:sz="4" w:color="CCCCCC"/>
+            </w:tcBorders>
+          </w:tcPr>
+          <w:p>
+            <w:r>
+              <w:rPr>
+                <w:rFonts w:ascii="Arial" w:hAnsi="Arial"/>
+                <w:sz w:val="20"/>
+              </w:rPr>
+              <w:t>Nummerplade</w:t>
+            </w:r>
+          </w:p>
+        </w:tc>
+        <w:tc>
+          <w:tcPr>
+            <w:tcW w:type="dxa" w:w="4536"/>
+            <w:tcBorders>
+              <w:top w:val="single" w:sz="4" w:color="CCCCCC"/>
+              <w:left w:val="single" w:sz="4" w:color="CCCCCC"/>
+              <w:bottom w:val="single" w:sz="4" w:color="CCCCCC"/>
+              <w:right w:val="single" w:sz="4" w:color="CCCCCC"/>
+            </w:tcBorders>
+          </w:tcPr>
+          <w:p>
+            <w:r>
+              <w:rPr>
+                <w:rFonts w:ascii="Arial" w:hAnsi="Arial"/>
+                <w:sz w:val="20"/>
+              </w:rPr>
+              <w:t>Registreringsnummer, fx 'DF67671'.</w:t>
+            </w:r>
+          </w:p>
+        </w:tc>
+      </w:tr>
+      <w:tr>
+        <w:tc>
+          <w:tcPr>
+            <w:tcW w:type="dxa" w:w="4536"/>
+            <w:tcBorders>
+              <w:top w:val="single" w:sz="4" w:color="CCCCCC"/>
+              <w:left w:val="single" w:sz="4" w:color="CCCCCC"/>
+              <w:bottom w:val="single" w:sz="4" w:color="CCCCCC"/>
+              <w:right w:val="single" w:sz="4" w:color="CCCCCC"/>
+            </w:tcBorders>
+          </w:tcPr>
+          <w:p>
+            <w:r>
+              <w:rPr>
+                <w:rFonts w:ascii="Arial" w:hAnsi="Arial"/>
+                <w:sz w:val="20"/>
+              </w:rPr>
+              <w:t>Vognnummer</w:t>
+            </w:r>
+          </w:p>
+        </w:tc>
+        <w:tc>
+          <w:tcPr>
+            <w:tcW w:type="dxa" w:w="4536"/>
+            <w:tcBorders>
+              <w:top w:val="single" w:sz="4" w:color="CCCCCC"/>
+              <w:left w:val="single" w:sz="4" w:color="CCCCCC"/>
+              <w:bottom w:val="single" w:sz="4" w:color="CCCCCC"/>
+              <w:right w:val="single" w:sz="4" w:color="CCCCCC"/>
+            </w:tcBorders>
+          </w:tcPr>
+          <w:p>
+            <w:r>
+              <w:rPr>
+                <w:rFonts w:ascii="Arial" w:hAnsi="Arial"/>
+                <w:sz w:val="20"/>
+              </w:rPr>
+              <w:t>Internt vognnummer.</w:t>
+            </w:r>
+          </w:p>
+        </w:tc>
+      </w:tr>
+      <w:tr>
+        <w:tc>
+          <w:tcPr>
+            <w:tcW w:type="dxa" w:w="4536"/>
+            <w:tcBorders>
+              <w:top w:val="single" w:sz="4" w:color="CCCCCC"/>
+              <w:left w:val="single" w:sz="4" w:color="CCCCCC"/>
+              <w:bottom w:val="single" w:sz="4" w:color="CCCCCC"/>
+              <w:right w:val="single" w:sz="4" w:color="CCCCCC"/>
+            </w:tcBorders>
+          </w:tcPr>
+          <w:p>
+            <w:r>
+              <w:rPr>
+                <w:rFonts w:ascii="Arial" w:hAnsi="Arial"/>
+                <w:sz w:val="20"/>
+              </w:rPr>
+              <w:t>Beskrivelse</w:t>
+            </w:r>
+          </w:p>
+        </w:tc>
+        <w:tc>
+          <w:tcPr>
+            <w:tcW w:type="dxa" w:w="4536"/>
+            <w:tcBorders>
+              <w:top w:val="single" w:sz="4" w:color="CCCCCC"/>
+              <w:left w:val="single" w:sz="4" w:color="CCCCCC"/>
+              <w:bottom w:val="single" w:sz="4" w:color="CCCCCC"/>
+              <w:right w:val="single" w:sz="4" w:color="CCCCCC"/>
+            </w:tcBorders>
+          </w:tcPr>
+          <w:p>
+            <w:r>
+              <w:rPr>
+                <w:rFonts w:ascii="Arial" w:hAnsi="Arial"/>
+                <w:sz w:val="20"/>
+              </w:rPr>
+              <w:t>Fri tekst, vises som ekstra kolonne i Dagsplan (kapitel 13).</w:t>
+            </w:r>
+          </w:p>
+        </w:tc>
+      </w:tr>
+      <w:tr>
+        <w:tc>
+          <w:tcPr>
+            <w:tcW w:type="dxa" w:w="4536"/>
+            <w:tcBorders>
+              <w:top w:val="single" w:sz="4" w:color="CCCCCC"/>
+              <w:left w:val="single" w:sz="4" w:color="CCCCCC"/>
+              <w:bottom w:val="single" w:sz="4" w:color="CCCCCC"/>
+              <w:right w:val="single" w:sz="4" w:color="CCCCCC"/>
+            </w:tcBorders>
+          </w:tcPr>
+          <w:p>
+            <w:r>
+              <w:rPr>
+                <w:rFonts w:ascii="Arial" w:hAnsi="Arial"/>
+                <w:sz w:val="20"/>
+              </w:rPr>
+              <w:t>Disponentgruppe</w:t>
+            </w:r>
+          </w:p>
+        </w:tc>
+        <w:tc>
+          <w:tcPr>
+            <w:tcW w:type="dxa" w:w="4536"/>
+            <w:tcBorders>
+              <w:top w:val="single" w:sz="4" w:color="CCCCCC"/>
+              <w:left w:val="single" w:sz="4" w:color="CCCCCC"/>
+              <w:bottom w:val="single" w:sz="4" w:color="CCCCCC"/>
+              <w:right w:val="single" w:sz="4" w:color="CCCCCC"/>
+            </w:tcBorders>
+          </w:tcPr>
+          <w:p>
+            <w:r>
+              <w:rPr>
+                <w:rFonts w:ascii="Arial" w:hAnsi="Arial"/>
+                <w:sz w:val="20"/>
+              </w:rPr>
+              <w:t>Valgfri – knytter vognen til en afdeling.</w:t>
+            </w:r>
+          </w:p>
+        </w:tc>
+      </w:tr>
+      <w:tr>
+        <w:tc>
+          <w:tcPr>
+            <w:tcW w:type="dxa" w:w="4536"/>
+            <w:tcBorders>
+              <w:top w:val="single" w:sz="4" w:color="CCCCCC"/>
+              <w:left w:val="single" w:sz="4" w:color="CCCCCC"/>
+              <w:bottom w:val="single" w:sz="4" w:color="CCCCCC"/>
+              <w:right w:val="single" w:sz="4" w:color="CCCCCC"/>
+            </w:tcBorders>
+          </w:tcPr>
+          <w:p>
+            <w:r>
+              <w:rPr>
+                <w:rFonts w:ascii="Arial" w:hAnsi="Arial"/>
+                <w:sz w:val="20"/>
+              </w:rPr>
+              <w:t>Vognpark</w:t>
+            </w:r>
+          </w:p>
+        </w:tc>
+        <w:tc>
+          <w:tcPr>
+            <w:tcW w:type="dxa" w:w="4536"/>
+            <w:tcBorders>
+              <w:top w:val="single" w:sz="4" w:color="CCCCCC"/>
+              <w:left w:val="single" w:sz="4" w:color="CCCCCC"/>
+              <w:bottom w:val="single" w:sz="4" w:color="CCCCCC"/>
+              <w:right w:val="single" w:sz="4" w:color="CCCCCC"/>
+            </w:tcBorders>
+          </w:tcPr>
+          <w:p>
+            <w:r>
+              <w:rPr>
+                <w:rFonts w:ascii="Arial" w:hAnsi="Arial"/>
+                <w:sz w:val="20"/>
+              </w:rPr>
+              <w:t>Afkryds for at vognen skal vises under fanen 'Vognpark' og i Dagsplans vognkolonne.</w:t>
+            </w:r>
+          </w:p>
+        </w:tc>
+      </w:tr>
+    </w:tbl>
+    <w:p/>
+    <w:p>
+      <w:pPr>
+        <w:spacing w:after="120"/>
+      </w:pPr>
+      <w:r>
+        <w:rPr>
+          <w:rFonts w:ascii="Arial" w:hAnsi="Arial"/>
+          <w:sz w:val="22"/>
+        </w:rPr>
+        <w:t>Siden har to underfaner: 'Vognpark' viser kun de vogne der har fluebenet 'Vognpark' sat – det er dem der reelt kører gods og indgår i Dagsplan. 'Alle' viser samtlige oprettede vogne, inklusive interne poster/afdelinger der ikke skal med i den daglige vognfordeling.</w:t>
+      </w:r>
+    </w:p>
+    <w:p>
+      <w:pPr>
+        <w:spacing w:before="80" w:after="160"/>
+        <w:ind w:left="283" w:right="283"/>
+      </w:pPr>
+      <w:r>
+        <w:rPr>
+          <w:rFonts w:ascii="Arial" w:hAnsi="Arial"/>
+          <w:b/>
+          <w:color w:val="2E6DB8"/>
+          <w:sz w:val="22"/>
+        </w:rPr>
+        <w:t xml:space="preserve">BEMÆRK: </w:t>
+      </w:r>
+      <w:r>
+        <w:rPr>
+          <w:rFonts w:ascii="Arial" w:hAnsi="Arial"/>
+          <w:color w:val="606060"/>
+          <w:sz w:val="22"/>
+        </w:rPr>
         <w:t>Nyoprettede vogne har som udgangspunkt IKKE fluebenet 'Vognpark' sat og vises derfor ikke i Dagsplan, før du aktivt går ind under fanen 'Alle' og krydser feltet af. 'Meld materielt fravær' (kapitel 13.2) og medarbejder-modalens 'Fast bil'- og 'Vognnummer ved fravær'-søgning viser i øvrigt alle vogne uanset dette flueben. Listen sorteres efter vognnummer.</w:t>
+      </w:r>
+    </w:p>
+    <w:p>
+      <w:pPr>
+        <w:pStyle w:val="Heading2"/>
+        <w:spacing w:before="200" w:after="120"/>
+      </w:pPr>
+      <w:r>
+        <w:rPr>
+          <w:rFonts w:ascii="Arial" w:hAnsi="Arial"/>
+          <w:b/>
+          <w:color w:val="2E6DB8"/>
+          <w:sz w:val="26"/>
+        </w:rPr>
+        <w:t>16.1  Slet en vogn</w:t>
+      </w:r>
+    </w:p>
+    <w:p>
+      <w:pPr>
+        <w:spacing w:after="120"/>
+      </w:pPr>
+      <w:r>
+        <w:rPr>
+          <w:rFonts w:ascii="Arial" w:hAnsi="Arial"/>
+          <w:sz w:val="22"/>
+        </w:rPr>
+        <w:t>Åbn vognen og klik 'Slet'. Vognen forsvinder fra Vognpark og fra alle steder, hvor man vælger vogn, men vognnummeret bliver stående som tekst på gamle vagter, i Lønafregning og i gamle Dagsplan-rækker og materielt fravær.</w:t>
+      </w:r>
+    </w:p>
+    <w:p>
+      <w:pPr>
+        <w:pStyle w:val="ListBullet"/>
+        <w:spacing w:after="40"/>
+        <w:ind w:left="454"/>
+      </w:pPr>
+      <w:r>
+        <w:rPr>
+          <w:rFonts w:ascii="Arial" w:hAnsi="Arial"/>
+          <w:sz w:val="22"/>
+        </w:rPr>
+        <w:t>Er vognen skrevet på vagter i en lønperiode, der ikke er låst, viser systemet en advarsel. Bekræfter du, slettes vognen alligevel.</w:t>
+      </w:r>
+    </w:p>
+    <w:p>
+      <w:pPr>
+        <w:pStyle w:val="ListBullet"/>
+        <w:spacing w:after="40"/>
+        <w:ind w:left="454"/>
+      </w:pPr>
+      <w:r>
+        <w:rPr>
+          <w:rFonts w:ascii="Arial" w:hAnsi="Arial"/>
+          <w:sz w:val="22"/>
+        </w:rPr>
+        <w:t>Er vognen 'Fast bil', 'Vognnummer ved fravær' eller en disponentgruppes vogn, nævnes det i advarslen, og koblingen fjernes.</w:t>
+      </w:r>
+    </w:p>
+    <w:p>
+      <w:pPr>
+        <w:pStyle w:val="ListBullet"/>
+        <w:spacing w:after="40"/>
+        <w:ind w:left="454"/>
+      </w:pPr>
+      <w:r>
+        <w:rPr>
+          <w:rFonts w:ascii="Arial" w:hAnsi="Arial"/>
+          <w:sz w:val="22"/>
+        </w:rPr>
+        <w:t>Planlægning i Dagsplan og materielt fravær efter i dag fjernes.</w:t>
+      </w:r>
+    </w:p>
+    <w:p>
+      <w:pPr>
+        <w:pStyle w:val="ListBullet"/>
+        <w:spacing w:after="40"/>
+        <w:ind w:left="454"/>
+      </w:pPr>
+      <w:r>
+        <w:rPr>
+          <w:rFonts w:ascii="Arial" w:hAnsi="Arial"/>
+          <w:sz w:val="22"/>
+        </w:rPr>
+        <w:t>Opretter du senere en vogn med samme nummerplade, er det tilladt – den slettede vogns plade får tilføjet '(slettet …)'.</w:t>
       </w:r>
     </w:p>
     <w:p>

</xml_diff>